<commit_message>
Compare robust pairs with the SelectSim atlas; update docs and onboarding guide
- Novelty screen now also checks the SelectSim validated co-mutations (Nat Genet 2026):
  all robust pairs it reports for the same cancer type agree in direction; the CTCF vs
  TP53 candidate is in its atlas, so it is a confirmation, not a discovery
- Notebook 04 section 9, README, literature review (SelectSim added, ref 42) updated
- Supervisor summary reorganised: bottom line, results by aim, decisions, risks, next steps
- Onboarding guide: SelectSim in Part 3, novelty audit and figures in Part 9, status,
  repository map, timeline and references updated
- requirements: openpyxl (reads the SelectSim supplementary table)
</commit_message>
<xml_diff>
--- a/docs/FYP_onboarding_guide.docx
+++ b/docs/FYP_onboarding_guide.docx
@@ -291,7 +291,7 @@
               <w:rPr>
                 <w:sz w:val="20"/>
               </w:rPr>
-              <w:t>24 October 2026 (updated after the full re-run of 22-23 October)</w:t>
+              <w:t>25 October 2026 (adds R figures, a novelty screen and a comparison with the SelectSim atlas)</w:t>
             </w:r>
           </w:p>
         </w:tc>
@@ -417,7 +417,7 @@
               <w:rPr>
                 <w:sz w:val="20"/>
               </w:rPr>
-              <w:t>Everything has finished running and is committed (including the 24 Oct fixes). Numbers in this guide match the final outputs. Open items are listed in Part 11.</w:t>
+              <w:t>Everything has finished running and is committed (including the 25 Oct additions). Numbers in this guide match the final outputs. Open items are listed in Part 11.</w:t>
             </w:r>
           </w:p>
         </w:tc>
@@ -2380,22 +2380,8 @@
         </w:numPr>
       </w:pPr>
       <w:r>
-        <w:rPr>
-          <w:b/>
-        </w:rPr>
-        <w:t>Phase 4 asks why.</w:t>
-      </w:r>
-      <w:r>
-        <w:t xml:space="preserve"> Exclusive pairs sit in the same biological pathway; a third of interactions change between cancer types; part of a famous </w:t>
-      </w:r>
-      <w:r>
-        <w:rPr>
-          <w:i/>
-        </w:rPr>
-        <w:t>KRAS</w:t>
-      </w:r>
-      <w:r>
-        <w:t xml:space="preserve"> association is explained by smoking. It also exposed a blind spot in our own method.</w:t>
+        <w:rPr/>
+        <w:t>Phase 4 asks why. Exclusive pairs sit in the same biological pathway; a third of interactions change between cancer types; part of a famous KRAS association is explained by smoking. It also exposed a blind spot in our own method. A novelty audit then checked every robust pair against the literature and the largest recent atlas (SelectSim, 2026): the driver-pair landscape of common cancers turns out to be almost fully reported, so the project's distinct value lies in copy-number and fusion partners, panel-aware statistics, artefact audits and the tool.</w:t>
       </w:r>
     </w:p>
     <w:p>
@@ -3126,6 +3112,67 @@
                 <w:sz w:val="18"/>
               </w:rPr>
               <w:t xml:space="preserve"> vs 0.82 base rate</w:t>
+            </w:r>
+          </w:p>
+        </w:tc>
+      </w:tr>
+      <w:tr>
+        <w:trPr>
+          <w:cantSplit w:val="true"/>
+        </w:trPr>
+        <w:tc>
+          <w:tcPr>
+            <w:tcW w:type="dxa" w:w="2948"/>
+            <w:tcMar>
+              <w:top w:w="50" w:type="dxa"/>
+              <w:left w:w="90" w:type="dxa"/>
+              <w:bottom w:w="50" w:type="dxa"/>
+              <w:right w:w="90" w:type="dxa"/>
+            </w:tcMar>
+            <w:tcBorders>
+              <w:top w:val="nil" w:sz="0" w:color="FFFFFF"/>
+              <w:left w:val="nil" w:sz="0" w:color="FFFFFF"/>
+              <w:bottom w:val="single" w:sz="4" w:color="D5DAE1"/>
+              <w:right w:val="nil" w:sz="0" w:color="FFFFFF"/>
+            </w:tcBorders>
+          </w:tcPr>
+          <w:p>
+            <w:pPr>
+              <w:spacing w:after="0"/>
+            </w:pPr>
+            <w:r>
+              <w:rPr>
+                <w:sz w:val="18"/>
+              </w:rPr>
+              <w:t>Novelty audit (25 Oct)</w:t>
+            </w:r>
+          </w:p>
+        </w:tc>
+        <w:tc>
+          <w:tcPr>
+            <w:tcW w:type="dxa" w:w="6690"/>
+            <w:tcMar>
+              <w:top w:w="50" w:type="dxa"/>
+              <w:left w:w="90" w:type="dxa"/>
+              <w:bottom w:w="50" w:type="dxa"/>
+              <w:right w:w="90" w:type="dxa"/>
+            </w:tcMar>
+            <w:tcBorders>
+              <w:top w:val="nil" w:sz="0" w:color="FFFFFF"/>
+              <w:left w:val="nil" w:sz="0" w:color="FFFFFF"/>
+              <w:bottom w:val="single" w:sz="4" w:color="D5DAE1"/>
+              <w:right w:val="nil" w:sz="0" w:color="FFFFFF"/>
+            </w:tcBorders>
+          </w:tcPr>
+          <w:p>
+            <w:pPr>
+              <w:spacing w:after="0"/>
+            </w:pPr>
+            <w:r>
+              <w:rPr>
+                <w:sz w:val="18"/>
+              </w:rPr>
+              <w:t>386 robust pairs checked against Europe PMC and the SelectSim atlas: all pairs SelectSim reports agree in direction; none of the 41 unreported pairs survives as a new driver interaction</w:t>
             </w:r>
           </w:p>
         </w:tc>
@@ -5049,20 +5096,7 @@
               <w:rPr>
                 <w:sz w:val="20"/>
               </w:rPr>
-              <w:t xml:space="preserve">Searched Europe PMC (PubMed, PubMed Central and preprints), the Firecrawl research index and tool documentation between 30 Sep and 22 Oct 2026. It is a </w:t>
-            </w:r>
-            <w:r>
-              <w:rPr>
-                <w:b/>
-                <w:sz w:val="20"/>
-              </w:rPr>
-              <w:t>narrative, single-reviewer review</w:t>
-            </w:r>
-            <w:r>
-              <w:rPr>
-                <w:sz w:val="20"/>
-              </w:rPr>
-              <w:t xml:space="preserve"> (not a formal systematic review) with 41 references, each checked against Europe PMC metadata. Where full text was unavailable (for example van de Haar 2019 and Scharpf 2022), claims are limited to the abstracts.</w:t>
+              <w:t>Searched Europe PMC (PubMed, PubMed Central and preprints), the Firecrawl research index and tool documentation between 30 Sep and 22 Oct 2026. It is a narrative, single-reviewer review (not a formal systematic review) with 42 references, each checked against Europe PMC metadata. Where full text was unavailable (for example van de Haar 2019 and Scharpf 2022), claims are limited to the abstracts. The SelectSim atlas (Nature Genetics, July 2026) was added on 25 October.</w:t>
             </w:r>
           </w:p>
         </w:tc>
@@ -7836,6 +7870,127 @@
           </w:p>
         </w:tc>
       </w:tr>
+      <w:tr>
+        <w:trPr>
+          <w:cantSplit w:val="true"/>
+        </w:trPr>
+        <w:tc>
+          <w:tcPr>
+            <w:tcW w:type="dxa" w:w="2154"/>
+            <w:tcMar>
+              <w:top w:w="50" w:type="dxa"/>
+              <w:left w:w="90" w:type="dxa"/>
+              <w:bottom w:w="50" w:type="dxa"/>
+              <w:right w:w="90" w:type="dxa"/>
+            </w:tcMar>
+            <w:shd w:val="clear" w:color="auto" w:fill="F4F6F9"/>
+            <w:tcBorders>
+              <w:top w:val="nil" w:sz="0" w:color="FFFFFF"/>
+              <w:left w:val="nil" w:sz="0" w:color="FFFFFF"/>
+              <w:bottom w:val="single" w:sz="4" w:color="D5DAE1"/>
+              <w:right w:val="nil" w:sz="0" w:color="FFFFFF"/>
+            </w:tcBorders>
+          </w:tcPr>
+          <w:p>
+            <w:pPr>
+              <w:spacing w:after="0"/>
+            </w:pPr>
+            <w:r>
+              <w:rPr>
+                <w:sz w:val="17"/>
+              </w:rPr>
+              <w:t>SelectSim (Iyer 2026)</w:t>
+            </w:r>
+          </w:p>
+        </w:tc>
+        <w:tc>
+          <w:tcPr>
+            <w:tcW w:type="dxa" w:w="1928"/>
+            <w:tcMar>
+              <w:top w:w="50" w:type="dxa"/>
+              <w:left w:w="90" w:type="dxa"/>
+              <w:bottom w:w="50" w:type="dxa"/>
+              <w:right w:w="90" w:type="dxa"/>
+            </w:tcMar>
+            <w:shd w:val="clear" w:color="auto" w:fill="F4F6F9"/>
+            <w:tcBorders>
+              <w:top w:val="nil" w:sz="0" w:color="FFFFFF"/>
+              <w:left w:val="nil" w:sz="0" w:color="FFFFFF"/>
+              <w:bottom w:val="single" w:sz="4" w:color="D5DAE1"/>
+              <w:right w:val="nil" w:sz="0" w:color="FFFFFF"/>
+            </w:tcBorders>
+          </w:tcPr>
+          <w:p>
+            <w:pPr>
+              <w:spacing w:after="0"/>
+            </w:pPr>
+            <w:r>
+              <w:rPr>
+                <w:sz w:val="17"/>
+              </w:rPr>
+              <w:t>GENIE v15 (MSK + DFCI) + TCGA; &gt;70,000 tumours</w:t>
+            </w:r>
+          </w:p>
+        </w:tc>
+        <w:tc>
+          <w:tcPr>
+            <w:tcW w:type="dxa" w:w="3288"/>
+            <w:tcMar>
+              <w:top w:w="50" w:type="dxa"/>
+              <w:left w:w="90" w:type="dxa"/>
+              <w:bottom w:w="50" w:type="dxa"/>
+              <w:right w:w="90" w:type="dxa"/>
+            </w:tcMar>
+            <w:shd w:val="clear" w:color="auto" w:fill="F4F6F9"/>
+            <w:tcBorders>
+              <w:top w:val="nil" w:sz="0" w:color="FFFFFF"/>
+              <w:left w:val="nil" w:sz="0" w:color="FFFFFF"/>
+              <w:bottom w:val="single" w:sz="4" w:color="D5DAE1"/>
+              <w:right w:val="nil" w:sz="0" w:color="FFFFFF"/>
+            </w:tcBorders>
+          </w:tcPr>
+          <w:p>
+            <w:pPr>
+              <w:spacing w:after="0"/>
+            </w:pPr>
+            <w:r>
+              <w:rPr>
+                <w:sz w:val="17"/>
+              </w:rPr>
+              <w:t>Simulate mutations under independence keeping gene frequency and TMB within subtypes; TMB-weighted effect size</w:t>
+            </w:r>
+          </w:p>
+        </w:tc>
+        <w:tc>
+          <w:tcPr>
+            <w:tcW w:type="dxa" w:w="2268"/>
+            <w:tcMar>
+              <w:top w:w="50" w:type="dxa"/>
+              <w:left w:w="90" w:type="dxa"/>
+              <w:bottom w:w="50" w:type="dxa"/>
+              <w:right w:w="90" w:type="dxa"/>
+            </w:tcMar>
+            <w:shd w:val="clear" w:color="auto" w:fill="F4F6F9"/>
+            <w:tcBorders>
+              <w:top w:val="nil" w:sz="0" w:color="FFFFFF"/>
+              <w:left w:val="nil" w:sz="0" w:color="FFFFFF"/>
+              <w:bottom w:val="single" w:sz="4" w:color="D5DAE1"/>
+              <w:right w:val="nil" w:sz="0" w:color="FFFFFF"/>
+            </w:tcBorders>
+          </w:tcPr>
+          <w:p>
+            <w:pPr>
+              <w:spacing w:after="0"/>
+            </w:pPr>
+            <w:r>
+              <w:rPr>
+                <w:sz w:val="17"/>
+              </w:rPr>
+              <w:t>Compared pair by pair (Part 9.3)</w:t>
+            </w:r>
+          </w:p>
+        </w:tc>
+      </w:tr>
     </w:tbl>
     <w:p>
       <w:pPr>
@@ -9218,6 +9373,118 @@
     <w:p>
       <w:pPr>
         <w:spacing w:after="40"/>
+      </w:pPr>
+    </w:p>
+    <w:tbl>
+      <w:tblPr>
+        <w:tblW w:type="auto" w:w="0"/>
+        <w:jc w:val="center"/>
+        <w:tblLook w:firstColumn="1" w:firstRow="1" w:lastColumn="0" w:lastRow="0" w:noHBand="0" w:noVBand="1" w:val="04A0"/>
+        <w:tblLayout w:type="fixed"/>
+      </w:tblPr>
+      <w:tblGrid>
+        <w:gridCol w:w="9639"/>
+      </w:tblGrid>
+      <w:tr>
+        <w:trPr>
+          <w:cantSplit w:val="true"/>
+        </w:trPr>
+        <w:tc>
+          <w:tcPr>
+            <w:tcW w:type="dxa" w:w="9638"/>
+            <w:shd w:val="clear" w:color="auto" w:fill="E8EEF4"/>
+            <w:tcMar>
+              <w:top w:w="110" w:type="dxa"/>
+              <w:left w:w="200" w:type="dxa"/>
+              <w:bottom w:w="110" w:type="dxa"/>
+              <w:right w:w="160" w:type="dxa"/>
+            </w:tcMar>
+            <w:tcBorders>
+              <w:top w:val="nil" w:sz="0" w:color="FFFFFF"/>
+              <w:left w:val="single" w:sz="24" w:color="1F3A5F"/>
+              <w:bottom w:val="nil" w:sz="0" w:color="FFFFFF"/>
+              <w:right w:val="nil" w:sz="0" w:color="FFFFFF"/>
+            </w:tcBorders>
+          </w:tcPr>
+          <w:p>
+            <w:pPr>
+              <w:spacing w:after="40"/>
+            </w:pPr>
+            <w:r>
+              <w:rPr>
+                <w:b/>
+                <w:color w:val="1F3A5F"/>
+                <w:sz w:val="21"/>
+              </w:rPr>
+              <w:t>The closest recent atlas: SelectSim (Iyer ... Mina, Ciriello, Nat Genet 2026)</w:t>
+            </w:r>
+          </w:p>
+          <w:p>
+            <w:pPr>
+              <w:spacing w:after="60"/>
+            </w:pPr>
+            <w:r>
+              <w:rPr>
+                <w:sz w:val="20"/>
+              </w:rPr>
+              <w:t>Built a co-mutation atlas from GENIE v15 and TCGA (&gt;70,000 tumours, 119 subtypes) and reports 892 independently validated co-mutations, including metastasis-specific ones and their rarity in normal tissue.</w:t>
+            </w:r>
+          </w:p>
+          <w:p>
+            <w:pPr>
+              <w:spacing w:after="60"/>
+            </w:pPr>
+            <w:r>
+              <w:rPr>
+                <w:b/>
+                <w:sz w:val="20"/>
+              </w:rPr>
+              <w:t>How it handles the GENIE trap:</w:t>
+            </w:r>
+            <w:r>
+              <w:rPr>
+                <w:sz w:val="20"/>
+              </w:rPr>
+              <w:t xml:space="preserve"> it keeps only the two largest centres (MSK, DFCI) and runs each panel separately or on the genes all panels share. </w:t>
+            </w:r>
+            <w:r>
+              <w:rPr>
+                <w:b/>
+                <w:sz w:val="20"/>
+              </w:rPr>
+              <w:t>What it does not cover:</w:t>
+            </w:r>
+            <w:r>
+              <w:rPr>
+                <w:sz w:val="20"/>
+              </w:rPr>
+              <w:t xml:space="preserve"> copy-number changes, fusions, the other 17 centres, or a lookup tool.</w:t>
+            </w:r>
+          </w:p>
+          <w:p>
+            <w:pPr>
+              <w:spacing w:after="60"/>
+            </w:pPr>
+            <w:r>
+              <w:rPr>
+                <w:b/>
+                <w:sz w:val="20"/>
+              </w:rPr>
+              <w:t>How we relate to it:</w:t>
+            </w:r>
+            <w:r>
+              <w:rPr>
+                <w:sz w:val="20"/>
+              </w:rPr>
+              <w:t xml:space="preserve"> every robust pair of ours that SelectSim reports for the same cancer type agrees in direction (an independent confirmation of both), while most of our copy-number and mixed pairs are outside its scope (Part 9.3).</w:t>
+            </w:r>
+          </w:p>
+        </w:tc>
+      </w:tr>
+    </w:tbl>
+    <w:p>
+      <w:pPr>
+        <w:spacing w:before="120"/>
       </w:pPr>
     </w:p>
     <w:p>
@@ -20799,6 +21066,98 @@
           </w:p>
         </w:tc>
       </w:tr>
+      <w:tr>
+        <w:trPr>
+          <w:cantSplit w:val="true"/>
+        </w:trPr>
+        <w:tc>
+          <w:tcPr>
+            <w:tcW w:type="dxa" w:w="454"/>
+            <w:tcMar>
+              <w:top w:w="50" w:type="dxa"/>
+              <w:left w:w="90" w:type="dxa"/>
+              <w:bottom w:w="50" w:type="dxa"/>
+              <w:right w:w="90" w:type="dxa"/>
+            </w:tcMar>
+            <w:shd w:val="clear" w:color="auto" w:fill="F4F6F9"/>
+            <w:tcBorders>
+              <w:top w:val="nil" w:sz="0" w:color="FFFFFF"/>
+              <w:left w:val="nil" w:sz="0" w:color="FFFFFF"/>
+              <w:bottom w:val="single" w:sz="4" w:color="D5DAE1"/>
+              <w:right w:val="nil" w:sz="0" w:color="FFFFFF"/>
+            </w:tcBorders>
+          </w:tcPr>
+          <w:p>
+            <w:pPr>
+              <w:spacing w:after="0"/>
+            </w:pPr>
+            <w:r>
+              <w:rPr>
+                <w:sz w:val="17"/>
+              </w:rPr>
+              <w:t>7</w:t>
+            </w:r>
+          </w:p>
+        </w:tc>
+        <w:tc>
+          <w:tcPr>
+            <w:tcW w:type="dxa" w:w="3175"/>
+            <w:tcMar>
+              <w:top w:w="50" w:type="dxa"/>
+              <w:left w:w="90" w:type="dxa"/>
+              <w:bottom w:w="50" w:type="dxa"/>
+              <w:right w:w="90" w:type="dxa"/>
+            </w:tcMar>
+            <w:shd w:val="clear" w:color="auto" w:fill="F4F6F9"/>
+            <w:tcBorders>
+              <w:top w:val="nil" w:sz="0" w:color="FFFFFF"/>
+              <w:left w:val="nil" w:sz="0" w:color="FFFFFF"/>
+              <w:bottom w:val="single" w:sz="4" w:color="D5DAE1"/>
+              <w:right w:val="nil" w:sz="0" w:color="FFFFFF"/>
+            </w:tcBorders>
+          </w:tcPr>
+          <w:p>
+            <w:pPr>
+              <w:spacing w:after="0"/>
+            </w:pPr>
+            <w:r>
+              <w:rPr>
+                <w:sz w:val="17"/>
+              </w:rPr>
+              <w:t>Is anything here new? (novelty audit)</w:t>
+            </w:r>
+          </w:p>
+        </w:tc>
+        <w:tc>
+          <w:tcPr>
+            <w:tcW w:type="dxa" w:w="6009"/>
+            <w:tcMar>
+              <w:top w:w="50" w:type="dxa"/>
+              <w:left w:w="90" w:type="dxa"/>
+              <w:bottom w:w="50" w:type="dxa"/>
+              <w:right w:w="90" w:type="dxa"/>
+            </w:tcMar>
+            <w:shd w:val="clear" w:color="auto" w:fill="F4F6F9"/>
+            <w:tcBorders>
+              <w:top w:val="nil" w:sz="0" w:color="FFFFFF"/>
+              <w:left w:val="nil" w:sz="0" w:color="FFFFFF"/>
+              <w:bottom w:val="single" w:sz="4" w:color="D5DAE1"/>
+              <w:right w:val="nil" w:sz="0" w:color="FFFFFF"/>
+            </w:tcBorders>
+          </w:tcPr>
+          <w:p>
+            <w:pPr>
+              <w:spacing w:after="0"/>
+            </w:pPr>
+            <w:r>
+              <w:rPr>
+                <w:sz w:val="17"/>
+              </w:rPr>
+              <w:t>Of 386 robust pairs, 41 are in neither the literature nor the SelectSim atlas, and those are amplicon passengers or subtype markers; the best candidate (CTCF vs TP53, endometrial) is in SelectSim's atlas</w:t>
+            </w:r>
+          </w:p>
+        </w:tc>
+      </w:tr>
     </w:tbl>
     <w:p>
       <w:pPr>
@@ -21288,7 +21647,24 @@
         <w:pStyle w:val="Heading2"/>
       </w:pPr>
       <w:r>
-        <w:t>9.3  Limits stated in the notebook</w:t>
+        <w:rPr/>
+        <w:t>9.3  Is anything new? A novelty audit</w:t>
+      </w:r>
+    </w:p>
+    <w:p>
+      <w:r>
+        <w:rPr/>
+        <w:t xml:space="preserve">The questions above come from the literature, so the answers mostly </w:t>
+      </w:r>
+      <w:r>
+        <w:rPr>
+          <w:i/>
+        </w:rPr>
+        <w:t>confirm</w:t>
+      </w:r>
+      <w:r>
+        <w:rPr/>
+        <w:t xml:space="preserve"> known biology. To find what is not yet reported, each of the 386 most robust pairs (replicated outside MSK, burden-robust, not weak) was checked against two sources (19_novelty_screen.py): Europe PMC papers naming both genes and the cancer type in the title or abstract, and the SelectSim atlas, whose 892 validated pairs sit in a supplementary table that no title search can see.</w:t>
       </w:r>
     </w:p>
     <w:p>
@@ -21297,7 +21673,24 @@
         <w:spacing w:after="60"/>
       </w:pPr>
       <w:r>
-        <w:t>Pathway membership uses only 10 curated pathways (165 genes); pairs outside are unclassified.</w:t>
+        <w:rPr>
+          <w:b/>
+        </w:rPr>
+        <w:t>343 of 386</w:t>
+      </w:r>
+      <w:r>
+        <w:rPr/>
+        <w:t xml:space="preserve"> pairs are already named together in titles or abstracts; </w:t>
+      </w:r>
+      <w:r>
+        <w:rPr>
+          <w:b/>
+        </w:rPr>
+        <w:t>41</w:t>
+      </w:r>
+      <w:r>
+        <w:rPr/>
+        <w:t xml:space="preserve"> are in neither source.</w:t>
       </w:r>
     </w:p>
     <w:p>
@@ -21306,7 +21699,128 @@
         <w:spacing w:after="60"/>
       </w:pPr>
       <w:r>
-        <w:t>Heterogeneity variances are approximate (Poisson).</w:t>
+        <w:rPr/>
+        <w:t xml:space="preserve">Those 41 are almost all </w:t>
+      </w:r>
+      <w:r>
+        <w:rPr>
+          <w:b/>
+        </w:rPr>
+        <w:t>stand-ins for known biology</w:t>
+      </w:r>
+      <w:r>
+        <w:rPr/>
+        <w:t>: passenger genes on an amplicon standing in for the real driver next to them (</w:t>
+      </w:r>
+      <w:r>
+        <w:rPr>
+          <w:i/>
+        </w:rPr>
+        <w:t>GLI1</w:t>
+      </w:r>
+      <w:r>
+        <w:rPr/>
+        <w:t xml:space="preserve"> beside </w:t>
+      </w:r>
+      <w:r>
+        <w:rPr>
+          <w:i/>
+        </w:rPr>
+        <w:t>CDK4</w:t>
+      </w:r>
+      <w:r>
+        <w:rPr/>
+        <w:t xml:space="preserve">, </w:t>
+      </w:r>
+      <w:r>
+        <w:rPr>
+          <w:i/>
+        </w:rPr>
+        <w:t>KDR</w:t>
+      </w:r>
+      <w:r>
+        <w:rPr/>
+        <w:t xml:space="preserve"> beside </w:t>
+      </w:r>
+      <w:r>
+        <w:rPr>
+          <w:i/>
+        </w:rPr>
+        <w:t>PDGFRA</w:t>
+      </w:r>
+      <w:r>
+        <w:rPr/>
+        <w:t xml:space="preserve">, </w:t>
+      </w:r>
+      <w:r>
+        <w:rPr>
+          <w:i/>
+        </w:rPr>
+        <w:t>RARA</w:t>
+      </w:r>
+      <w:r>
+        <w:rPr/>
+        <w:t xml:space="preserve"> beside </w:t>
+      </w:r>
+      <w:r>
+        <w:rPr>
+          <w:i/>
+        </w:rPr>
+        <w:t>ERBB2</w:t>
+      </w:r>
+      <w:r>
+        <w:rPr/>
+        <w:t xml:space="preserve">, </w:t>
+      </w:r>
+      <w:r>
+        <w:rPr>
+          <w:i/>
+        </w:rPr>
+        <w:t>MTAP</w:t>
+      </w:r>
+      <w:r>
+        <w:rPr/>
+        <w:t xml:space="preserve"> beside </w:t>
+      </w:r>
+      <w:r>
+        <w:rPr>
+          <w:i/>
+        </w:rPr>
+        <w:t>CDKN2A</w:t>
+      </w:r>
+      <w:r>
+        <w:rPr/>
+        <w:t xml:space="preserve">, </w:t>
+      </w:r>
+      <w:r>
+        <w:rPr>
+          <w:i/>
+        </w:rPr>
+        <w:t>CD79B</w:t>
+      </w:r>
+      <w:r>
+        <w:rPr/>
+        <w:t xml:space="preserve"> on 17q23), or subtype markers (</w:t>
+      </w:r>
+      <w:r>
+        <w:rPr>
+          <w:i/>
+        </w:rPr>
+        <w:t>CCNE1</w:t>
+      </w:r>
+      <w:r>
+        <w:rPr/>
+        <w:t xml:space="preserve"> vs </w:t>
+      </w:r>
+      <w:r>
+        <w:rPr>
+          <w:i/>
+        </w:rPr>
+        <w:t>CTNNB1</w:t>
+      </w:r>
+      <w:r>
+        <w:rPr/>
+        <w:t xml:space="preserve"> in endometrial cancer).</w:t>
       </w:r>
     </w:p>
     <w:p>
@@ -21315,16 +21829,108 @@
         <w:spacing w:after="60"/>
       </w:pPr>
       <w:r>
-        <w:t>The smoking proxy is inferred from panel mutation spectra; GENIE has no smoking history.</w:t>
-      </w:r>
-    </w:p>
-    <w:p>
-      <w:pPr>
-        <w:pStyle w:val="ListBullet"/>
-        <w:spacing w:after="60"/>
-      </w:pPr>
-      <w:r>
-        <w:t>Exclusivity in a cross-section cannot separate redundancy from synthetic lethality.</w:t>
+        <w:rPr/>
+        <w:t xml:space="preserve">The driver-level ones were stress-tested (20_candidate_followup.py) with logistic regression adjusted for subtype, the obvious third genes, copy-number burden and TMB, and once more in TMB &lt; 5 tumours only. </w:t>
+      </w:r>
+      <w:r>
+        <w:rPr>
+          <w:i/>
+        </w:rPr>
+        <w:t>MDM2</w:t>
+      </w:r>
+      <w:r>
+        <w:rPr/>
+        <w:t xml:space="preserve"> vs </w:t>
+      </w:r>
+      <w:r>
+        <w:rPr>
+          <w:i/>
+        </w:rPr>
+        <w:t>SMARCA4</w:t>
+      </w:r>
+      <w:r>
+        <w:rPr/>
+        <w:t xml:space="preserve"> (lung) is explained by </w:t>
+      </w:r>
+      <w:r>
+        <w:rPr>
+          <w:i/>
+        </w:rPr>
+        <w:t>TP53</w:t>
+      </w:r>
+      <w:r>
+        <w:rPr/>
+        <w:t xml:space="preserve">; </w:t>
+      </w:r>
+      <w:r>
+        <w:rPr>
+          <w:i/>
+        </w:rPr>
+        <w:t>KRAS</w:t>
+      </w:r>
+      <w:r>
+        <w:rPr/>
+        <w:t xml:space="preserve"> vs </w:t>
+      </w:r>
+      <w:r>
+        <w:rPr>
+          <w:i/>
+        </w:rPr>
+        <w:t>RARA</w:t>
+      </w:r>
+      <w:r>
+        <w:rPr/>
+        <w:t xml:space="preserve"> (gastric) by </w:t>
+      </w:r>
+      <w:r>
+        <w:rPr>
+          <w:i/>
+        </w:rPr>
+        <w:t>ERBB2</w:t>
+      </w:r>
+      <w:r>
+        <w:rPr/>
+        <w:t xml:space="preserve">; </w:t>
+      </w:r>
+      <w:r>
+        <w:rPr>
+          <w:i/>
+        </w:rPr>
+        <w:t>BCL2L1</w:t>
+      </w:r>
+      <w:r>
+        <w:rPr/>
+        <w:t xml:space="preserve"> vs </w:t>
+      </w:r>
+      <w:r>
+        <w:rPr>
+          <w:i/>
+        </w:rPr>
+        <w:t>SMAD4</w:t>
+      </w:r>
+      <w:r>
+        <w:rPr/>
+        <w:t xml:space="preserve"> (colorectal) by burden; </w:t>
+      </w:r>
+      <w:r>
+        <w:rPr>
+          <w:i/>
+        </w:rPr>
+        <w:t>CTCF</w:t>
+      </w:r>
+      <w:r>
+        <w:rPr/>
+        <w:t xml:space="preserve"> + </w:t>
+      </w:r>
+      <w:r>
+        <w:rPr>
+          <w:i/>
+        </w:rPr>
+        <w:t>PIK3R1</w:t>
+      </w:r>
+      <w:r>
+        <w:rPr/>
+        <w:t xml:space="preserve"> (endometrial) by residual microsatellite instability.</w:t>
       </w:r>
     </w:p>
     <w:tbl>
@@ -21344,6 +21950,502 @@
         <w:tc>
           <w:tcPr>
             <w:tcW w:type="dxa" w:w="9638"/>
+            <w:shd w:val="clear" w:color="auto" w:fill="FDF1E3"/>
+            <w:tcMar>
+              <w:top w:w="110" w:type="dxa"/>
+              <w:left w:w="200" w:type="dxa"/>
+              <w:bottom w:w="110" w:type="dxa"/>
+              <w:right w:w="160" w:type="dxa"/>
+            </w:tcMar>
+            <w:tcBorders>
+              <w:top w:val="nil" w:sz="0" w:color="FFFFFF"/>
+              <w:left w:val="single" w:sz="24" w:color="D9822B"/>
+              <w:bottom w:val="nil" w:sz="0" w:color="FFFFFF"/>
+              <w:right w:val="nil" w:sz="0" w:color="FFFFFF"/>
+            </w:tcBorders>
+          </w:tcPr>
+          <w:p>
+            <w:pPr>
+              <w:spacing w:after="40"/>
+            </w:pPr>
+            <w:r>
+              <w:rPr>
+                <w:b/>
+                <w:color w:val="8A4B0A"/>
+                <w:sz w:val="21"/>
+              </w:rPr>
+              <w:t>A candidate that turned out to be known: CTCF vs TP53 in endometrial cancer</w:t>
+            </w:r>
+          </w:p>
+          <w:p>
+            <w:pPr>
+              <w:spacing w:after="60"/>
+            </w:pPr>
+            <w:r>
+              <w:rPr>
+                <w:i/>
+                <w:sz w:val="20"/>
+              </w:rPr>
+              <w:t>CTCF</w:t>
+            </w:r>
+            <w:r>
+              <w:rPr>
+                <w:sz w:val="20"/>
+              </w:rPr>
+              <w:t xml:space="preserve"> mutations are rare in </w:t>
+            </w:r>
+            <w:r>
+              <w:rPr>
+                <w:i/>
+                <w:sz w:val="20"/>
+              </w:rPr>
+              <w:t>TP53</w:t>
+            </w:r>
+            <w:r>
+              <w:rPr>
+                <w:sz w:val="20"/>
+              </w:rPr>
+              <w:t xml:space="preserve">-mutant endometrial cancers: </w:t>
+            </w:r>
+            <w:r>
+              <w:rPr>
+                <w:b/>
+                <w:sz w:val="20"/>
+              </w:rPr>
+              <w:t>22 observed vs 121 expected</w:t>
+            </w:r>
+            <w:r>
+              <w:rPr>
+                <w:sz w:val="20"/>
+              </w:rPr>
+              <w:t>. The avoidance holds after subtype, PI3K-pathway genes, copy-number burden and TMB (adjusted odds ratio 0.34, p = 3e-4), goes the same way in TCGA, and the silent-mutation route agrees.</w:t>
+            </w:r>
+          </w:p>
+          <w:p>
+            <w:pPr>
+              <w:spacing w:after="60"/>
+            </w:pPr>
+            <w:r>
+              <w:rPr>
+                <w:sz w:val="20"/>
+              </w:rPr>
+              <w:t xml:space="preserve">No title or abstract reports it, so the literature screen flagged it as new. But </w:t>
+            </w:r>
+            <w:r>
+              <w:rPr>
+                <w:b/>
+                <w:sz w:val="20"/>
+              </w:rPr>
+              <w:t>SelectSim's supplementary atlas lists it</w:t>
+            </w:r>
+            <w:r>
+              <w:rPr>
+                <w:sz w:val="20"/>
+              </w:rPr>
+              <w:t xml:space="preserve"> (endometrial, breast and pan-cancer). Our analysis is an independent confirmation under stricter adjustment, not a discovery.</w:t>
+            </w:r>
+          </w:p>
+          <w:p>
+            <w:pPr>
+              <w:spacing w:after="60"/>
+            </w:pPr>
+            <w:r>
+              <w:rPr>
+                <w:b/>
+                <w:sz w:val="20"/>
+              </w:rPr>
+              <w:t>Lesson:</w:t>
+            </w:r>
+            <w:r>
+              <w:rPr>
+                <w:sz w:val="20"/>
+              </w:rPr>
+              <w:t xml:space="preserve"> a novelty claim must be checked against the supplementary tables of atlas papers, not only against abstracts.</w:t>
+            </w:r>
+          </w:p>
+        </w:tc>
+      </w:tr>
+    </w:tbl>
+    <w:p>
+      <w:pPr>
+        <w:spacing w:before="120"/>
+      </w:pPr>
+    </w:p>
+    <w:p>
+      <w:r>
+        <w:rPr>
+          <w:b/>
+        </w:rPr>
+        <w:t>What the audit means.</w:t>
+      </w:r>
+    </w:p>
+    <w:p>
+      <w:pPr>
+        <w:pStyle w:val="ListBullet"/>
+        <w:spacing w:after="60"/>
+      </w:pPr>
+      <w:r>
+        <w:rPr>
+          <w:b/>
+        </w:rPr>
+        <w:t>Agreement with an independent atlas:</w:t>
+      </w:r>
+      <w:r>
+        <w:rPr/>
+        <w:t xml:space="preserve"> all 79 robust pairs that SelectSim reports for the same cancer type have the same direction here (0 opposite), from a different team, method and GENIE release.</w:t>
+      </w:r>
+    </w:p>
+    <w:p>
+      <w:pPr>
+        <w:pStyle w:val="ListBullet"/>
+        <w:spacing w:after="60"/>
+      </w:pPr>
+      <w:r>
+        <w:rPr>
+          <w:b/>
+        </w:rPr>
+        <w:t>At the level of mutation-driven driver pairs in common cancers, the landscape is close to saturated.</w:t>
+      </w:r>
+      <w:r>
+        <w:rPr/>
+        <w:t xml:space="preserve"> This is a result in its own right, and it was checked rather than assumed.</w:t>
+      </w:r>
+    </w:p>
+    <w:p>
+      <w:pPr>
+        <w:pStyle w:val="ListBullet"/>
+        <w:spacing w:after="60"/>
+      </w:pPr>
+      <w:r>
+        <w:rPr>
+          <w:b/>
+        </w:rPr>
+        <w:t>The project's distinct contribution lies elsewhere:</w:t>
+      </w:r>
+      <w:r>
+        <w:rPr/>
+        <w:t xml:space="preserve"> copy-number and fusion partners (SelectSim is mutation-only: 44 of 49 copy-number pairs and 154 of 175 mixed pairs are not in it), panel-aware statistics across all centres, the artefact audits, exact rare combinations and the clinical tool.</w:t>
+      </w:r>
+    </w:p>
+    <w:p>
+      <w:pPr>
+        <w:pStyle w:val="ListBullet"/>
+        <w:spacing w:after="60"/>
+      </w:pPr>
+      <w:r>
+        <w:rPr>
+          <w:b/>
+        </w:rPr>
+        <w:t>Where new biology is most likely:</w:t>
+      </w:r>
+      <w:r>
+        <w:rPr/>
+        <w:t xml:space="preserve"> copy-number × mutation pairs, fusion partners, rare cancer types and variant-level partners. Running the same audit on those is a natural next step.</w:t>
+      </w:r>
+    </w:p>
+    <w:p>
+      <w:pPr>
+        <w:pStyle w:val="Heading2"/>
+      </w:pPr>
+      <w:r>
+        <w:rPr/>
+        <w:t>9.4  Figures</w:t>
+      </w:r>
+    </w:p>
+    <w:p>
+      <w:r>
+        <w:rPr/>
+        <w:t>All results are drawn as publication figures in R (scripts/figures/; rebuild everything with bash scripts/figures/run_all.sh). Each is saved as a vector PDF for the thesis and a 300-dpi PNG for slides in results/figures/. Figure types follow the co-mutation literature (GENIE 2017, DISCOVER, maftools, Sanchez-Vega 2018, Park &amp; Lehner 2015, van de Haar 2019, SelectSim 2026). Colours: green = co-occurring, purple = exclusive.</w:t>
+      </w:r>
+    </w:p>
+    <w:p>
+      <w:pPr>
+        <w:keepNext/>
+        <w:jc w:val="center"/>
+      </w:pPr>
+      <w:r>
+        <w:drawing>
+          <wp:inline xmlns:a="http://schemas.openxmlformats.org/drawingml/2006/main" xmlns:pic="http://schemas.openxmlformats.org/drawingml/2006/picture">
+            <wp:extent cx="5577840" cy="6096649"/>
+            <wp:docPr id="7" name="Picture 7"/>
+            <wp:cNvGraphicFramePr>
+              <a:graphicFrameLocks noChangeAspect="1"/>
+            </wp:cNvGraphicFramePr>
+            <a:graphic>
+              <a:graphicData uri="http://schemas.openxmlformats.org/drawingml/2006/picture">
+                <pic:pic>
+                  <pic:nvPicPr>
+                    <pic:cNvPr id="0" name="fig4_biology.png"/>
+                    <pic:cNvPicPr/>
+                  </pic:nvPicPr>
+                  <pic:blipFill>
+                    <a:blip r:embed="rId17"/>
+                    <a:stretch>
+                      <a:fillRect/>
+                    </a:stretch>
+                  </pic:blipFill>
+                  <pic:spPr>
+                    <a:xfrm>
+                      <a:off x="0" y="0"/>
+                      <a:ext cx="5577840" cy="6096649"/>
+                    </a:xfrm>
+                    <a:prstGeom prst="rect"/>
+                  </pic:spPr>
+                </pic:pic>
+              </a:graphicData>
+            </a:graphic>
+          </wp:inline>
+        </w:drawing>
+      </w:r>
+    </w:p>
+    <w:p>
+      <w:pPr>
+        <w:jc w:val="center"/>
+      </w:pPr>
+      <w:r>
+        <w:rPr>
+          <w:color w:val="555B66"/>
+          <w:sz w:val="18"/>
+        </w:rPr>
+        <w:t>Figure 7. Biology (Figure 4 of the figure set). a, share of tested pairs that are candidates within and between the 10 Sanchez-Vega pathways; b, exclusivity is pathway-bound (35% vs 14%); c, the same pair across cancer types, reversing vs universal; d, copy-number burden check for the 25 copy-number-driven pairs.</w:t>
+      </w:r>
+    </w:p>
+    <w:p>
+      <w:pPr>
+        <w:keepNext/>
+        <w:jc w:val="center"/>
+      </w:pPr>
+      <w:r>
+        <w:drawing>
+          <wp:inline xmlns:a="http://schemas.openxmlformats.org/drawingml/2006/main" xmlns:pic="http://schemas.openxmlformats.org/drawingml/2006/picture">
+            <wp:extent cx="5577840" cy="5792074"/>
+            <wp:docPr id="8" name="Picture 8"/>
+            <wp:cNvGraphicFramePr>
+              <a:graphicFrameLocks noChangeAspect="1"/>
+            </wp:cNvGraphicFramePr>
+            <a:graphic>
+              <a:graphicData uri="http://schemas.openxmlformats.org/drawingml/2006/picture">
+                <pic:pic>
+                  <pic:nvPicPr>
+                    <pic:cNvPr id="0" name="fig5_fusions_alleles.png"/>
+                    <pic:cNvPicPr/>
+                  </pic:nvPicPr>
+                  <pic:blipFill>
+                    <a:blip r:embed="rId18"/>
+                    <a:stretch>
+                      <a:fillRect/>
+                    </a:stretch>
+                  </pic:blipFill>
+                  <pic:spPr>
+                    <a:xfrm>
+                      <a:off x="0" y="0"/>
+                      <a:ext cx="5577840" cy="5792074"/>
+                    </a:xfrm>
+                    <a:prstGeom prst="rect"/>
+                  </pic:spPr>
+                </pic:pic>
+              </a:graphicData>
+            </a:graphic>
+          </wp:inline>
+        </w:drawing>
+      </w:r>
+    </w:p>
+    <w:p>
+      <w:pPr>
+        <w:jc w:val="center"/>
+      </w:pPr>
+      <w:r>
+        <w:rPr>
+          <w:color w:val="555B66"/>
+          <w:sz w:val="18"/>
+        </w:rPr>
+        <w:t>Figure 8. Fusions and variants (Figure 5 of the figure set). a, lung cancer oncoprint: EGFR, KRAS and ALK/ROS1/RET fusions form a staircase of mutual exclusivity; b, fusion partners per cancer type; c, KRAS variant partners before and after adjusting for the smoking signature.</w:t>
+      </w:r>
+    </w:p>
+    <w:p>
+      <w:r>
+        <w:rPr/>
+        <w:t>The full set (results/figures/):</w:t>
+      </w:r>
+    </w:p>
+    <w:p>
+      <w:pPr>
+        <w:pStyle w:val="ListBullet"/>
+        <w:spacing w:after="60"/>
+      </w:pPr>
+      <w:r>
+        <w:rPr>
+          <w:b/>
+        </w:rPr>
+        <w:t>Fig 1 Data:</w:t>
+      </w:r>
+      <w:r>
+        <w:rPr/>
+        <w:t xml:space="preserve"> patient flow; cohort by centre; panel metadata vs released data; alterations per patient.</w:t>
+      </w:r>
+    </w:p>
+    <w:p>
+      <w:pPr>
+        <w:pStyle w:val="ListBullet"/>
+        <w:spacing w:after="60"/>
+      </w:pPr>
+      <w:r>
+        <w:rPr>
+          <w:b/>
+        </w:rPr>
+        <w:t>Fig 2 Can the test be trusted?</w:t>
+      </w:r>
+      <w:r>
+        <w:rPr/>
+        <w:t xml:space="preserve"> null p-value histograms; head-to-head benchmark; GENIE vs TCGA effects.</w:t>
+      </w:r>
+    </w:p>
+    <w:p>
+      <w:pPr>
+        <w:pStyle w:val="ListBullet"/>
+        <w:spacing w:after="60"/>
+      </w:pPr>
+      <w:r>
+        <w:rPr>
+          <w:b/>
+        </w:rPr>
+        <w:t>Fig 3 Landscape:</w:t>
+      </w:r>
+      <w:r>
+        <w:rPr/>
+        <w:t xml:space="preserve"> triangle heatmaps (lung, breast, colorectal); volcano of all 6,697 pairs; lung interaction network.</w:t>
+      </w:r>
+    </w:p>
+    <w:p>
+      <w:pPr>
+        <w:pStyle w:val="ListBullet"/>
+        <w:spacing w:after="60"/>
+      </w:pPr>
+      <w:r>
+        <w:rPr>
+          <w:b/>
+        </w:rPr>
+        <w:t>Fig 4 Biology</w:t>
+      </w:r>
+      <w:r>
+        <w:rPr/>
+        <w:t xml:space="preserve"> and </w:t>
+      </w:r>
+      <w:r>
+        <w:rPr>
+          <w:b/>
+        </w:rPr>
+        <w:t>Fig 5 Fusions and variants</w:t>
+      </w:r>
+      <w:r>
+        <w:rPr/>
+        <w:t xml:space="preserve"> (shown above).</w:t>
+      </w:r>
+    </w:p>
+    <w:p>
+      <w:pPr>
+        <w:pStyle w:val="ListBullet"/>
+        <w:spacing w:after="60"/>
+      </w:pPr>
+      <w:r>
+        <w:rPr>
+          <w:b/>
+        </w:rPr>
+        <w:t>Fig 6 The tool:</w:t>
+      </w:r>
+      <w:r>
+        <w:rPr/>
+        <w:t xml:space="preserve"> KRAS G12C partners; partner prediction vs base rates; MSK vs other-centre frequencies.</w:t>
+      </w:r>
+    </w:p>
+    <w:p>
+      <w:pPr>
+        <w:pStyle w:val="ListBullet"/>
+        <w:spacing w:after="60"/>
+      </w:pPr>
+      <w:r>
+        <w:rPr>
+          <w:b/>
+        </w:rPr>
+        <w:t>S1-S6:</w:t>
+      </w:r>
+      <w:r>
+        <w:rPr/>
+        <w:t xml:space="preserve"> filter funnel; UpSet of lung drivers; KRAS/TP53 forest plot; rare combinations; dN/dS route; exclusive gene sets.</w:t>
+      </w:r>
+    </w:p>
+    <w:p>
+      <w:pPr>
+        <w:pStyle w:val="Heading2"/>
+      </w:pPr>
+      <w:r>
+        <w:rPr/>
+        <w:t>9.5  Limits stated in the notebook</w:t>
+      </w:r>
+    </w:p>
+    <w:p>
+      <w:pPr>
+        <w:pStyle w:val="ListBullet"/>
+        <w:spacing w:after="60"/>
+      </w:pPr>
+      <w:r>
+        <w:t>Pathway membership uses only 10 curated pathways (165 genes); pairs outside are unclassified.</w:t>
+      </w:r>
+    </w:p>
+    <w:p>
+      <w:pPr>
+        <w:pStyle w:val="ListBullet"/>
+        <w:spacing w:after="60"/>
+      </w:pPr>
+      <w:r>
+        <w:t>Heterogeneity variances are approximate (Poisson).</w:t>
+      </w:r>
+    </w:p>
+    <w:p>
+      <w:pPr>
+        <w:pStyle w:val="ListBullet"/>
+        <w:spacing w:after="60"/>
+      </w:pPr>
+      <w:r>
+        <w:t>The smoking proxy is inferred from panel mutation spectra; GENIE has no smoking history.</w:t>
+      </w:r>
+    </w:p>
+    <w:p>
+      <w:pPr>
+        <w:pStyle w:val="ListBullet"/>
+        <w:spacing w:after="60"/>
+      </w:pPr>
+      <w:r>
+        <w:t>Exclusivity in a cross-section cannot separate redundancy from synthetic lethality.</w:t>
+      </w:r>
+    </w:p>
+    <w:p>
+      <w:pPr>
+        <w:pStyle w:val="ListBullet"/>
+        <w:spacing w:after="60"/>
+      </w:pPr>
+      <w:r>
+        <w:rPr/>
+        <w:t>The novelty audit counts papers that name both genes, not papers that claim the interaction, and covers one atlas; gene symbols that are also words (MET, ATM, KIT) err towards “known”.</w:t>
+      </w:r>
+    </w:p>
+    <w:tbl>
+      <w:tblPr>
+        <w:tblW w:type="auto" w:w="0"/>
+        <w:jc w:val="center"/>
+        <w:tblLook w:firstColumn="1" w:firstRow="1" w:lastColumn="0" w:lastRow="0" w:noHBand="0" w:noVBand="1" w:val="04A0"/>
+        <w:tblLayout w:type="fixed"/>
+      </w:tblPr>
+      <w:tblGrid>
+        <w:gridCol w:w="9639"/>
+      </w:tblGrid>
+      <w:tr>
+        <w:trPr>
+          <w:cantSplit w:val="true"/>
+        </w:trPr>
+        <w:tc>
+          <w:tcPr>
+            <w:tcW w:type="dxa" w:w="9638"/>
             <w:shd w:val="clear" w:color="auto" w:fill="E8EEF4"/>
             <w:tcMar>
               <w:top w:w="110" w:type="dxa"/>
@@ -21407,18 +22509,10 @@
       </w:pPr>
       <w:r>
         <w:rPr>
-          <w:i/>
           <w:color w:val="555B66"/>
           <w:sz w:val="17"/>
         </w:rPr>
-        <w:t>Source files for this part:</w:t>
-      </w:r>
-      <w:r>
-        <w:rPr>
-          <w:color w:val="555B66"/>
-          <w:sz w:val="17"/>
-        </w:rPr>
-        <w:t xml:space="preserve"> notebooks/04_phase4_insight.ipynb; git commits 7ee854f and c35130f; scripts/analyses/11_novel_insights.py and 12_burden_adjusted_retest.py.</w:t>
+        <w:t>Source files for this part: notebooks/04_phase4_insight.ipynb; git commits 7ee854f and c35130f; scripts/analyses/11_novel_insights.py and 12_burden_adjusted_retest.py; scripts/analyses/19_novelty_screen.py and 20_candidate_followup.py; scripts/figures/ and results/figures/.</w:t>
       </w:r>
     </w:p>
     <w:p>
@@ -25237,6 +26331,192 @@
           </w:p>
         </w:tc>
       </w:tr>
+      <w:tr>
+        <w:trPr>
+          <w:cantSplit w:val="true"/>
+        </w:trPr>
+        <w:tc>
+          <w:tcPr>
+            <w:tcW w:type="dxa" w:w="3175"/>
+            <w:tcMar>
+              <w:top w:w="50" w:type="dxa"/>
+              <w:left w:w="90" w:type="dxa"/>
+              <w:bottom w:w="50" w:type="dxa"/>
+              <w:right w:w="90" w:type="dxa"/>
+            </w:tcMar>
+            <w:shd w:val="clear" w:color="auto" w:fill="F4F6F9"/>
+            <w:tcBorders>
+              <w:top w:val="nil" w:sz="0" w:color="FFFFFF"/>
+              <w:left w:val="nil" w:sz="0" w:color="FFFFFF"/>
+              <w:bottom w:val="single" w:sz="4" w:color="D5DAE1"/>
+              <w:right w:val="nil" w:sz="0" w:color="FFFFFF"/>
+            </w:tcBorders>
+          </w:tcPr>
+          <w:p>
+            <w:pPr>
+              <w:spacing w:after="0"/>
+            </w:pPr>
+            <w:r>
+              <w:rPr>
+                <w:sz w:val="18"/>
+              </w:rPr>
+              <w:t>Figures (R)</w:t>
+            </w:r>
+          </w:p>
+        </w:tc>
+        <w:tc>
+          <w:tcPr>
+            <w:tcW w:type="dxa" w:w="2268"/>
+            <w:tcMar>
+              <w:top w:w="50" w:type="dxa"/>
+              <w:left w:w="90" w:type="dxa"/>
+              <w:bottom w:w="50" w:type="dxa"/>
+              <w:right w:w="90" w:type="dxa"/>
+            </w:tcMar>
+            <w:shd w:val="clear" w:color="auto" w:fill="F4F6F9"/>
+            <w:tcBorders>
+              <w:top w:val="nil" w:sz="0" w:color="FFFFFF"/>
+              <w:left w:val="nil" w:sz="0" w:color="FFFFFF"/>
+              <w:bottom w:val="single" w:sz="4" w:color="D5DAE1"/>
+              <w:right w:val="nil" w:sz="0" w:color="FFFFFF"/>
+            </w:tcBorders>
+          </w:tcPr>
+          <w:p>
+            <w:pPr>
+              <w:spacing w:after="0"/>
+            </w:pPr>
+            <w:r>
+              <w:rPr>
+                <w:sz w:val="18"/>
+              </w:rPr>
+              <w:t>Done</w:t>
+            </w:r>
+          </w:p>
+        </w:tc>
+        <w:tc>
+          <w:tcPr>
+            <w:tcW w:type="dxa" w:w="4195"/>
+            <w:tcMar>
+              <w:top w:w="50" w:type="dxa"/>
+              <w:left w:w="90" w:type="dxa"/>
+              <w:bottom w:w="50" w:type="dxa"/>
+              <w:right w:w="90" w:type="dxa"/>
+            </w:tcMar>
+            <w:shd w:val="clear" w:color="auto" w:fill="F4F6F9"/>
+            <w:tcBorders>
+              <w:top w:val="nil" w:sz="0" w:color="FFFFFF"/>
+              <w:left w:val="nil" w:sz="0" w:color="FFFFFF"/>
+              <w:bottom w:val="single" w:sz="4" w:color="D5DAE1"/>
+              <w:right w:val="nil" w:sz="0" w:color="FFFFFF"/>
+            </w:tcBorders>
+          </w:tcPr>
+          <w:p>
+            <w:pPr>
+              <w:spacing w:after="0"/>
+            </w:pPr>
+            <w:r>
+              <w:rPr>
+                <w:rFonts w:ascii="Menlo" w:hAnsi="Menlo" w:eastAsia="Menlo"/>
+                <w:sz w:val="18"/>
+              </w:rPr>
+              <w:t>6 main + 6 supplementary; rebuilt by scripts/figures/run_all.sh</w:t>
+            </w:r>
+          </w:p>
+        </w:tc>
+      </w:tr>
+      <w:tr>
+        <w:trPr>
+          <w:cantSplit w:val="true"/>
+        </w:trPr>
+        <w:tc>
+          <w:tcPr>
+            <w:tcW w:type="dxa" w:w="3175"/>
+            <w:tcMar>
+              <w:top w:w="50" w:type="dxa"/>
+              <w:left w:w="90" w:type="dxa"/>
+              <w:bottom w:w="50" w:type="dxa"/>
+              <w:right w:w="90" w:type="dxa"/>
+            </w:tcMar>
+            <w:shd w:val="clear" w:color="auto" w:fill="F4F6F9"/>
+            <w:tcBorders>
+              <w:top w:val="nil" w:sz="0" w:color="FFFFFF"/>
+              <w:left w:val="nil" w:sz="0" w:color="FFFFFF"/>
+              <w:bottom w:val="single" w:sz="4" w:color="D5DAE1"/>
+              <w:right w:val="nil" w:sz="0" w:color="FFFFFF"/>
+            </w:tcBorders>
+          </w:tcPr>
+          <w:p>
+            <w:pPr>
+              <w:spacing w:after="0"/>
+            </w:pPr>
+            <w:r>
+              <w:rPr>
+                <w:sz w:val="18"/>
+              </w:rPr>
+              <w:t>Novelty audit (19, 20) and SelectSim comparison</w:t>
+            </w:r>
+          </w:p>
+        </w:tc>
+        <w:tc>
+          <w:tcPr>
+            <w:tcW w:type="dxa" w:w="2268"/>
+            <w:tcMar>
+              <w:top w:w="50" w:type="dxa"/>
+              <w:left w:w="90" w:type="dxa"/>
+              <w:bottom w:w="50" w:type="dxa"/>
+              <w:right w:w="90" w:type="dxa"/>
+            </w:tcMar>
+            <w:shd w:val="clear" w:color="auto" w:fill="F4F6F9"/>
+            <w:tcBorders>
+              <w:top w:val="nil" w:sz="0" w:color="FFFFFF"/>
+              <w:left w:val="nil" w:sz="0" w:color="FFFFFF"/>
+              <w:bottom w:val="single" w:sz="4" w:color="D5DAE1"/>
+              <w:right w:val="nil" w:sz="0" w:color="FFFFFF"/>
+            </w:tcBorders>
+          </w:tcPr>
+          <w:p>
+            <w:pPr>
+              <w:spacing w:after="0"/>
+            </w:pPr>
+            <w:r>
+              <w:rPr>
+                <w:sz w:val="18"/>
+              </w:rPr>
+              <w:t>Done</w:t>
+            </w:r>
+          </w:p>
+        </w:tc>
+        <w:tc>
+          <w:tcPr>
+            <w:tcW w:type="dxa" w:w="4195"/>
+            <w:tcMar>
+              <w:top w:w="50" w:type="dxa"/>
+              <w:left w:w="90" w:type="dxa"/>
+              <w:bottom w:w="50" w:type="dxa"/>
+              <w:right w:w="90" w:type="dxa"/>
+            </w:tcMar>
+            <w:shd w:val="clear" w:color="auto" w:fill="F4F6F9"/>
+            <w:tcBorders>
+              <w:top w:val="nil" w:sz="0" w:color="FFFFFF"/>
+              <w:left w:val="nil" w:sz="0" w:color="FFFFFF"/>
+              <w:bottom w:val="single" w:sz="4" w:color="D5DAE1"/>
+              <w:right w:val="nil" w:sz="0" w:color="FFFFFF"/>
+            </w:tcBorders>
+          </w:tcPr>
+          <w:p>
+            <w:pPr>
+              <w:spacing w:after="0"/>
+            </w:pPr>
+            <w:r>
+              <w:rPr>
+                <w:rFonts w:ascii="Menlo" w:hAnsi="Menlo" w:eastAsia="Menlo"/>
+                <w:sz w:val="18"/>
+              </w:rPr>
+              <w:t>No new driver pair survives; full agreement in direction with SelectSim</w:t>
+            </w:r>
+          </w:p>
+        </w:tc>
+      </w:tr>
     </w:tbl>
     <w:p>
       <w:pPr>
@@ -25774,6 +27054,20 @@
       </w:pPr>
       <w:r>
         <w:t>Harmonise subtype labels via OncoTree codes if Prof. Wong agrees.</w:t>
+      </w:r>
+    </w:p>
+    <w:p>
+      <w:pPr>
+        <w:pStyle w:val="ListNumber"/>
+        <w:spacing w:after="60"/>
+        <w:numPr>
+          <w:ilvl w:val="0"/>
+          <w:numId w:val="13"/>
+        </w:numPr>
+      </w:pPr>
+      <w:r>
+        <w:rPr/>
+        <w:t>Run the novelty audit on copy-number × mutation pairs, fusion partners and rare cancer types, where new biology is most likely; confirm CTCF vs TP53 within endometrial molecular classes if labels become available.</w:t>
       </w:r>
     </w:p>
     <w:p>
@@ -26710,6 +28004,134 @@
           </w:p>
         </w:tc>
       </w:tr>
+      <w:tr>
+        <w:trPr>
+          <w:cantSplit w:val="true"/>
+        </w:trPr>
+        <w:tc>
+          <w:tcPr>
+            <w:tcW w:type="dxa" w:w="3288"/>
+            <w:tcMar>
+              <w:top w:w="50" w:type="dxa"/>
+              <w:left w:w="90" w:type="dxa"/>
+              <w:bottom w:w="50" w:type="dxa"/>
+              <w:right w:w="90" w:type="dxa"/>
+            </w:tcMar>
+            <w:shd w:val="clear" w:color="auto" w:fill="F4F6F9"/>
+            <w:tcBorders>
+              <w:top w:val="nil" w:sz="0" w:color="FFFFFF"/>
+              <w:left w:val="nil" w:sz="0" w:color="FFFFFF"/>
+              <w:bottom w:val="single" w:sz="4" w:color="D5DAE1"/>
+              <w:right w:val="nil" w:sz="0" w:color="FFFFFF"/>
+            </w:tcBorders>
+          </w:tcPr>
+          <w:p>
+            <w:pPr>
+              <w:spacing w:after="0"/>
+            </w:pPr>
+            <w:r>
+              <w:rPr>
+                <w:rFonts w:ascii="Menlo" w:hAnsi="Menlo" w:eastAsia="Menlo"/>
+                <w:sz w:val="18"/>
+              </w:rPr>
+              <w:t>scripts/figures/</w:t>
+            </w:r>
+          </w:p>
+        </w:tc>
+        <w:tc>
+          <w:tcPr>
+            <w:tcW w:type="dxa" w:w="6350"/>
+            <w:tcMar>
+              <w:top w:w="50" w:type="dxa"/>
+              <w:left w:w="90" w:type="dxa"/>
+              <w:bottom w:w="50" w:type="dxa"/>
+              <w:right w:w="90" w:type="dxa"/>
+            </w:tcMar>
+            <w:shd w:val="clear" w:color="auto" w:fill="F4F6F9"/>
+            <w:tcBorders>
+              <w:top w:val="nil" w:sz="0" w:color="FFFFFF"/>
+              <w:left w:val="nil" w:sz="0" w:color="FFFFFF"/>
+              <w:bottom w:val="single" w:sz="4" w:color="D5DAE1"/>
+              <w:right w:val="nil" w:sz="0" w:color="FFFFFF"/>
+            </w:tcBorders>
+          </w:tcPr>
+          <w:p>
+            <w:pPr>
+              <w:spacing w:after="0"/>
+            </w:pPr>
+            <w:r>
+              <w:rPr>
+                <w:sz w:val="18"/>
+              </w:rPr>
+              <w:t>R figure scripts plus a Python export step; run_all.sh rebuilds every figure</w:t>
+            </w:r>
+          </w:p>
+        </w:tc>
+      </w:tr>
+      <w:tr>
+        <w:trPr>
+          <w:cantSplit w:val="true"/>
+        </w:trPr>
+        <w:tc>
+          <w:tcPr>
+            <w:tcW w:type="dxa" w:w="3288"/>
+            <w:tcMar>
+              <w:top w:w="50" w:type="dxa"/>
+              <w:left w:w="90" w:type="dxa"/>
+              <w:bottom w:w="50" w:type="dxa"/>
+              <w:right w:w="90" w:type="dxa"/>
+            </w:tcMar>
+            <w:shd w:val="clear" w:color="auto" w:fill="F4F6F9"/>
+            <w:tcBorders>
+              <w:top w:val="nil" w:sz="0" w:color="FFFFFF"/>
+              <w:left w:val="nil" w:sz="0" w:color="FFFFFF"/>
+              <w:bottom w:val="single" w:sz="4" w:color="D5DAE1"/>
+              <w:right w:val="nil" w:sz="0" w:color="FFFFFF"/>
+            </w:tcBorders>
+          </w:tcPr>
+          <w:p>
+            <w:pPr>
+              <w:spacing w:after="0"/>
+            </w:pPr>
+            <w:r>
+              <w:rPr>
+                <w:rFonts w:ascii="Menlo" w:hAnsi="Menlo" w:eastAsia="Menlo"/>
+                <w:sz w:val="18"/>
+              </w:rPr>
+              <w:t>results/figures/</w:t>
+            </w:r>
+          </w:p>
+        </w:tc>
+        <w:tc>
+          <w:tcPr>
+            <w:tcW w:type="dxa" w:w="6350"/>
+            <w:tcMar>
+              <w:top w:w="50" w:type="dxa"/>
+              <w:left w:w="90" w:type="dxa"/>
+              <w:bottom w:w="50" w:type="dxa"/>
+              <w:right w:w="90" w:type="dxa"/>
+            </w:tcMar>
+            <w:shd w:val="clear" w:color="auto" w:fill="F4F6F9"/>
+            <w:tcBorders>
+              <w:top w:val="nil" w:sz="0" w:color="FFFFFF"/>
+              <w:left w:val="nil" w:sz="0" w:color="FFFFFF"/>
+              <w:bottom w:val="single" w:sz="4" w:color="D5DAE1"/>
+              <w:right w:val="nil" w:sz="0" w:color="FFFFFF"/>
+            </w:tcBorders>
+          </w:tcPr>
+          <w:p>
+            <w:pPr>
+              <w:spacing w:after="0"/>
+            </w:pPr>
+            <w:r>
+              <w:rPr>
+                <w:sz w:val="18"/>
+              </w:rPr>
+              <w:t>Publication figures (PDF and 300-dpi PNG); tracked in git</w:t>
+            </w:r>
+          </w:p>
+        </w:tc>
+      </w:tr>
     </w:tbl>
     <w:p>
       <w:pPr>
@@ -29075,6 +30497,69 @@
           </w:p>
         </w:tc>
       </w:tr>
+      <w:tr>
+        <w:trPr>
+          <w:cantSplit w:val="true"/>
+        </w:trPr>
+        <w:tc>
+          <w:tcPr>
+            <w:tcW w:type="dxa" w:w="1928"/>
+            <w:tcMar>
+              <w:top w:w="50" w:type="dxa"/>
+              <w:left w:w="90" w:type="dxa"/>
+              <w:bottom w:w="50" w:type="dxa"/>
+              <w:right w:w="90" w:type="dxa"/>
+            </w:tcMar>
+            <w:shd w:val="clear" w:color="auto" w:fill="F4F6F9"/>
+            <w:tcBorders>
+              <w:top w:val="nil" w:sz="0" w:color="FFFFFF"/>
+              <w:left w:val="nil" w:sz="0" w:color="FFFFFF"/>
+              <w:bottom w:val="single" w:sz="4" w:color="D5DAE1"/>
+              <w:right w:val="nil" w:sz="0" w:color="FFFFFF"/>
+            </w:tcBorders>
+          </w:tcPr>
+          <w:p>
+            <w:pPr>
+              <w:spacing w:after="0"/>
+            </w:pPr>
+            <w:r>
+              <w:rPr>
+                <w:sz w:val="18"/>
+              </w:rPr>
+              <w:t>25 Oct 2026</w:t>
+            </w:r>
+          </w:p>
+        </w:tc>
+        <w:tc>
+          <w:tcPr>
+            <w:tcW w:type="dxa" w:w="7710"/>
+            <w:tcMar>
+              <w:top w:w="50" w:type="dxa"/>
+              <w:left w:w="90" w:type="dxa"/>
+              <w:bottom w:w="50" w:type="dxa"/>
+              <w:right w:w="90" w:type="dxa"/>
+            </w:tcMar>
+            <w:shd w:val="clear" w:color="auto" w:fill="F4F6F9"/>
+            <w:tcBorders>
+              <w:top w:val="nil" w:sz="0" w:color="FFFFFF"/>
+              <w:left w:val="nil" w:sz="0" w:color="FFFFFF"/>
+              <w:bottom w:val="single" w:sz="4" w:color="D5DAE1"/>
+              <w:right w:val="nil" w:sz="0" w:color="FFFFFF"/>
+            </w:tcBorders>
+          </w:tcPr>
+          <w:p>
+            <w:pPr>
+              <w:spacing w:after="0"/>
+            </w:pPr>
+            <w:r>
+              <w:rPr>
+                <w:sz w:val="18"/>
+              </w:rPr>
+              <w:t>R publication figures (6 main, 6 supplementary); novelty audit of 386 robust pairs; comparison with the SelectSim atlas; this guide updated</w:t>
+            </w:r>
+          </w:p>
+        </w:tc>
+      </w:tr>
     </w:tbl>
     <w:p>
       <w:pPr>
@@ -29094,20 +30579,7 @@
         <w:rPr>
           <w:sz w:val="20"/>
         </w:rPr>
-        <w:t xml:space="preserve">Full list of 41 references with DOIs is in </w:t>
-      </w:r>
-      <w:r>
-        <w:rPr>
-          <w:rFonts w:ascii="Menlo" w:hAnsi="Menlo" w:eastAsia="Menlo"/>
-          <w:sz w:val="20"/>
-        </w:rPr>
-        <w:t>docs/literature_review.md</w:t>
-      </w:r>
-      <w:r>
-        <w:rPr>
-          <w:sz w:val="20"/>
-        </w:rPr>
-        <w:t>. The ones used most in this guide:</w:t>
+        <w:t>Full list of 42 references with DOIs is in docs/literature_review.md. The ones used most in this guide:</w:t>
       </w:r>
     </w:p>
     <w:p>
@@ -29504,6 +30976,20 @@
       </w:r>
       <w:r>
         <w:t xml:space="preserve"> 2026. doi:10.64898/2026.04.29.721672</w:t>
+      </w:r>
+    </w:p>
+    <w:p>
+      <w:pPr>
+        <w:pStyle w:val="ListNumber"/>
+        <w:spacing w:after="60"/>
+        <w:numPr>
+          <w:ilvl w:val="0"/>
+          <w:numId w:val="15"/>
+        </w:numPr>
+      </w:pPr>
+      <w:r>
+        <w:rPr/>
+        <w:t>Iyer A, Petrovic M, Sesia D, Nanni L, Mina M, Ciriello G. Evolving patterns of co-mutations from tumor initiation to metastatic progression (SelectSim). Nat Genet 2026. doi:10.1038/s41588-026-02661-4</w:t>
       </w:r>
     </w:p>
     <w:sectPr>

</xml_diff>

<commit_message>
Organise repository: data and scripts READMEs, R dependencies, notebook numbering
- data/README.md: provenance of raw and external data; guide to every processed file
- scripts/README.md: one-line question, output and location for every script; run order
- scripts/figures/install_r_packages.R: R packages for figures and the Rediscover check
- Rename notebook 07_phase2_deep_dive to 06 (no gap in run order); references updated
- README: repository structure rewritten; setup covers R; validation section points to scripts/README
- Supervisor summary: progress framed from the last meeting (Phase 2), before results
</commit_message>
<xml_diff>
--- a/docs/FYP_onboarding_guide.docx
+++ b/docs/FYP_onboarding_guide.docx
@@ -18036,14 +18036,14 @@
         <w:t>gene-gene interaction</w:t>
       </w:r>
       <w:r>
-        <w:t>. Notebook 07 (</w:t>
+        <w:t>. Notebook 06 (</w:t>
       </w:r>
       <w:r>
         <w:rPr>
           <w:rFonts w:ascii="Menlo" w:hAnsi="Menlo" w:eastAsia="Menlo"/>
           <w:sz w:val="18"/>
         </w:rPr>
-        <w:t>07_phase2_deep_dive.ipynb</w:t>
+        <w:t>06_phase2_deep_dive.ipynb</w:t>
       </w:r>
       <w:r>
         <w:t>, re-run on the final Phase 2 outputs on 24 Oct) re-examines all 687 significant cross-mechanism hits (313 co-occurring, 374 exclusive) for four other explanations. Its headline findings:</w:t>
@@ -18405,7 +18405,7 @@
                 <w:color w:val="1F3A5F"/>
                 <w:sz w:val="21"/>
               </w:rPr>
-              <w:t>Notebook 07 was brought up to date on 24 Oct</w:t>
+              <w:t>Notebook 06 was brought up to date on 24 Oct</w:t>
             </w:r>
           </w:p>
           <w:p>
@@ -18619,7 +18619,7 @@
           <w:color w:val="555B66"/>
           <w:sz w:val="17"/>
         </w:rPr>
-        <w:t xml:space="preserve"> notebooks/02_phase2_comutation_matrix.ipynb, notebooks/07_phase2_deep_dive.ipynb, README.md (Phase 2), docs/literature_review.md §7-§8.</w:t>
+        <w:t xml:space="preserve"> notebooks/02_phase2_comutation_matrix.ipynb, notebooks/06_phase2_deep_dive.ipynb, README.md (Phase 2), docs/literature_review.md §7-§8.</w:t>
       </w:r>
     </w:p>
     <w:p>
@@ -26169,7 +26169,7 @@
               <w:rPr>
                 <w:sz w:val="18"/>
               </w:rPr>
-              <w:t>Notebook 07: deep dive</w:t>
+              <w:t>Notebook 06: deep dive</w:t>
             </w:r>
           </w:p>
         </w:tc>
@@ -26768,7 +26768,7 @@
                 <w:b/>
                 <w:sz w:val="20"/>
               </w:rPr>
-              <w:t>Notebook 07</w:t>
+              <w:t>Notebook 06</w:t>
             </w:r>
             <w:r>
               <w:rPr>
@@ -26985,7 +26985,7 @@
               <w:rPr>
                 <w:sz w:val="20"/>
               </w:rPr>
-              <w:t xml:space="preserve"> together with notebook 07, </w:t>
+              <w:t xml:space="preserve"> together with notebook 06, </w:t>
             </w:r>
             <w:r>
               <w:rPr>
@@ -27364,7 +27364,7 @@
                 <w:rFonts w:ascii="Menlo" w:hAnsi="Menlo" w:eastAsia="Menlo"/>
                 <w:sz w:val="18"/>
               </w:rPr>
-              <w:t>notebooks/07_phase2_deep_dive.ipynb</w:t>
+              <w:t>notebooks/06_phase2_deep_dive.ipynb</w:t>
             </w:r>
           </w:p>
         </w:tc>
@@ -30492,7 +30492,7 @@
               <w:rPr>
                 <w:sz w:val="18"/>
               </w:rPr>
-              <w:t>Notebook 07 re-run and rewritten; count fixes in README, notebook 01 and literature review; obsolete PLAN.md deleted; all committed</w:t>
+              <w:t>Notebook 06 re-run and rewritten; count fixes in README, notebook 01 and literature review; obsolete PLAN.md deleted; all committed</w:t>
             </w:r>
           </w:p>
         </w:tc>

</xml_diff>

<commit_message>
Re-run allele screen and partner models on final data; retire script 11
- 08 (allele screen) re-run after fusions were added: ALK fusion now a lung partner
  (6 new pairs); same 10 allele-specific hits (of 201); KRAS G12C/STK11 2.00x ->
  1.74x after smoking adjustment (was 1.97x -> 1.73x). Notebook 04, Fig 5 and docs updated
- 10 (partner prediction) re-run: identical results
- Script 11 retired (replaced by 12; last version in 7811201) with its output
- scripts/README: each analysis labelled pipeline or design evidence
</commit_message>
<xml_diff>
--- a/docs/FYP_onboarding_guide.docx
+++ b/docs/FYP_onboarding_guide.docx
@@ -10578,7 +10578,7 @@
               <w:rPr>
                 <w:sz w:val="17"/>
               </w:rPr>
-              <w:t>Real but few: 10 of 199; partly smoking</w:t>
+              <w:t>Real but few: 10 of 201; partly smoking</w:t>
             </w:r>
           </w:p>
         </w:tc>
@@ -20593,7 +20593,7 @@
               <w:rPr>
                 <w:sz w:val="17"/>
               </w:rPr>
-              <w:t xml:space="preserve">10 of 199 (gene, partner) combinations differ by allele: </w:t>
+              <w:t xml:space="preserve">10 of 201 (gene, partner) combinations differ by allele: </w:t>
             </w:r>
             <w:r>
               <w:rPr>
@@ -20684,7 +20684,7 @@
               <w:rPr>
                 <w:sz w:val="17"/>
               </w:rPr>
-              <w:t xml:space="preserve"> from 1.97x to 1.73x and removes G12C/</w:t>
+              <w:t xml:space="preserve"> from 2.00x to 1.74x and removes G12C/</w:t>
             </w:r>
             <w:r>
               <w:rPr>
@@ -22512,7 +22512,7 @@
           <w:color w:val="555B66"/>
           <w:sz w:val="17"/>
         </w:rPr>
-        <w:t>Source files for this part: notebooks/04_phase4_insight.ipynb; git commits 7ee854f and c35130f; scripts/analyses/11_novel_insights.py and 12_burden_adjusted_retest.py; scripts/analyses/19_novelty_screen.py and 20_candidate_followup.py; scripts/figures/ and results/figures/.</w:t>
+        <w:t>Source files for this part: notebooks/04_phase4_insight.ipynb; git commits 7ee854f and c35130f; scripts/analyses/12_burden_adjusted_retest.py (script 11, the first check, is retired); scripts/analyses/19_novelty_screen.py and 20_candidate_followup.py; scripts/figures/ and results/figures/.</w:t>
       </w:r>
     </w:p>
     <w:p>

</xml_diff>

<commit_message>
Onboarding guide: current commit hashes, repository map, run order and timeline
</commit_message>
<xml_diff>
--- a/docs/FYP_onboarding_guide.docx
+++ b/docs/FYP_onboarding_guide.docx
@@ -22512,7 +22512,7 @@
           <w:color w:val="555B66"/>
           <w:sz w:val="17"/>
         </w:rPr>
-        <w:t>Source files for this part: notebooks/04_phase4_insight.ipynb; git commits 7ee854f and c35130f; scripts/analyses/12_burden_adjusted_retest.py (script 11, the first check, is retired); scripts/analyses/19_novelty_screen.py and 20_candidate_followup.py; scripts/figures/ and results/figures/.</w:t>
+        <w:t>Source files for this part: notebooks/04_phase4_insight.ipynb; git commits d040be9 and 507ace8; scripts/analyses/12_burden_adjusted_retest.py (script 11, the first check, is retired); scripts/analyses/19_novelty_screen.py and 20_candidate_followup.py; scripts/figures/ and results/figures/.</w:t>
       </w:r>
     </w:p>
     <w:p>
@@ -27001,6 +27001,17 @@
               <w:t xml:space="preserve"> and this guide.</w:t>
             </w:r>
           </w:p>
+          <w:p>
+            <w:pPr>
+              <w:spacing w:after="60"/>
+            </w:pPr>
+            <w:r>
+              <w:rPr>
+                <w:sz w:val="20"/>
+              </w:rPr>
+              <w:t>•  Notebook 07 (the Phase 2 deep dive) was renamed 06 on 25 Oct so the run order has no gap; older notes and commits call it 07.</w:t>
+            </w:r>
+          </w:p>
         </w:tc>
       </w:tr>
     </w:tbl>
@@ -27518,7 +27529,7 @@
               <w:rPr>
                 <w:sz w:val="18"/>
               </w:rPr>
-              <w:t>Numbered analyses behind each design decision (01-18); run from the repo root</w:t>
+              <w:t>Numbered analyses 01-20 (script 11 retired), each labelled pipeline or design evidence; index and run order in scripts/README.md</w:t>
             </w:r>
           </w:p>
         </w:tc>
@@ -27809,7 +27820,7 @@
               <w:rPr>
                 <w:sz w:val="18"/>
               </w:rPr>
-              <w:t>Script outputs and logs (not tracked)</w:t>
+              <w:t>Script outputs and logs (not tracked); results/figures/ is tracked</w:t>
             </w:r>
           </w:p>
         </w:tc>
@@ -28128,6 +28139,134 @@
                 <w:sz w:val="18"/>
               </w:rPr>
               <w:t>Publication figures (PDF and 300-dpi PNG); tracked in git</w:t>
+            </w:r>
+          </w:p>
+        </w:tc>
+      </w:tr>
+      <w:tr>
+        <w:trPr>
+          <w:cantSplit w:val="true"/>
+        </w:trPr>
+        <w:tc>
+          <w:tcPr>
+            <w:tcW w:type="dxa" w:w="3288"/>
+            <w:tcMar>
+              <w:top w:w="50" w:type="dxa"/>
+              <w:left w:w="90" w:type="dxa"/>
+              <w:bottom w:w="50" w:type="dxa"/>
+              <w:right w:w="90" w:type="dxa"/>
+            </w:tcMar>
+            <w:shd w:val="clear" w:color="auto" w:fill="F4F6F9"/>
+            <w:tcBorders>
+              <w:top w:val="nil" w:sz="0" w:color="FFFFFF"/>
+              <w:left w:val="nil" w:sz="0" w:color="FFFFFF"/>
+              <w:bottom w:val="single" w:sz="4" w:color="D5DAE1"/>
+              <w:right w:val="nil" w:sz="0" w:color="FFFFFF"/>
+            </w:tcBorders>
+          </w:tcPr>
+          <w:p>
+            <w:pPr>
+              <w:spacing w:after="0"/>
+            </w:pPr>
+            <w:r>
+              <w:rPr>
+                <w:rFonts w:ascii="Menlo" w:hAnsi="Menlo" w:eastAsia="Menlo"/>
+                <w:sz w:val="18"/>
+              </w:rPr>
+              <w:t>data/README.md, scripts/README.md</w:t>
+            </w:r>
+          </w:p>
+        </w:tc>
+        <w:tc>
+          <w:tcPr>
+            <w:tcW w:type="dxa" w:w="6350"/>
+            <w:tcMar>
+              <w:top w:w="50" w:type="dxa"/>
+              <w:left w:w="90" w:type="dxa"/>
+              <w:bottom w:w="50" w:type="dxa"/>
+              <w:right w:w="90" w:type="dxa"/>
+            </w:tcMar>
+            <w:shd w:val="clear" w:color="auto" w:fill="F4F6F9"/>
+            <w:tcBorders>
+              <w:top w:val="nil" w:sz="0" w:color="FFFFFF"/>
+              <w:left w:val="nil" w:sz="0" w:color="FFFFFF"/>
+              <w:bottom w:val="single" w:sz="4" w:color="D5DAE1"/>
+              <w:right w:val="nil" w:sz="0" w:color="FFFFFF"/>
+            </w:tcBorders>
+          </w:tcPr>
+          <w:p>
+            <w:pPr>
+              <w:spacing w:after="0"/>
+            </w:pPr>
+            <w:r>
+              <w:rPr>
+                <w:sz w:val="18"/>
+              </w:rPr>
+              <w:t>Where each dataset comes from and what every processed file contains; what every script does and the run order</w:t>
+            </w:r>
+          </w:p>
+        </w:tc>
+      </w:tr>
+      <w:tr>
+        <w:trPr>
+          <w:cantSplit w:val="true"/>
+        </w:trPr>
+        <w:tc>
+          <w:tcPr>
+            <w:tcW w:type="dxa" w:w="3288"/>
+            <w:tcMar>
+              <w:top w:w="50" w:type="dxa"/>
+              <w:left w:w="90" w:type="dxa"/>
+              <w:bottom w:w="50" w:type="dxa"/>
+              <w:right w:w="90" w:type="dxa"/>
+            </w:tcMar>
+            <w:shd w:val="clear" w:color="auto" w:fill="F4F6F9"/>
+            <w:tcBorders>
+              <w:top w:val="nil" w:sz="0" w:color="FFFFFF"/>
+              <w:left w:val="nil" w:sz="0" w:color="FFFFFF"/>
+              <w:bottom w:val="single" w:sz="4" w:color="D5DAE1"/>
+              <w:right w:val="nil" w:sz="0" w:color="FFFFFF"/>
+            </w:tcBorders>
+          </w:tcPr>
+          <w:p>
+            <w:pPr>
+              <w:spacing w:after="0"/>
+            </w:pPr>
+            <w:r>
+              <w:rPr>
+                <w:rFonts w:ascii="Menlo" w:hAnsi="Menlo" w:eastAsia="Menlo"/>
+                <w:sz w:val="18"/>
+              </w:rPr>
+              <w:t>LICENSE</w:t>
+            </w:r>
+          </w:p>
+        </w:tc>
+        <w:tc>
+          <w:tcPr>
+            <w:tcW w:type="dxa" w:w="6350"/>
+            <w:tcMar>
+              <w:top w:w="50" w:type="dxa"/>
+              <w:left w:w="90" w:type="dxa"/>
+              <w:bottom w:w="50" w:type="dxa"/>
+              <w:right w:w="90" w:type="dxa"/>
+            </w:tcMar>
+            <w:shd w:val="clear" w:color="auto" w:fill="F4F6F9"/>
+            <w:tcBorders>
+              <w:top w:val="nil" w:sz="0" w:color="FFFFFF"/>
+              <w:left w:val="nil" w:sz="0" w:color="FFFFFF"/>
+              <w:bottom w:val="single" w:sz="4" w:color="D5DAE1"/>
+              <w:right w:val="nil" w:sz="0" w:color="FFFFFF"/>
+            </w:tcBorders>
+          </w:tcPr>
+          <w:p>
+            <w:pPr>
+              <w:spacing w:after="0"/>
+            </w:pPr>
+            <w:r>
+              <w:rPr>
+                <w:sz w:val="18"/>
+              </w:rPr>
+              <w:t>MIT licence for the code (GENIE and other data keep their own terms)</w:t>
             </w:r>
           </w:p>
         </w:tc>
@@ -28221,17 +28360,7 @@
         </w:numPr>
       </w:pPr>
       <w:r>
-        <w:t xml:space="preserve">Select that kernel and run notebooks 01 → 02 → 03 → 04 in order. The scripts in </w:t>
-      </w:r>
-      <w:r>
-        <w:rPr>
-          <w:rFonts w:ascii="Menlo" w:hAnsi="Menlo" w:eastAsia="Menlo"/>
-          <w:sz w:val="18"/>
-        </w:rPr>
-        <w:t>scripts/analyses/</w:t>
-      </w:r>
-      <w:r>
-        <w:t xml:space="preserve"> (the TCGA download and the null simulations take minutes to hours) feed notebook 05, which only reads their saved outputs.</w:t>
+        <w:t>Select that kernel and follow the run order in scripts/README.md: notebooks 01 → 02, the pipeline scripts in scripts/analyses/ (08, 10, 12, 14-20; the TCGA download and the literature screen need the internet), notebooks 03 → 04, then the read-only summaries 05 and 06.</w:t>
       </w:r>
     </w:p>
     <w:p>
@@ -28244,27 +28373,7 @@
         </w:numPr>
       </w:pPr>
       <w:r>
-        <w:t xml:space="preserve">Run scripts from the repo root. </w:t>
-      </w:r>
-      <w:r>
-        <w:rPr>
-          <w:rFonts w:ascii="Menlo" w:hAnsi="Menlo" w:eastAsia="Menlo"/>
-          <w:sz w:val="18"/>
-        </w:rPr>
-        <w:t>scripts/validation/build_msk468_matrix.py</w:t>
-      </w:r>
-      <w:r>
-        <w:t xml:space="preserve"> comes first; </w:t>
-      </w:r>
-      <w:r>
-        <w:rPr>
-          <w:rFonts w:ascii="Menlo" w:hAnsi="Menlo" w:eastAsia="Menlo"/>
-          <w:sz w:val="18"/>
-        </w:rPr>
-        <w:t>rediscover_run.R</w:t>
-      </w:r>
-      <w:r>
-        <w:t xml:space="preserve"> needs R and the Rediscover package.</w:t>
+        <w:t>Run scripts from the repo root. For the figures and the Rediscover check, install R packages once with Rscript scripts/figures/install_r_packages.R, then bash scripts/figures/run_all.sh rebuilds every figure. scripts/validation/build_msk468_matrix.py comes first among the validation scripts.</w:t>
       </w:r>
     </w:p>
     <w:tbl>
@@ -30492,7 +30601,7 @@
               <w:rPr>
                 <w:sz w:val="18"/>
               </w:rPr>
-              <w:t>Notebook 06 re-run and rewritten; count fixes in README, notebook 01 and literature review; obsolete PLAN.md deleted; all committed</w:t>
+              <w:t>Notebook 07 (renamed 06 on 25 Oct) re-run and rewritten; count fixes in README, notebook 01 and literature review; obsolete PLAN.md deleted; all committed</w:t>
             </w:r>
           </w:p>
         </w:tc>
@@ -30555,7 +30664,7 @@
               <w:rPr>
                 <w:sz w:val="18"/>
               </w:rPr>
-              <w:t>R publication figures (6 main, 6 supplementary); novelty audit of 386 robust pairs; comparison with the SelectSim atlas; this guide updated</w:t>
+              <w:t>R publication figures (6 main, 6 supplementary); novelty audit of 386 robust pairs and comparison with the SelectSim atlas; repository organised (data/ and scripts/ READMEs, notebook 07 renamed 06, MIT licence); allele screen and partner models re-run on the final data (KRAS G12C/STK11 2.00x → 1.74x after smoking adjustment; partner prediction unchanged); script 11 retired; this guide updated</w:t>
             </w:r>
           </w:p>
         </w:tc>

</xml_diff>

<commit_message>
Onboarding guide: note that each notebook shows its phase's figures
</commit_message>
<xml_diff>
--- a/docs/FYP_onboarding_guide.docx
+++ b/docs/FYP_onboarding_guide.docx
@@ -27277,7 +27277,7 @@
               <w:rPr>
                 <w:sz w:val="18"/>
               </w:rPr>
-              <w:t>Phase 1-4 notebooks. Each is self-contained, opens with a “data flow at a glance” diagram and ends with a Discussion</w:t>
+              <w:t>Phase 1-4 notebooks. Each is self-contained, opens with a “data flow at a glance” diagram, shows that phase's publication figures, and ends with a Discussion</w:t>
             </w:r>
           </w:p>
         </w:tc>
@@ -28138,7 +28138,7 @@
               <w:rPr>
                 <w:sz w:val="18"/>
               </w:rPr>
-              <w:t>Publication figures (PDF and 300-dpi PNG); tracked in git</w:t>
+              <w:t>Publication figures (PDF and 300-dpi PNG); tracked in git; each is also shown in the notebook of its phase</w:t>
             </w:r>
           </w:p>
         </w:tc>

</xml_diff>

<commit_message>
Re-implement SELECT faithfully and correct statements about van de Haar 2019 and Scharpf 2022
- Benchmark: SELECT rebuilt from Mina 2017 Methods S1 (weighted MI with per-subtype
  sample-count correction; 1,000 margin-preserving randomisations within subtypes;
  effect size; empirical FDR). It is calibrated (3.8% null p<0.05) and ranks the
  strongest pairs best (96% of top 50 replicate); the conditional test keeps the most
  reproducible significant list (37% vs 33.7%). The earlier simplified SELECT-style
  score is withdrawn. SELECT has its own RNG so the shared null is unchanged.
- Literature review: van de Haar and Scharpf statements checked against full text
  (cohorts, methods; Scharpf uses panel-aware denominators and TMB-quintile strata)
- Notebook 05 computes the null table from saved data; Fig 2 adds SELECT; README,
  supervisor summary and onboarding guide updated
</commit_message>
<xml_diff>
--- a/docs/FYP_onboarding_guide.docx
+++ b/docs/FYP_onboarding_guide.docx
@@ -5096,7 +5096,7 @@
               <w:rPr>
                 <w:sz w:val="20"/>
               </w:rPr>
-              <w:t>Searched Europe PMC (PubMed, PubMed Central and preprints), the Firecrawl research index and tool documentation between 30 Sep and 22 Oct 2026. It is a narrative, single-reviewer review (not a formal systematic review) with 42 references, each checked against Europe PMC metadata. Where full text was unavailable (for example van de Haar 2019 and Scharpf 2022), claims are limited to the abstracts. The SelectSim atlas (Nature Genetics, July 2026) was added on 25 October.</w:t>
+              <w:t>Searched Europe PMC (PubMed, PubMed Central and preprints), the Firecrawl research index and tool documentation between 30 Sep and 22 Oct 2026. It is a narrative, single-reviewer review (not a formal systematic review) with 42 references, each checked against Europe PMC metadata. Full texts were read for the papers the design rests on, including van de Haar 2019, Scharpf 2022 and SELECT (Mina 2017, Methods S1), checked statement by statement on 26 Oct; a few papers cited for a single point were read as abstracts. The SelectSim atlas (Nature Genetics, July 2026) was added on 25 October.</w:t>
             </w:r>
           </w:p>
         </w:tc>
@@ -7737,7 +7737,7 @@
               <w:rPr>
                 <w:sz w:val="17"/>
               </w:rPr>
-              <w:t>Idea borrowed: ranks no better than p-values (Part 10); redundancy interpretation used in Phase 4</w:t>
+              <w:t>Re-implemented from its methods and benchmarked (Part 10.4): calibrated, best at ranking the strongest pairs; redundancy interpretation used in Phase 4</w:t>
             </w:r>
           </w:p>
         </w:tc>
@@ -8175,7 +8175,7 @@
               <w:rPr>
                 <w:sz w:val="17"/>
               </w:rPr>
-              <w:t>Most published exclusivity is explained by subtype and mutation load, not pathways</w:t>
+              <w:t>Re-ran five methods (incl. DISCOVER, Fisher) on 13 TCGA + MSKCC cohorts: most exclusivity they find tracks subtype and mutation load, not pathways -- even for load-aware DISCOVER</w:t>
             </w:r>
           </w:p>
         </w:tc>
@@ -8870,7 +8870,7 @@
               <w:rPr>
                 <w:sz w:val="17"/>
               </w:rPr>
-              <w:t>66,372 GENIE tumours</w:t>
+              <w:t>66,372 GENIE tumours (27,257 tumour-normal for co-mutation)</w:t>
             </w:r>
           </w:p>
         </w:tc>
@@ -8898,7 +8898,7 @@
               <w:rPr>
                 <w:sz w:val="17"/>
               </w:rPr>
-              <w:t>RAS co-mutation depends on lineage and allele; Bayesian model adjusting for TMB and signatures</w:t>
+              <w:t>RAS co-mutation depends on lineage and allele; Bayesian hierarchical model pooled across cancer types, with TMB-quintile and smoking-signature stratified checks</w:t>
             </w:r>
           </w:p>
         </w:tc>
@@ -9351,20 +9351,7 @@
               <w:rPr>
                 <w:sz w:val="20"/>
               </w:rPr>
-              <w:t xml:space="preserve">Same database, same concern with mutation load. </w:t>
-            </w:r>
-            <w:r>
-              <w:rPr>
-                <w:b/>
-                <w:sz w:val="20"/>
-              </w:rPr>
-              <w:t>Differences:</w:t>
-            </w:r>
-            <w:r>
-              <w:rPr>
-                <w:sz w:val="20"/>
-              </w:rPr>
-              <w:t xml:space="preserve"> it covers RAS genes only; it models mutation load with a Bayesian model rather than an exact conditional test; it does not correct copy-number or panel-testing gaps; and it offers no lookup tool.</w:t>
+              <w:t>Same database, same concern with mutation load, and panel-aware denominators like ours. Differences: it covers RAS genes only; it stratifies mutation load into TMB quintiles rather than conditioning on each tumour's own count; it does not adjust for copy-number burden; and it offers no lookup tool. It found G12C/STK11 and G12C/KEAP1 strongest in low-TMB tumours, and fewer of them with a smoking signature -- consistent with our smoking adjustment.</w:t>
             </w:r>
           </w:p>
         </w:tc>
@@ -23473,16 +23460,10 @@
         <w:t>15_method_benchmark.py</w:t>
       </w:r>
       <w:r>
-        <w:t xml:space="preserve"> ran each family on </w:t>
-      </w:r>
-      <w:r>
         <w:rPr>
-          <w:b/>
+          <w:b w:val="0"/>
         </w:rPr>
-        <w:t>identical patients and pairs</w:t>
-      </w:r>
-      <w:r>
-        <w:t xml:space="preserve"> (9 cancer types, 2,553 pairs, panels covering every gene used) and scored it two ways: false positives on null data that keep every patient's alteration count and every gene's frequency but destroy gene-gene links, and replication of each method's significant calls in TCGA.</w:t>
+        <w:t xml:space="preserve"> ran each family on identical patients and pairs (9 cancer types, 2,553 pairs, panels covering every gene used) and scored it two ways: false positives on null data that keep every patient's alteration count and every gene's frequency but destroy gene-gene links, and replication of each method's significant calls in TCGA. SELECT (Mina 2017) was re-implemented from its published Methods S1 (weighted mutual information, 1,000 margin-preserving randomisations within subtypes, effect size and empirical FDR); a first simplified “SELECT-style” score without a null was withdrawn because it was not SELECT.</w:t>
       </w:r>
     </w:p>
     <w:p>
@@ -23493,8 +23474,8 @@
       <w:r>
         <w:drawing>
           <wp:inline xmlns:a="http://schemas.openxmlformats.org/drawingml/2006/main" xmlns:pic="http://schemas.openxmlformats.org/drawingml/2006/picture">
-            <wp:extent cx="5580000" cy="2087504"/>
-            <wp:docPr id="6" name="Picture 6"/>
+            <wp:extent cx="5577840" cy="4571196"/>
+            <wp:docPr id="9" name="Picture 9"/>
             <wp:cNvGraphicFramePr>
               <a:graphicFrameLocks noChangeAspect="1"/>
             </wp:cNvGraphicFramePr>
@@ -23502,11 +23483,11 @@
               <a:graphicData uri="http://schemas.openxmlformats.org/drawingml/2006/picture">
                 <pic:pic>
                   <pic:nvPicPr>
-                    <pic:cNvPr id="0" name="fig7_benchmark.png"/>
+                    <pic:cNvPr id="0" name="fig2_method_validity.png"/>
                     <pic:cNvPicPr/>
                   </pic:nvPicPr>
                   <pic:blipFill>
-                    <a:blip r:embed="rId16"/>
+                    <a:blip r:embed="rId19"/>
                     <a:stretch>
                       <a:fillRect/>
                     </a:stretch>
@@ -23514,7 +23495,7 @@
                   <pic:spPr>
                     <a:xfrm>
                       <a:off x="0" y="0"/>
-                      <a:ext cx="5580000" cy="2087504"/>
+                      <a:ext cx="5577840" cy="4571196"/>
                     </a:xfrm>
                     <a:prstGeom prst="rect"/>
                   </pic:spPr>
@@ -23534,7 +23515,7 @@
           <w:color w:val="555B66"/>
           <w:sz w:val="18"/>
         </w:rPr>
-        <w:t>Figure 6. Left: share of null pairs called at p &lt; 0.05 (target 5%). Right: share of each method's significant calls that replicate in TCGA.</w:t>
+        <w:t>Figure 6. Figure 2 of the figure set. a, p-values on null data with no real gene-gene links (flat = calibrated); b, false positives and TCGA replication per method; c, GENIE vs TCGA effect for every testable pair.</w:t>
       </w:r>
     </w:p>
     <w:tbl>
@@ -24419,6 +24400,189 @@
           </w:p>
         </w:tc>
       </w:tr>
+      <w:tr>
+        <w:trPr>
+          <w:cantSplit w:val="true"/>
+        </w:trPr>
+        <w:tc>
+          <w:tcPr>
+            <w:tcW w:type="dxa" w:w="3175"/>
+            <w:tcMar>
+              <w:top w:w="50" w:type="dxa"/>
+              <w:left w:w="90" w:type="dxa"/>
+              <w:bottom w:w="50" w:type="dxa"/>
+              <w:right w:w="90" w:type="dxa"/>
+            </w:tcMar>
+            <w:shd w:val="clear" w:color="auto" w:fill="F4F6F9"/>
+            <w:tcBorders>
+              <w:top w:val="nil" w:sz="0" w:color="FFFFFF"/>
+              <w:left w:val="nil" w:sz="0" w:color="FFFFFF"/>
+              <w:bottom w:val="single" w:sz="4" w:color="D5DAE1"/>
+              <w:right w:val="nil" w:sz="0" w:color="FFFFFF"/>
+            </w:tcBorders>
+          </w:tcPr>
+          <w:p>
+            <w:pPr>
+              <w:spacing w:after="0"/>
+            </w:pPr>
+            <w:r>
+              <w:rPr>
+                <w:b/>
+                <w:sz w:val="17"/>
+              </w:rPr>
+              <w:t>D  SELECT (Mina 2017; re-implemented)</w:t>
+            </w:r>
+          </w:p>
+        </w:tc>
+        <w:tc>
+          <w:tcPr>
+            <w:tcW w:type="dxa" w:w="1134"/>
+            <w:tcMar>
+              <w:top w:w="50" w:type="dxa"/>
+              <w:left w:w="90" w:type="dxa"/>
+              <w:bottom w:w="50" w:type="dxa"/>
+              <w:right w:w="90" w:type="dxa"/>
+            </w:tcMar>
+            <w:shd w:val="clear" w:color="auto" w:fill="F4F6F9"/>
+            <w:tcBorders>
+              <w:top w:val="nil" w:sz="0" w:color="FFFFFF"/>
+              <w:left w:val="nil" w:sz="0" w:color="FFFFFF"/>
+              <w:bottom w:val="single" w:sz="4" w:color="D5DAE1"/>
+              <w:right w:val="nil" w:sz="0" w:color="FFFFFF"/>
+            </w:tcBorders>
+          </w:tcPr>
+          <w:p>
+            <w:pPr>
+              <w:spacing w:after="0"/>
+            </w:pPr>
+            <w:r>
+              <w:rPr>
+                <w:b/>
+                <w:sz w:val="17"/>
+              </w:rPr>
+              <w:t>3.8%</w:t>
+            </w:r>
+          </w:p>
+        </w:tc>
+        <w:tc>
+          <w:tcPr>
+            <w:tcW w:type="dxa" w:w="1361"/>
+            <w:tcMar>
+              <w:top w:w="50" w:type="dxa"/>
+              <w:left w:w="90" w:type="dxa"/>
+              <w:bottom w:w="50" w:type="dxa"/>
+              <w:right w:w="90" w:type="dxa"/>
+            </w:tcMar>
+            <w:shd w:val="clear" w:color="auto" w:fill="F4F6F9"/>
+            <w:tcBorders>
+              <w:top w:val="nil" w:sz="0" w:color="FFFFFF"/>
+              <w:left w:val="nil" w:sz="0" w:color="FFFFFF"/>
+              <w:bottom w:val="single" w:sz="4" w:color="D5DAE1"/>
+              <w:right w:val="nil" w:sz="0" w:color="FFFFFF"/>
+            </w:tcBorders>
+          </w:tcPr>
+          <w:p>
+            <w:pPr>
+              <w:spacing w:after="0"/>
+            </w:pPr>
+            <w:r>
+              <w:rPr>
+                <w:b/>
+                <w:sz w:val="17"/>
+              </w:rPr>
+              <w:t>0.2%</w:t>
+            </w:r>
+          </w:p>
+        </w:tc>
+        <w:tc>
+          <w:tcPr>
+            <w:tcW w:type="dxa" w:w="1474"/>
+            <w:tcMar>
+              <w:top w:w="50" w:type="dxa"/>
+              <w:left w:w="90" w:type="dxa"/>
+              <w:bottom w:w="50" w:type="dxa"/>
+              <w:right w:w="90" w:type="dxa"/>
+            </w:tcMar>
+            <w:shd w:val="clear" w:color="auto" w:fill="F4F6F9"/>
+            <w:tcBorders>
+              <w:top w:val="nil" w:sz="0" w:color="FFFFFF"/>
+              <w:left w:val="nil" w:sz="0" w:color="FFFFFF"/>
+              <w:bottom w:val="single" w:sz="4" w:color="D5DAE1"/>
+              <w:right w:val="nil" w:sz="0" w:color="FFFFFF"/>
+            </w:tcBorders>
+          </w:tcPr>
+          <w:p>
+            <w:pPr>
+              <w:spacing w:after="0"/>
+            </w:pPr>
+            <w:r>
+              <w:rPr>
+                <w:sz w:val="17"/>
+              </w:rPr>
+              <w:t>770</w:t>
+            </w:r>
+          </w:p>
+        </w:tc>
+        <w:tc>
+          <w:tcPr>
+            <w:tcW w:type="dxa" w:w="1361"/>
+            <w:tcMar>
+              <w:top w:w="50" w:type="dxa"/>
+              <w:left w:w="90" w:type="dxa"/>
+              <w:bottom w:w="50" w:type="dxa"/>
+              <w:right w:w="90" w:type="dxa"/>
+            </w:tcMar>
+            <w:shd w:val="clear" w:color="auto" w:fill="F4F6F9"/>
+            <w:tcBorders>
+              <w:top w:val="nil" w:sz="0" w:color="FFFFFF"/>
+              <w:left w:val="nil" w:sz="0" w:color="FFFFFF"/>
+              <w:bottom w:val="single" w:sz="4" w:color="D5DAE1"/>
+              <w:right w:val="nil" w:sz="0" w:color="FFFFFF"/>
+            </w:tcBorders>
+          </w:tcPr>
+          <w:p>
+            <w:pPr>
+              <w:spacing w:after="0"/>
+            </w:pPr>
+            <w:r>
+              <w:rPr>
+                <w:b/>
+                <w:sz w:val="17"/>
+              </w:rPr>
+              <w:t>33.7%</w:t>
+            </w:r>
+          </w:p>
+        </w:tc>
+        <w:tc>
+          <w:tcPr>
+            <w:tcW w:type="dxa" w:w="1134"/>
+            <w:tcMar>
+              <w:top w:w="50" w:type="dxa"/>
+              <w:left w:w="90" w:type="dxa"/>
+              <w:bottom w:w="50" w:type="dxa"/>
+              <w:right w:w="90" w:type="dxa"/>
+            </w:tcMar>
+            <w:shd w:val="clear" w:color="auto" w:fill="F4F6F9"/>
+            <w:tcBorders>
+              <w:top w:val="nil" w:sz="0" w:color="FFFFFF"/>
+              <w:left w:val="nil" w:sz="0" w:color="FFFFFF"/>
+              <w:bottom w:val="single" w:sz="4" w:color="D5DAE1"/>
+              <w:right w:val="nil" w:sz="0" w:color="FFFFFF"/>
+            </w:tcBorders>
+          </w:tcPr>
+          <w:p>
+            <w:pPr>
+              <w:spacing w:after="0"/>
+            </w:pPr>
+            <w:r>
+              <w:rPr>
+                <w:sz w:val="17"/>
+              </w:rPr>
+              <w:t>0</w:t>
+            </w:r>
+          </w:p>
+        </w:tc>
+      </w:tr>
     </w:tbl>
     <w:p>
       <w:pPr>
@@ -24434,10 +24598,16 @@
         <w:rPr>
           <w:b/>
         </w:rPr>
-        <w:t>Only the conditional test is calibrated.</w:t>
-      </w:r>
-      <w:r>
-        <w:t xml:space="preserve"> Fisher over-calls; the DISCOVER-style plug-in is worst, with 18% of null pairs surviving FDR, all as false exclusivity.</w:t>
+        <w:rPr>
+          <w:b/>
+        </w:rPr>
+        <w:t>Calibration needs a margin-preserving null.</w:t>
+      </w:r>
+      <w:r>
+        <w:rPr>
+          <w:b w:val="0"/>
+        </w:rPr>
+        <w:t xml:space="preserve"> The conditional test (exact) and SELECT (by randomisation) are both calibrated; Fisher over-calls, and the DISCOVER-style plug-in is worst, with 18% of null pairs surviving FDR, all as false exclusivity.</w:t>
       </w:r>
     </w:p>
     <w:p>
@@ -24449,10 +24619,16 @@
         <w:rPr>
           <w:b/>
         </w:rPr>
-        <w:t>Its calls replicate best</w:t>
-      </w:r>
-      <w:r>
-        <w:t xml:space="preserve"> (37% vs 29% for Fisher) with fewer calls: the extra calls of the other methods are mostly the ones that fail.</w:t>
+        <w:rPr>
+          <w:b/>
+        </w:rPr>
+        <w:t>Our calls replicate best</w:t>
+      </w:r>
+      <w:r>
+        <w:rPr>
+          <w:b w:val="0"/>
+        </w:rPr>
+        <w:t xml:space="preserve"> (37% vs 34% for SELECT and 29% for Fisher) with fewer calls: the extra calls of the other methods are mostly the ones that fail.</w:t>
       </w:r>
     </w:p>
     <w:p>
@@ -24530,10 +24706,16 @@
         <w:rPr>
           <w:b/>
         </w:rPr>
-        <w:t>SELECT-style weighted information</w:t>
-      </w:r>
-      <w:r>
-        <w:t xml:space="preserve"> ranks worst beyond the top 50: a score without a load-aware null does not separate interactions from gene frequency.</w:t>
+        <w:rPr>
+          <w:b/>
+        </w:rPr>
+        <w:t>SELECT ranks the very strongest pairs best</w:t>
+      </w:r>
+      <w:r>
+        <w:rPr>
+          <w:b w:val="0"/>
+        </w:rPr>
+        <w:t xml:space="preserve"> (96% of its top 50 and 84% of its top 100 replicate): its effect size is a good ranking score. Our advantage is the precision of the significant list, not the top of the ranking.</w:t>
       </w:r>
     </w:p>
     <w:p>
@@ -25194,20 +25376,7 @@
               <w:rPr>
                 <w:sz w:val="20"/>
               </w:rPr>
-              <w:t xml:space="preserve">•  </w:t>
-            </w:r>
-            <w:r>
-              <w:rPr>
-                <w:b/>
-                <w:sz w:val="20"/>
-              </w:rPr>
-              <w:t>Borrowed but not adopted:</w:t>
-            </w:r>
-            <w:r>
-              <w:rPr>
-                <w:sz w:val="20"/>
-              </w:rPr>
-              <w:t xml:space="preserve"> shrinkage (small gain, blurs specificity) and SELECT-style ranking (no better than p-values).</w:t>
+              <w:t>•  SELECT, re-implemented faithfully, is the closest alternative: calibrated and best at ranking the strongest pairs. Shrinkage was borrowed but not adopted (small gain, blurs specificity).</w:t>
             </w:r>
           </w:p>
           <w:p>
@@ -30665,6 +30834,69 @@
                 <w:sz w:val="18"/>
               </w:rPr>
               <w:t>R publication figures (6 main, 6 supplementary); novelty audit of 386 robust pairs and comparison with the SelectSim atlas; repository organised (data/ and scripts/ READMEs, notebook 07 renamed 06, MIT licence); allele screen and partner models re-run on the final data (KRAS G12C/STK11 2.00x → 1.74x after smoking adjustment; partner prediction unchanged); script 11 retired; this guide updated</w:t>
+            </w:r>
+          </w:p>
+        </w:tc>
+      </w:tr>
+      <w:tr>
+        <w:trPr>
+          <w:cantSplit w:val="true"/>
+        </w:trPr>
+        <w:tc>
+          <w:tcPr>
+            <w:tcW w:type="dxa" w:w="1928"/>
+            <w:tcMar>
+              <w:top w:w="50" w:type="dxa"/>
+              <w:left w:w="90" w:type="dxa"/>
+              <w:bottom w:w="50" w:type="dxa"/>
+              <w:right w:w="90" w:type="dxa"/>
+            </w:tcMar>
+            <w:shd w:val="clear" w:color="auto" w:fill="F4F6F9"/>
+            <w:tcBorders>
+              <w:top w:val="nil" w:sz="0" w:color="FFFFFF"/>
+              <w:left w:val="nil" w:sz="0" w:color="FFFFFF"/>
+              <w:bottom w:val="single" w:sz="4" w:color="D5DAE1"/>
+              <w:right w:val="nil" w:sz="0" w:color="FFFFFF"/>
+            </w:tcBorders>
+          </w:tcPr>
+          <w:p>
+            <w:pPr>
+              <w:spacing w:after="0"/>
+            </w:pPr>
+            <w:r>
+              <w:rPr>
+                <w:sz w:val="18"/>
+              </w:rPr>
+              <w:t>26 Oct 2026</w:t>
+            </w:r>
+          </w:p>
+        </w:tc>
+        <w:tc>
+          <w:tcPr>
+            <w:tcW w:type="dxa" w:w="7710"/>
+            <w:tcMar>
+              <w:top w:w="50" w:type="dxa"/>
+              <w:left w:w="90" w:type="dxa"/>
+              <w:bottom w:w="50" w:type="dxa"/>
+              <w:right w:w="90" w:type="dxa"/>
+            </w:tcMar>
+            <w:shd w:val="clear" w:color="auto" w:fill="F4F6F9"/>
+            <w:tcBorders>
+              <w:top w:val="nil" w:sz="0" w:color="FFFFFF"/>
+              <w:left w:val="nil" w:sz="0" w:color="FFFFFF"/>
+              <w:bottom w:val="single" w:sz="4" w:color="D5DAE1"/>
+              <w:right w:val="nil" w:sz="0" w:color="FFFFFF"/>
+            </w:tcBorders>
+          </w:tcPr>
+          <w:p>
+            <w:pPr>
+              <w:spacing w:after="0"/>
+            </w:pPr>
+            <w:r>
+              <w:rPr>
+                <w:sz w:val="18"/>
+              </w:rPr>
+              <w:t>SELECT re-implemented from its published methods and benchmarked (calibrated; best at ranking the strongest pairs); review statements about van de Haar 2019 and Scharpf 2022 checked against their full texts and corrected</w:t>
             </w:r>
           </w:p>
         </w:tc>

</xml_diff>

<commit_message>
Mutation-load confounding check (van de Haar diagnostic); precise Mina 2020 citations
- Script 21: per-gene mutation load association vs significant exclusive calls per
  method. No method shows van de Haar's strong confounding on GENIE panels; a weak
  version appears once hypermutated tumours are included, for the conditional test as
  much as Fisher, and disappears when they are analysed separately -- evidence for the
  non-hypermutated main analysis
- Mina 2020 (852 dependencies; cell-line evidence for redundancy vs synergy) cited
  precisely in the review and the onboarding guide
- Notebook 05 section 2b; README, supervisor summary, data/scripts READMEs and the
  onboarding guide (new Part 10.6) updated
</commit_message>
<xml_diff>
--- a/docs/FYP_onboarding_guide.docx
+++ b/docs/FYP_onboarding_guide.docx
@@ -10178,7 +10178,7 @@
               <w:rPr>
                 <w:sz w:val="17"/>
               </w:rPr>
-              <w:t>Co-selection is widespread (Mina; Iranzo)</w:t>
+              <w:t>Co-selection is widespread (Mina 2020: 852 dependencies in &gt;9,000 tumours, 44% co-occurring, robust to TMB; Iranzo)</w:t>
             </w:r>
           </w:p>
         </w:tc>
@@ -10298,7 +10298,7 @@
               <w:rPr>
                 <w:sz w:val="17"/>
               </w:rPr>
-              <w:t>Artefact of subtype and load (van de Haar); incompatibility (El Tekle)</w:t>
+              <w:t>Artefact of subtype and load (van de Haar); incompatibility (El Tekle); redundancy shown in cell-line knockouts (Mina 2020)</w:t>
             </w:r>
           </w:p>
         </w:tc>
@@ -25291,6 +25291,80 @@
         <w:t>The load-aware null matters for sets as it does for pairs.</w:t>
       </w:r>
     </w:p>
+    <w:p>
+      <w:pPr>
+        <w:pStyle w:val="Heading2"/>
+      </w:pPr>
+      <w:r>
+        <w:t>10.6  Mutation-load confounding: van de Haar's diagnostic</w:t>
+      </w:r>
+    </w:p>
+    <w:p>
+      <w:r>
+        <w:rPr>
+          <w:rFonts w:ascii="Menlo" w:hAnsi="Menlo" w:eastAsia="Menlo"/>
+          <w:sz w:val="18"/>
+        </w:rPr>
+        <w:t>21_mutation_load_confounding.py</w:t>
+      </w:r>
+      <w:r>
+        <w:t xml:space="preserve"> runs the check van de Haar et al. (2019) used to show that most published mutual exclusivity is confounded by mutation load. Each gene gets a mutation load association (MLA): is it altered more in low-load or high-load tumours? On exome data, every method they tested called far more exclusive pairs for low-MLA genes (correlation r = -0.60 to -0.87).</w:t>
+      </w:r>
+    </w:p>
+    <w:p>
+      <w:pPr>
+        <w:pStyle w:val="ListBullet"/>
+        <w:spacing w:after="60"/>
+      </w:pPr>
+      <w:r>
+        <w:rPr>
+          <w:b/>
+        </w:rPr>
+        <w:t xml:space="preserve">Not seen on GENIE panels in our design. </w:t>
+      </w:r>
+      <w:r>
+        <w:rPr>
+          <w:b w:val="0"/>
+        </w:rPr>
+        <w:t>With non-hypermutated tumours only, the correlation is slightly positive for every method (Fisher +0.16, DISCOVER-style +0.25, SELECT +0.13, ours +0.20).</w:t>
+      </w:r>
+    </w:p>
+    <w:p>
+      <w:pPr>
+        <w:pStyle w:val="ListBullet"/>
+        <w:spacing w:after="60"/>
+      </w:pPr>
+      <w:r>
+        <w:rPr>
+          <w:b/>
+        </w:rPr>
+        <w:t xml:space="preserve">A weak version appears once hypermutated tumours are included </w:t>
+      </w:r>
+      <w:r>
+        <w:rPr>
+          <w:b w:val="0"/>
+        </w:rPr>
+        <w:t>(Fisher -0.17, ours -0.17): our test alone does not remove it.</w:t>
+      </w:r>
+    </w:p>
+    <w:p>
+      <w:pPr>
+        <w:pStyle w:val="ListBullet"/>
+        <w:spacing w:after="60"/>
+      </w:pPr>
+      <w:r>
+        <w:rPr>
+          <w:b/>
+        </w:rPr>
+        <w:t xml:space="preserve">So the split removes it. </w:t>
+      </w:r>
+      <w:r>
+        <w:rPr>
+          <w:b w:val="0"/>
+        </w:rPr>
+        <w:t>Analysing non-hypermutated tumours separately (Prof. Wong's suggestion) is what protects against load confounding; the conditional test protects calibration. They fix different problems, which is why the design keeps both.</w:t>
+      </w:r>
+    </w:p>
     <w:tbl>
       <w:tblPr>
         <w:tblW w:type="auto" w:w="0"/>
@@ -25387,6 +25461,17 @@
               <w:rPr>
                 <w:sz w:val="20"/>
               </w:rPr>
+              <w:t>•  Mutation-load confounding (van de Haar) is removed by analysing non-hypermutated tumours separately, not by the choice of test.</w:t>
+            </w:r>
+          </w:p>
+          <w:p>
+            <w:pPr>
+              <w:spacing w:after="60"/>
+            </w:pPr>
+            <w:r>
+              <w:rPr>
+                <w:sz w:val="20"/>
+              </w:rPr>
               <w:t xml:space="preserve">All tables of this part are reproduced in </w:t>
             </w:r>
             <w:r>
@@ -25428,7 +25513,7 @@
           <w:color w:val="555B66"/>
           <w:sz w:val="17"/>
         </w:rPr>
-        <w:t xml:space="preserve"> notebooks/05_validation_and_methods.ipynb, results/logs/15-17 logs, scripts/analyses/14-18_*.py, docs/literature_review.md §7 and §10.</w:t>
+        <w:t xml:space="preserve"> notebooks/05_validation_and_methods.ipynb, results/logs/15-17 logs, scripts/analyses/14-18_*.py and 21_*.py, docs/literature_review.md §7 and §10.</w:t>
       </w:r>
     </w:p>
     <w:p>
@@ -30896,7 +30981,7 @@
               <w:rPr>
                 <w:sz w:val="18"/>
               </w:rPr>
-              <w:t>SELECT re-implemented from its published methods and benchmarked (calibrated; best at ranking the strongest pairs); review statements about van de Haar 2019 and Scharpf 2022 checked against their full texts and corrected</w:t>
+              <w:t>SELECT re-implemented from its published methods and benchmarked (calibrated; best at ranking the strongest pairs); review statements about van de Haar 2019 and Scharpf 2022 checked against their full texts and corrected; mutation-load confounding check added (script 21); Mina 2020 citations made precise</w:t>
             </w:r>
           </w:p>
         </w:tc>

</xml_diff>

<commit_message>
Mutation-load check: exact van de Haar MLA definition (STAR Methods), plus ALA
MLA = load coefficient / SE from a logistic regression of each gene on raw TMB, as in
their STAR Methods (PMC supplement S3); alteration-load variant (ALA) added. Same
conclusion: no confounding in the non-hypermutated design (r +0.07 to +0.19); weak
confounding with hypermutated tumours included, equal for Fisher and the conditional
test (r -0.24 vs -0.23).
</commit_message>
<xml_diff>
--- a/docs/FYP_onboarding_guide.docx
+++ b/docs/FYP_onboarding_guide.docx
@@ -25326,7 +25326,7 @@
         <w:rPr>
           <w:b w:val="0"/>
         </w:rPr>
-        <w:t>With non-hypermutated tumours only, the correlation is slightly positive for every method (Fisher +0.16, DISCOVER-style +0.25, SELECT +0.13, ours +0.20).</w:t>
+        <w:t>With non-hypermutated tumours only, the correlation is slightly positive for every method (Fisher +0.09, DISCOVER-style +0.19, SELECT +0.07, ours +0.13).</w:t>
       </w:r>
     </w:p>
     <w:p>
@@ -25344,7 +25344,7 @@
         <w:rPr>
           <w:b w:val="0"/>
         </w:rPr>
-        <w:t>(Fisher -0.17, ours -0.17): our test alone does not remove it.</w:t>
+        <w:t>(Fisher -0.24, ours -0.23): our test alone does not remove it.</w:t>
       </w:r>
     </w:p>
     <w:p>

</xml_diff>

<commit_message>
Stop tracking individual-level GENIE tables; update commit references
clinical_tidy, alterations_long and putative_biallelic_tsg_events are per-sample GENIE
data and are now gitignored (notebook 01 rebuilds them); they and an older per-sample
table were removed from the repository history, and GENIE IDs in old notebook outputs
were redacted. Commit hashes cited in the docs updated to the rewritten history.
</commit_message>
<xml_diff>
--- a/docs/FYP_onboarding_guide.docx
+++ b/docs/FYP_onboarding_guide.docx
@@ -3276,7 +3276,7 @@
           <w:color w:val="555B66"/>
           <w:sz w:val="17"/>
         </w:rPr>
-        <w:t xml:space="preserve"> README.md, docs/supervisor_summary.md, the original PLAN.md (deleted 24 Oct; in git history, commit 92e8234).</w:t>
+        <w:t xml:space="preserve"> README.md, docs/supervisor_summary.md, the original PLAN.md (deleted 24 Oct; in git history, commit 7009281).</w:t>
       </w:r>
     </w:p>
     <w:p>
@@ -5003,7 +5003,7 @@
           <w:color w:val="555B66"/>
           <w:sz w:val="17"/>
         </w:rPr>
-        <w:t xml:space="preserve"> docs/literature_review.md §1, README.md, the original PLAN.md (git history, commit 92e8234).</w:t>
+        <w:t xml:space="preserve"> docs/literature_review.md §1, README.md, the original PLAN.md (git history, commit 7009281).</w:t>
       </w:r>
     </w:p>
     <w:p>
@@ -12884,7 +12884,7 @@
           <w:color w:val="555B66"/>
           <w:sz w:val="17"/>
         </w:rPr>
-        <w:t xml:space="preserve"> README.md (Problems found in the GENIE data), the original PLAN.md data inventory (git history, commit 92e8234), docs/supervisor_summary.md.</w:t>
+        <w:t xml:space="preserve"> README.md (Problems found in the GENIE data), the original PLAN.md data inventory (git history, commit 7009281), docs/supervisor_summary.md.</w:t>
       </w:r>
     </w:p>
     <w:p>
@@ -13571,7 +13571,7 @@
           <w:color w:val="555B66"/>
           <w:sz w:val="17"/>
         </w:rPr>
-        <w:t xml:space="preserve"> README.md (Project aims; Registered project description), the original PLAN.md (git history, commit 92e8234) for the supervisor's brief.</w:t>
+        <w:t xml:space="preserve"> README.md (Project aims; Registered project description), the original PLAN.md (git history, commit 7009281) for the supervisor's brief.</w:t>
       </w:r>
     </w:p>
     <w:p>
@@ -22499,7 +22499,7 @@
           <w:color w:val="555B66"/>
           <w:sz w:val="17"/>
         </w:rPr>
-        <w:t>Source files for this part: notebooks/04_phase4_insight.ipynb; git commits d040be9 and 507ace8; scripts/analyses/12_burden_adjusted_retest.py (script 11, the first check, is retired); scripts/analyses/19_novelty_screen.py and 20_candidate_followup.py; scripts/figures/ and results/figures/.</w:t>
+        <w:t>Source files for this part: notebooks/04_phase4_insight.ipynb; git commits 64e98aa and f7eb0cd; scripts/analyses/12_burden_adjusted_retest.py (script 11, the first check, is retired); scripts/analyses/19_novelty_screen.py and 20_candidate_followup.py; scripts/figures/ and results/figures/.</w:t>
       </w:r>
     </w:p>
     <w:p>
@@ -27209,7 +27209,7 @@
                 <w:rFonts w:ascii="Menlo" w:hAnsi="Menlo" w:eastAsia="Menlo"/>
                 <w:sz w:val="20"/>
               </w:rPr>
-              <w:t>92e8234</w:t>
+              <w:t>7009281</w:t>
             </w:r>
             <w:r>
               <w:rPr>
@@ -30731,7 +30731,7 @@
               <w:rPr>
                 <w:sz w:val="18"/>
               </w:rPr>
-              <w:t>Notebooks 01-04 re-run end to end with fusions; benchmark and gene-set scripts finish; commit 10a5c99 (fusions, burden sensitivity, TCGA validation, benchmark)</w:t>
+              <w:t>Notebooks 01-04 re-run end to end with fusions; benchmark and gene-set scripts finish; commit 7811201 (fusions, burden sensitivity, TCGA validation, benchmark)</w:t>
             </w:r>
           </w:p>
         </w:tc>
@@ -30792,7 +30792,7 @@
               <w:rPr>
                 <w:sz w:val="18"/>
               </w:rPr>
-              <w:t>Notebook 05 added to collect all validation results (commit 92e8234)</w:t>
+              <w:t>Notebook 05 added to collect all validation results (commit 7009281)</w:t>
             </w:r>
           </w:p>
         </w:tc>

</xml_diff>

<commit_message>
Onboarding guide: what's-new box, current status and decisions, glossary for new terms
</commit_message>
<xml_diff>
--- a/docs/FYP_onboarding_guide.docx
+++ b/docs/FYP_onboarding_guide.docx
@@ -291,7 +291,7 @@
               <w:rPr>
                 <w:sz w:val="20"/>
               </w:rPr>
-              <w:t>25 October 2026 (adds R figures, a novelty screen and a comparison with the SelectSim atlas)</w:t>
+              <w:t>27 October 2026 (latest additions listed in the box below)</w:t>
             </w:r>
           </w:p>
         </w:tc>
@@ -417,7 +417,7 @@
               <w:rPr>
                 <w:sz w:val="20"/>
               </w:rPr>
-              <w:t>Everything has finished running and is committed (including the 25 Oct additions). Numbers in this guide match the final outputs. Open items are listed in Part 11.</w:t>
+              <w:t>Development paused for reading. Everything has run and is committed; numbers in this guide match the final outputs. Open items are in Part 11; repository improvements are scheduled for November.</w:t>
             </w:r>
           </w:p>
         </w:tc>
@@ -2095,6 +2095,168 @@
                 <w:sz w:val="20"/>
               </w:rPr>
               <w:t xml:space="preserve"> Parts 8-11 (the tool, the biology, the status).  Part 12 is a reference.</w:t>
+            </w:r>
+          </w:p>
+        </w:tc>
+      </w:tr>
+    </w:tbl>
+    <w:p/>
+    <w:tbl>
+      <w:tblPr>
+        <w:tblW w:type="auto" w:w="0"/>
+        <w:jc w:val="center"/>
+        <w:tblLook w:firstColumn="1" w:firstRow="1" w:lastColumn="0" w:lastRow="0" w:noHBand="0" w:noVBand="1" w:val="04A0"/>
+        <w:tblLayout w:type="fixed"/>
+      </w:tblPr>
+      <w:tblGrid>
+        <w:gridCol w:w="9639"/>
+      </w:tblGrid>
+      <w:tr>
+        <w:trPr>
+          <w:cantSplit w:val="true"/>
+        </w:trPr>
+        <w:tc>
+          <w:tcPr>
+            <w:tcW w:type="dxa" w:w="9638"/>
+            <w:shd w:val="clear" w:color="auto" w:fill="EAF3F5"/>
+            <w:tcMar>
+              <w:top w:w="110" w:type="dxa"/>
+              <w:left w:w="200" w:type="dxa"/>
+              <w:bottom w:w="110" w:type="dxa"/>
+              <w:right w:w="160" w:type="dxa"/>
+            </w:tcMar>
+            <w:tcBorders>
+              <w:top w:val="nil" w:sz="0" w:color="FFFFFF"/>
+              <w:left w:val="single" w:sz="24" w:color="2A7F8E"/>
+              <w:bottom w:val="nil" w:sz="0" w:color="FFFFFF"/>
+              <w:right w:val="nil" w:sz="0" w:color="FFFFFF"/>
+            </w:tcBorders>
+          </w:tcPr>
+          <w:p>
+            <w:pPr>
+              <w:spacing w:after="40"/>
+            </w:pPr>
+            <w:r>
+              <w:rPr>
+                <w:b/>
+                <w:color w:val="2A7F8E"/>
+                <w:sz w:val="21"/>
+              </w:rPr>
+              <w:t>What's new since the first version (24 Oct)</w:t>
+            </w:r>
+          </w:p>
+          <w:p>
+            <w:pPr>
+              <w:spacing w:after="60"/>
+            </w:pPr>
+            <w:r>
+              <w:rPr>
+                <w:b/>
+                <w:sz w:val="20"/>
+              </w:rPr>
+              <w:t>•  Part 3:</w:t>
+            </w:r>
+            <w:r>
+              <w:rPr>
+                <w:b w:val="0"/>
+                <w:sz w:val="20"/>
+              </w:rPr>
+              <w:t xml:space="preserve"> the closest recent atlas, SelectSim (Nature Genetics 2026), and corrected descriptions of van de Haar 2019 and Scharpf 2022 (checked against their full texts).</w:t>
+            </w:r>
+          </w:p>
+          <w:p>
+            <w:pPr>
+              <w:spacing w:after="60"/>
+            </w:pPr>
+            <w:r>
+              <w:rPr>
+                <w:b/>
+                <w:sz w:val="20"/>
+              </w:rPr>
+              <w:t>•  Part 9.3:</w:t>
+            </w:r>
+            <w:r>
+              <w:rPr>
+                <w:b w:val="0"/>
+                <w:sz w:val="20"/>
+              </w:rPr>
+              <w:t xml:space="preserve"> a novelty audit -- is anything here new? (short answer: not at the driver-pair level; the distinct contribution is elsewhere).</w:t>
+            </w:r>
+          </w:p>
+          <w:p>
+            <w:pPr>
+              <w:spacing w:after="60"/>
+            </w:pPr>
+            <w:r>
+              <w:rPr>
+                <w:b/>
+                <w:sz w:val="20"/>
+              </w:rPr>
+              <w:t>•  Part 9.4:</w:t>
+            </w:r>
+            <w:r>
+              <w:rPr>
+                <w:b w:val="0"/>
+                <w:sz w:val="20"/>
+              </w:rPr>
+              <w:t xml:space="preserve"> the publication figures, also shown inside each notebook.</w:t>
+            </w:r>
+          </w:p>
+          <w:p>
+            <w:pPr>
+              <w:spacing w:after="60"/>
+            </w:pPr>
+            <w:r>
+              <w:rPr>
+                <w:b/>
+                <w:sz w:val="20"/>
+              </w:rPr>
+              <w:t>•  Part 10.4:</w:t>
+            </w:r>
+            <w:r>
+              <w:rPr>
+                <w:b w:val="0"/>
+                <w:sz w:val="20"/>
+              </w:rPr>
+              <w:t xml:space="preserve"> SELECT re-implemented from its published methods and added to the benchmark.</w:t>
+            </w:r>
+          </w:p>
+          <w:p>
+            <w:pPr>
+              <w:spacing w:after="60"/>
+            </w:pPr>
+            <w:r>
+              <w:rPr>
+                <w:b/>
+                <w:sz w:val="20"/>
+              </w:rPr>
+              <w:t>•  Part 10.6:</w:t>
+            </w:r>
+            <w:r>
+              <w:rPr>
+                <w:b w:val="0"/>
+                <w:sz w:val="20"/>
+              </w:rPr>
+              <w:t xml:space="preserve"> van de Haar's mutation-load confounding check -- why the non-hypermutated split matters.</w:t>
+            </w:r>
+          </w:p>
+          <w:p>
+            <w:pPr>
+              <w:spacing w:after="60"/>
+            </w:pPr>
+            <w:r>
+              <w:rPr>
+                <w:b/>
+                <w:sz w:val="20"/>
+              </w:rPr>
+              <w:t>•  Parts 11-12:</w:t>
+            </w:r>
+            <w:r>
+              <w:rPr>
+                <w:b w:val="0"/>
+                <w:sz w:val="20"/>
+              </w:rPr>
+              <w:t xml:space="preserve"> status, decisions, the November plan, the repository map, and the removal of individual-level GENIE data from the public repository (27 Oct).</w:t>
             </w:r>
           </w:p>
         </w:tc>
@@ -26290,14 +26452,13 @@
               <w:rPr>
                 <w:sz w:val="18"/>
               </w:rPr>
-              <w:t xml:space="preserve">Results in Part 10; logs in </w:t>
+              <w:t>SELECT re-implemented from its methods (26 Oct); results in Part 10</w:t>
             </w:r>
             <w:r>
               <w:rPr>
                 <w:rFonts w:ascii="Menlo" w:hAnsi="Menlo" w:eastAsia="Menlo"/>
                 <w:sz w:val="18"/>
               </w:rPr>
-              <w:t>results/logs/</w:t>
             </w:r>
           </w:p>
         </w:tc>
@@ -26390,7 +26551,7 @@
               <w:rPr>
                 <w:sz w:val="18"/>
               </w:rPr>
-              <w:t>Placeholders filled; 41 references</w:t>
+              <w:t>42 references; key papers checked against full text (26 Oct)</w:t>
             </w:r>
           </w:p>
         </w:tc>
@@ -26641,6 +26802,7 @@
             </w:pPr>
             <w:r>
               <w:rPr>
+                <w:b/>
                 <w:sz w:val="18"/>
               </w:rPr>
               <w:t>Done</w:t>
@@ -26670,7 +26832,6 @@
             </w:pPr>
             <w:r>
               <w:rPr>
-                <w:rFonts w:ascii="Menlo" w:hAnsi="Menlo" w:eastAsia="Menlo"/>
                 <w:sz w:val="18"/>
               </w:rPr>
               <w:t>6 main + 6 supplementary; rebuilt by scripts/figures/run_all.sh</w:t>
@@ -26734,6 +26895,7 @@
             </w:pPr>
             <w:r>
               <w:rPr>
+                <w:b/>
                 <w:sz w:val="18"/>
               </w:rPr>
               <w:t>Done</w:t>
@@ -26763,10 +26925,288 @@
             </w:pPr>
             <w:r>
               <w:rPr>
-                <w:rFonts w:ascii="Menlo" w:hAnsi="Menlo" w:eastAsia="Menlo"/>
                 <w:sz w:val="18"/>
               </w:rPr>
               <w:t>No new driver pair survives; full agreement in direction with SelectSim</w:t>
+            </w:r>
+          </w:p>
+        </w:tc>
+      </w:tr>
+      <w:tr>
+        <w:trPr>
+          <w:cantSplit w:val="true"/>
+        </w:trPr>
+        <w:tc>
+          <w:tcPr>
+            <w:tcW w:type="dxa" w:w="3175"/>
+            <w:tcMar>
+              <w:top w:w="50" w:type="dxa"/>
+              <w:left w:w="90" w:type="dxa"/>
+              <w:bottom w:w="50" w:type="dxa"/>
+              <w:right w:w="90" w:type="dxa"/>
+            </w:tcMar>
+            <w:shd w:val="clear" w:color="auto" w:fill="F4F6F9"/>
+            <w:tcBorders>
+              <w:top w:val="nil" w:sz="0" w:color="FFFFFF"/>
+              <w:left w:val="nil" w:sz="0" w:color="FFFFFF"/>
+              <w:bottom w:val="single" w:sz="4" w:color="D5DAE1"/>
+              <w:right w:val="nil" w:sz="0" w:color="FFFFFF"/>
+            </w:tcBorders>
+          </w:tcPr>
+          <w:p>
+            <w:pPr>
+              <w:spacing w:after="0"/>
+            </w:pPr>
+            <w:r>
+              <w:rPr>
+                <w:sz w:val="18"/>
+              </w:rPr>
+              <w:t>Mutation-load check (21)</w:t>
+            </w:r>
+          </w:p>
+        </w:tc>
+        <w:tc>
+          <w:tcPr>
+            <w:tcW w:type="dxa" w:w="2268"/>
+            <w:tcMar>
+              <w:top w:w="50" w:type="dxa"/>
+              <w:left w:w="90" w:type="dxa"/>
+              <w:bottom w:w="50" w:type="dxa"/>
+              <w:right w:w="90" w:type="dxa"/>
+            </w:tcMar>
+            <w:shd w:val="clear" w:color="auto" w:fill="F4F6F9"/>
+            <w:tcBorders>
+              <w:top w:val="nil" w:sz="0" w:color="FFFFFF"/>
+              <w:left w:val="nil" w:sz="0" w:color="FFFFFF"/>
+              <w:bottom w:val="single" w:sz="4" w:color="D5DAE1"/>
+              <w:right w:val="nil" w:sz="0" w:color="FFFFFF"/>
+            </w:tcBorders>
+          </w:tcPr>
+          <w:p>
+            <w:pPr>
+              <w:spacing w:after="0"/>
+            </w:pPr>
+            <w:r>
+              <w:rPr>
+                <w:b/>
+                <w:sz w:val="18"/>
+              </w:rPr>
+              <w:t>Done</w:t>
+            </w:r>
+          </w:p>
+        </w:tc>
+        <w:tc>
+          <w:tcPr>
+            <w:tcW w:type="dxa" w:w="4195"/>
+            <w:tcMar>
+              <w:top w:w="50" w:type="dxa"/>
+              <w:left w:w="90" w:type="dxa"/>
+              <w:bottom w:w="50" w:type="dxa"/>
+              <w:right w:w="90" w:type="dxa"/>
+            </w:tcMar>
+            <w:shd w:val="clear" w:color="auto" w:fill="F4F6F9"/>
+            <w:tcBorders>
+              <w:top w:val="nil" w:sz="0" w:color="FFFFFF"/>
+              <w:left w:val="nil" w:sz="0" w:color="FFFFFF"/>
+              <w:bottom w:val="single" w:sz="4" w:color="D5DAE1"/>
+              <w:right w:val="nil" w:sz="0" w:color="FFFFFF"/>
+            </w:tcBorders>
+          </w:tcPr>
+          <w:p>
+            <w:pPr>
+              <w:spacing w:after="0"/>
+            </w:pPr>
+            <w:r>
+              <w:rPr>
+                <w:sz w:val="18"/>
+              </w:rPr>
+              <w:t>No load confounding in the non-hypermutated design (Part 10.6)</w:t>
+            </w:r>
+          </w:p>
+        </w:tc>
+      </w:tr>
+      <w:tr>
+        <w:trPr>
+          <w:cantSplit w:val="true"/>
+        </w:trPr>
+        <w:tc>
+          <w:tcPr>
+            <w:tcW w:type="dxa" w:w="3175"/>
+            <w:tcMar>
+              <w:top w:w="50" w:type="dxa"/>
+              <w:left w:w="90" w:type="dxa"/>
+              <w:bottom w:w="50" w:type="dxa"/>
+              <w:right w:w="90" w:type="dxa"/>
+            </w:tcMar>
+            <w:shd w:val="clear" w:color="auto" w:fill="F4F6F9"/>
+            <w:tcBorders>
+              <w:top w:val="nil" w:sz="0" w:color="FFFFFF"/>
+              <w:left w:val="nil" w:sz="0" w:color="FFFFFF"/>
+              <w:bottom w:val="single" w:sz="4" w:color="D5DAE1"/>
+              <w:right w:val="nil" w:sz="0" w:color="FFFFFF"/>
+            </w:tcBorders>
+          </w:tcPr>
+          <w:p>
+            <w:pPr>
+              <w:spacing w:after="0"/>
+            </w:pPr>
+            <w:r>
+              <w:rPr>
+                <w:sz w:val="18"/>
+              </w:rPr>
+              <w:t>Data privacy</w:t>
+            </w:r>
+          </w:p>
+        </w:tc>
+        <w:tc>
+          <w:tcPr>
+            <w:tcW w:type="dxa" w:w="2268"/>
+            <w:tcMar>
+              <w:top w:w="50" w:type="dxa"/>
+              <w:left w:w="90" w:type="dxa"/>
+              <w:bottom w:w="50" w:type="dxa"/>
+              <w:right w:w="90" w:type="dxa"/>
+            </w:tcMar>
+            <w:shd w:val="clear" w:color="auto" w:fill="F4F6F9"/>
+            <w:tcBorders>
+              <w:top w:val="nil" w:sz="0" w:color="FFFFFF"/>
+              <w:left w:val="nil" w:sz="0" w:color="FFFFFF"/>
+              <w:bottom w:val="single" w:sz="4" w:color="D5DAE1"/>
+              <w:right w:val="nil" w:sz="0" w:color="FFFFFF"/>
+            </w:tcBorders>
+          </w:tcPr>
+          <w:p>
+            <w:pPr>
+              <w:spacing w:after="0"/>
+            </w:pPr>
+            <w:r>
+              <w:rPr>
+                <w:b/>
+                <w:sz w:val="18"/>
+              </w:rPr>
+              <w:t>Fixed 27 Oct</w:t>
+            </w:r>
+          </w:p>
+        </w:tc>
+        <w:tc>
+          <w:tcPr>
+            <w:tcW w:type="dxa" w:w="4195"/>
+            <w:tcMar>
+              <w:top w:w="50" w:type="dxa"/>
+              <w:left w:w="90" w:type="dxa"/>
+              <w:bottom w:w="50" w:type="dxa"/>
+              <w:right w:w="90" w:type="dxa"/>
+            </w:tcMar>
+            <w:shd w:val="clear" w:color="auto" w:fill="F4F6F9"/>
+            <w:tcBorders>
+              <w:top w:val="nil" w:sz="0" w:color="FFFFFF"/>
+              <w:left w:val="nil" w:sz="0" w:color="FFFFFF"/>
+              <w:bottom w:val="single" w:sz="4" w:color="D5DAE1"/>
+              <w:right w:val="nil" w:sz="0" w:color="FFFFFF"/>
+            </w:tcBorders>
+          </w:tcPr>
+          <w:p>
+            <w:pPr>
+              <w:spacing w:after="0"/>
+            </w:pPr>
+            <w:r>
+              <w:rPr>
+                <w:sz w:val="18"/>
+              </w:rPr>
+              <w:t>Individual-level GENIE tables and patient IDs removed from the public repository and its history</w:t>
+            </w:r>
+          </w:p>
+        </w:tc>
+      </w:tr>
+      <w:tr>
+        <w:trPr>
+          <w:cantSplit w:val="true"/>
+        </w:trPr>
+        <w:tc>
+          <w:tcPr>
+            <w:tcW w:type="dxa" w:w="3175"/>
+            <w:tcMar>
+              <w:top w:w="50" w:type="dxa"/>
+              <w:left w:w="90" w:type="dxa"/>
+              <w:bottom w:w="50" w:type="dxa"/>
+              <w:right w:w="90" w:type="dxa"/>
+            </w:tcMar>
+            <w:shd w:val="clear" w:color="auto" w:fill="F4F6F9"/>
+            <w:tcBorders>
+              <w:top w:val="nil" w:sz="0" w:color="FFFFFF"/>
+              <w:left w:val="nil" w:sz="0" w:color="FFFFFF"/>
+              <w:bottom w:val="single" w:sz="4" w:color="D5DAE1"/>
+              <w:right w:val="nil" w:sz="0" w:color="FFFFFF"/>
+            </w:tcBorders>
+          </w:tcPr>
+          <w:p>
+            <w:pPr>
+              <w:spacing w:after="0"/>
+            </w:pPr>
+            <w:r>
+              <w:rPr>
+                <w:sz w:val="18"/>
+              </w:rPr>
+              <w:t>Repository improvements</w:t>
+            </w:r>
+          </w:p>
+        </w:tc>
+        <w:tc>
+          <w:tcPr>
+            <w:tcW w:type="dxa" w:w="2268"/>
+            <w:tcMar>
+              <w:top w:w="50" w:type="dxa"/>
+              <w:left w:w="90" w:type="dxa"/>
+              <w:bottom w:w="50" w:type="dxa"/>
+              <w:right w:w="90" w:type="dxa"/>
+            </w:tcMar>
+            <w:shd w:val="clear" w:color="auto" w:fill="F4F6F9"/>
+            <w:tcBorders>
+              <w:top w:val="nil" w:sz="0" w:color="FFFFFF"/>
+              <w:left w:val="nil" w:sz="0" w:color="FFFFFF"/>
+              <w:bottom w:val="single" w:sz="4" w:color="D5DAE1"/>
+              <w:right w:val="nil" w:sz="0" w:color="FFFFFF"/>
+            </w:tcBorders>
+          </w:tcPr>
+          <w:p>
+            <w:pPr>
+              <w:spacing w:after="0"/>
+            </w:pPr>
+            <w:r>
+              <w:rPr>
+                <w:b/>
+                <w:sz w:val="18"/>
+              </w:rPr>
+              <w:t>Planned, November</w:t>
+            </w:r>
+          </w:p>
+        </w:tc>
+        <w:tc>
+          <w:tcPr>
+            <w:tcW w:type="dxa" w:w="4195"/>
+            <w:tcMar>
+              <w:top w:w="50" w:type="dxa"/>
+              <w:left w:w="90" w:type="dxa"/>
+              <w:bottom w:w="50" w:type="dxa"/>
+              <w:right w:w="90" w:type="dxa"/>
+            </w:tcMar>
+            <w:shd w:val="clear" w:color="auto" w:fill="F4F6F9"/>
+            <w:tcBorders>
+              <w:top w:val="nil" w:sz="0" w:color="FFFFFF"/>
+              <w:left w:val="nil" w:sz="0" w:color="FFFFFF"/>
+              <w:bottom w:val="single" w:sz="4" w:color="D5DAE1"/>
+              <w:right w:val="nil" w:sz="0" w:color="FFFFFF"/>
+            </w:tcBorders>
+          </w:tcPr>
+          <w:p>
+            <w:pPr>
+              <w:spacing w:after="0"/>
+            </w:pPr>
+            <w:r>
+              <w:rPr>
+                <w:sz w:val="18"/>
+              </w:rPr>
+              <w:t>Tests, automatic checks, Phase 2 functions as a module, shorter README, release tag</w:t>
             </w:r>
           </w:p>
         </w:tc>
@@ -26798,10 +27238,35 @@
         <w:rPr>
           <w:b/>
         </w:rPr>
+        <w:t>Positioning against SelectSim</w:t>
+      </w:r>
+      <w:r>
+        <w:rPr>
+          <w:b w:val="0"/>
+        </w:rPr>
+        <w:t xml:space="preserve"> (Nature Genetics 2026), which covers mutation-driven pairs in MSK and DFCI: should the thesis lead with what it does not cover -- copy-number and fusion partners, all-centre panel-aware statistics, artefact audits and the tool?</w:t>
+      </w:r>
+    </w:p>
+    <w:p>
+      <w:pPr>
+        <w:pStyle w:val="ListNumber"/>
+        <w:spacing w:after="60"/>
+        <w:numPr>
+          <w:ilvl w:val="0"/>
+          <w:numId w:val="12"/>
+        </w:numPr>
+      </w:pPr>
+      <w:r>
+        <w:rPr>
+          <w:b/>
+        </w:rPr>
         <w:t>Main analysis = non-hypermutated patients.</w:t>
       </w:r>
       <w:r>
-        <w:t xml:space="preserve"> Agree that hypermutated tumours are reported descriptively only?</w:t>
+        <w:rPr>
+          <w:b w:val="0"/>
+        </w:rPr>
+        <w:t xml:space="preserve"> Agree that hypermutated tumours are reported descriptively only? (Replication and the mutation-load check both support it.)</w:t>
       </w:r>
     </w:p>
     <w:p>
@@ -27266,6 +27731,28 @@
               <w:t>•  Notebook 07 (the Phase 2 deep dive) was renamed 06 on 25 Oct so the run order has no gap; older notes and commits call it 07.</w:t>
             </w:r>
           </w:p>
+          <w:p>
+            <w:pPr>
+              <w:spacing w:after="60"/>
+            </w:pPr>
+            <w:r>
+              <w:rPr>
+                <w:sz w:val="20"/>
+              </w:rPr>
+              <w:t>•  A first, simplified “SELECT-style” score was withdrawn on 26 Oct because it was not SELECT; the benchmark now uses a faithful re-implementation (Part 10.4).</w:t>
+            </w:r>
+          </w:p>
+          <w:p>
+            <w:pPr>
+              <w:spacing w:after="60"/>
+            </w:pPr>
+            <w:r>
+              <w:rPr>
+                <w:sz w:val="20"/>
+              </w:rPr>
+              <w:t>•  The repository history was rewritten on 27 Oct to remove individual-level GENIE data, so every commit hash changed; notes written before then cite the old hashes.</w:t>
+            </w:r>
+          </w:p>
         </w:tc>
       </w:tr>
     </w:tbl>
@@ -27292,7 +27779,7 @@
         </w:numPr>
       </w:pPr>
       <w:r>
-        <w:t>Supervisor review of the v3 design, fusions and the Phase 3-4 results; the five decisions above.</w:t>
+        <w:t>Supervisor review of the v3 design, fusions and the Phase 3-4 results; the six decisions above.</w:t>
       </w:r>
     </w:p>
     <w:p>
@@ -27345,6 +27832,19 @@
         </w:numPr>
       </w:pPr>
       <w:r>
+        <w:t>November: repository improvements as small weekly commits (tests, automatic checks, Phase 2 functions moved into a module, README quick start, release tag at submission).</w:t>
+      </w:r>
+    </w:p>
+    <w:p>
+      <w:pPr>
+        <w:pStyle w:val="ListNumber"/>
+        <w:spacing w:after="60"/>
+        <w:numPr>
+          <w:ilvl w:val="0"/>
+          <w:numId w:val="13"/>
+        </w:numPr>
+      </w:pPr>
+      <w:r>
         <w:t>Optional: external replication in MSK-MET, and GENIE BPC for outcomes.</w:t>
       </w:r>
     </w:p>
@@ -27358,14 +27858,13 @@
           <w:color w:val="555B66"/>
           <w:sz w:val="17"/>
         </w:rPr>
-        <w:t>Source files for this part:</w:t>
+        <w:t>Source files for this part: README.md (Status), docs/supervisor_summary.md, git log and status of 27 Oct 2026, results/logs/.</w:t>
       </w:r>
       <w:r>
         <w:rPr>
           <w:color w:val="555B66"/>
           <w:sz w:val="17"/>
         </w:rPr>
-        <w:t xml:space="preserve"> README.md (Status), docs/supervisor_summary.md, git log and status of 24 Oct 2026, results/logs/.</w:t>
       </w:r>
     </w:p>
     <w:p>
@@ -28012,7 +28511,7 @@
               <w:rPr>
                 <w:sz w:val="18"/>
               </w:rPr>
-              <w:t>Cleaned outputs produced by the notebooks (tracked)</w:t>
+              <w:t>Tables produced by the notebooks and scripts; aggregate tables are tracked, individual-level ones (clinical_tidy, alterations_long, putative_biallelic_tsg_events) are not</w:t>
             </w:r>
           </w:p>
         </w:tc>
@@ -30158,6 +30657,699 @@
           </w:p>
         </w:tc>
       </w:tr>
+      <w:tr>
+        <w:trPr>
+          <w:cantSplit w:val="true"/>
+        </w:trPr>
+        <w:tc>
+          <w:tcPr>
+            <w:tcW w:type="dxa" w:w="2608"/>
+            <w:tcMar>
+              <w:top w:w="50" w:type="dxa"/>
+              <w:left w:w="90" w:type="dxa"/>
+              <w:bottom w:w="50" w:type="dxa"/>
+              <w:right w:w="90" w:type="dxa"/>
+            </w:tcMar>
+            <w:shd w:val="clear" w:color="auto" w:fill="F4F6F9"/>
+            <w:tcBorders>
+              <w:top w:val="nil" w:sz="0" w:color="FFFFFF"/>
+              <w:left w:val="nil" w:sz="0" w:color="FFFFFF"/>
+              <w:bottom w:val="single" w:sz="4" w:color="D5DAE1"/>
+              <w:right w:val="nil" w:sz="0" w:color="FFFFFF"/>
+            </w:tcBorders>
+          </w:tcPr>
+          <w:p>
+            <w:pPr>
+              <w:spacing w:after="0"/>
+            </w:pPr>
+            <w:r>
+              <w:rPr>
+                <w:sz w:val="18"/>
+              </w:rPr>
+              <w:t>hypermutated / ultramutated</w:t>
+            </w:r>
+          </w:p>
+        </w:tc>
+        <w:tc>
+          <w:tcPr>
+            <w:tcW w:type="dxa" w:w="7030"/>
+            <w:tcMar>
+              <w:top w:w="50" w:type="dxa"/>
+              <w:left w:w="90" w:type="dxa"/>
+              <w:bottom w:w="50" w:type="dxa"/>
+              <w:right w:w="90" w:type="dxa"/>
+            </w:tcMar>
+            <w:shd w:val="clear" w:color="auto" w:fill="F4F6F9"/>
+            <w:tcBorders>
+              <w:top w:val="nil" w:sz="0" w:color="FFFFFF"/>
+              <w:left w:val="nil" w:sz="0" w:color="FFFFFF"/>
+              <w:bottom w:val="single" w:sz="4" w:color="D5DAE1"/>
+              <w:right w:val="nil" w:sz="0" w:color="FFFFFF"/>
+            </w:tcBorders>
+          </w:tcPr>
+          <w:p>
+            <w:pPr>
+              <w:spacing w:after="0"/>
+            </w:pPr>
+            <w:r>
+              <w:rPr>
+                <w:sz w:val="18"/>
+              </w:rPr>
+              <w:t>TMB 10-100 / TMB &gt;= 100 mutations per million DNA letters (usually mismatch-repair or POLE defects); analysed separately / excluded</w:t>
+            </w:r>
+          </w:p>
+        </w:tc>
+      </w:tr>
+      <w:tr>
+        <w:trPr>
+          <w:cantSplit w:val="true"/>
+        </w:trPr>
+        <w:tc>
+          <w:tcPr>
+            <w:tcW w:type="dxa" w:w="2608"/>
+            <w:tcMar>
+              <w:top w:w="50" w:type="dxa"/>
+              <w:left w:w="90" w:type="dxa"/>
+              <w:bottom w:w="50" w:type="dxa"/>
+              <w:right w:w="90" w:type="dxa"/>
+            </w:tcMar>
+            <w:shd w:val="clear" w:color="auto" w:fill="F4F6F9"/>
+            <w:tcBorders>
+              <w:top w:val="nil" w:sz="0" w:color="FFFFFF"/>
+              <w:left w:val="nil" w:sz="0" w:color="FFFFFF"/>
+              <w:bottom w:val="single" w:sz="4" w:color="D5DAE1"/>
+              <w:right w:val="nil" w:sz="0" w:color="FFFFFF"/>
+            </w:tcBorders>
+          </w:tcPr>
+          <w:p>
+            <w:pPr>
+              <w:spacing w:after="0"/>
+            </w:pPr>
+            <w:r>
+              <w:rPr>
+                <w:sz w:val="18"/>
+              </w:rPr>
+              <w:t>interaction candidate</w:t>
+            </w:r>
+          </w:p>
+        </w:tc>
+        <w:tc>
+          <w:tcPr>
+            <w:tcW w:type="dxa" w:w="7030"/>
+            <w:tcMar>
+              <w:top w:w="50" w:type="dxa"/>
+              <w:left w:w="90" w:type="dxa"/>
+              <w:bottom w:w="50" w:type="dxa"/>
+              <w:right w:w="90" w:type="dxa"/>
+            </w:tcMar>
+            <w:shd w:val="clear" w:color="auto" w:fill="F4F6F9"/>
+            <w:tcBorders>
+              <w:top w:val="nil" w:sz="0" w:color="FFFFFF"/>
+              <w:left w:val="nil" w:sz="0" w:color="FFFFFF"/>
+              <w:bottom w:val="single" w:sz="4" w:color="D5DAE1"/>
+              <w:right w:val="nil" w:sz="0" w:color="FFFFFF"/>
+            </w:tcBorders>
+          </w:tcPr>
+          <w:p>
+            <w:pPr>
+              <w:spacing w:after="0"/>
+            </w:pPr>
+            <w:r>
+              <w:rPr>
+                <w:sz w:val="18"/>
+              </w:rPr>
+              <w:t>A significant pair (q &lt; 0.05) that is not explained by one shared copy-number event</w:t>
+            </w:r>
+          </w:p>
+        </w:tc>
+      </w:tr>
+      <w:tr>
+        <w:trPr>
+          <w:cantSplit w:val="true"/>
+        </w:trPr>
+        <w:tc>
+          <w:tcPr>
+            <w:tcW w:type="dxa" w:w="2608"/>
+            <w:tcMar>
+              <w:top w:w="50" w:type="dxa"/>
+              <w:left w:w="90" w:type="dxa"/>
+              <w:bottom w:w="50" w:type="dxa"/>
+              <w:right w:w="90" w:type="dxa"/>
+            </w:tcMar>
+            <w:shd w:val="clear" w:color="auto" w:fill="F4F6F9"/>
+            <w:tcBorders>
+              <w:top w:val="nil" w:sz="0" w:color="FFFFFF"/>
+              <w:left w:val="nil" w:sz="0" w:color="FFFFFF"/>
+              <w:bottom w:val="single" w:sz="4" w:color="D5DAE1"/>
+              <w:right w:val="nil" w:sz="0" w:color="FFFFFF"/>
+            </w:tcBorders>
+          </w:tcPr>
+          <w:p>
+            <w:pPr>
+              <w:spacing w:after="0"/>
+            </w:pPr>
+            <w:r>
+              <w:rPr>
+                <w:sz w:val="18"/>
+              </w:rPr>
+              <w:t>curveball shuffle</w:t>
+            </w:r>
+          </w:p>
+        </w:tc>
+        <w:tc>
+          <w:tcPr>
+            <w:tcW w:type="dxa" w:w="7030"/>
+            <w:tcMar>
+              <w:top w:w="50" w:type="dxa"/>
+              <w:left w:w="90" w:type="dxa"/>
+              <w:bottom w:w="50" w:type="dxa"/>
+              <w:right w:w="90" w:type="dxa"/>
+            </w:tcMar>
+            <w:shd w:val="clear" w:color="auto" w:fill="F4F6F9"/>
+            <w:tcBorders>
+              <w:top w:val="nil" w:sz="0" w:color="FFFFFF"/>
+              <w:left w:val="nil" w:sz="0" w:color="FFFFFF"/>
+              <w:bottom w:val="single" w:sz="4" w:color="D5DAE1"/>
+              <w:right w:val="nil" w:sz="0" w:color="FFFFFF"/>
+            </w:tcBorders>
+          </w:tcPr>
+          <w:p>
+            <w:pPr>
+              <w:spacing w:after="0"/>
+            </w:pPr>
+            <w:r>
+              <w:rPr>
+                <w:sz w:val="18"/>
+              </w:rPr>
+              <w:t>A randomisation that swaps alterations between pairs of tumours while keeping every tumour's and every gene's count; used to make data with no real links</w:t>
+            </w:r>
+          </w:p>
+        </w:tc>
+      </w:tr>
+      <w:tr>
+        <w:trPr>
+          <w:cantSplit w:val="true"/>
+        </w:trPr>
+        <w:tc>
+          <w:tcPr>
+            <w:tcW w:type="dxa" w:w="2608"/>
+            <w:tcMar>
+              <w:top w:w="50" w:type="dxa"/>
+              <w:left w:w="90" w:type="dxa"/>
+              <w:bottom w:w="50" w:type="dxa"/>
+              <w:right w:w="90" w:type="dxa"/>
+            </w:tcMar>
+            <w:shd w:val="clear" w:color="auto" w:fill="F4F6F9"/>
+            <w:tcBorders>
+              <w:top w:val="nil" w:sz="0" w:color="FFFFFF"/>
+              <w:left w:val="nil" w:sz="0" w:color="FFFFFF"/>
+              <w:bottom w:val="single" w:sz="4" w:color="D5DAE1"/>
+              <w:right w:val="nil" w:sz="0" w:color="FFFFFF"/>
+            </w:tcBorders>
+          </w:tcPr>
+          <w:p>
+            <w:pPr>
+              <w:spacing w:after="0"/>
+            </w:pPr>
+            <w:r>
+              <w:rPr>
+                <w:sz w:val="18"/>
+              </w:rPr>
+              <w:t>effect size</w:t>
+            </w:r>
+          </w:p>
+        </w:tc>
+        <w:tc>
+          <w:tcPr>
+            <w:tcW w:type="dxa" w:w="7030"/>
+            <w:tcMar>
+              <w:top w:w="50" w:type="dxa"/>
+              <w:left w:w="90" w:type="dxa"/>
+              <w:bottom w:w="50" w:type="dxa"/>
+              <w:right w:w="90" w:type="dxa"/>
+            </w:tcMar>
+            <w:shd w:val="clear" w:color="auto" w:fill="F4F6F9"/>
+            <w:tcBorders>
+              <w:top w:val="nil" w:sz="0" w:color="FFFFFF"/>
+              <w:left w:val="nil" w:sz="0" w:color="FFFFFF"/>
+              <w:bottom w:val="single" w:sz="4" w:color="D5DAE1"/>
+              <w:right w:val="nil" w:sz="0" w:color="FFFFFF"/>
+            </w:tcBorders>
+          </w:tcPr>
+          <w:p>
+            <w:pPr>
+              <w:spacing w:after="0"/>
+            </w:pPr>
+            <w:r>
+              <w:rPr>
+                <w:sz w:val="18"/>
+              </w:rPr>
+              <w:t>How far an observed pattern is from what chance predicts (here observed/expected; for SELECT, weighted mutual information above its null)</w:t>
+            </w:r>
+          </w:p>
+        </w:tc>
+      </w:tr>
+      <w:tr>
+        <w:trPr>
+          <w:cantSplit w:val="true"/>
+        </w:trPr>
+        <w:tc>
+          <w:tcPr>
+            <w:tcW w:type="dxa" w:w="2608"/>
+            <w:tcMar>
+              <w:top w:w="50" w:type="dxa"/>
+              <w:left w:w="90" w:type="dxa"/>
+              <w:bottom w:w="50" w:type="dxa"/>
+              <w:right w:w="90" w:type="dxa"/>
+            </w:tcMar>
+            <w:shd w:val="clear" w:color="auto" w:fill="F4F6F9"/>
+            <w:tcBorders>
+              <w:top w:val="nil" w:sz="0" w:color="FFFFFF"/>
+              <w:left w:val="nil" w:sz="0" w:color="FFFFFF"/>
+              <w:bottom w:val="single" w:sz="4" w:color="D5DAE1"/>
+              <w:right w:val="nil" w:sz="0" w:color="FFFFFF"/>
+            </w:tcBorders>
+          </w:tcPr>
+          <w:p>
+            <w:pPr>
+              <w:spacing w:after="0"/>
+            </w:pPr>
+            <w:r>
+              <w:rPr>
+                <w:sz w:val="18"/>
+              </w:rPr>
+              <w:t>empirical FDR</w:t>
+            </w:r>
+          </w:p>
+        </w:tc>
+        <w:tc>
+          <w:tcPr>
+            <w:tcW w:type="dxa" w:w="7030"/>
+            <w:tcMar>
+              <w:top w:w="50" w:type="dxa"/>
+              <w:left w:w="90" w:type="dxa"/>
+              <w:bottom w:w="50" w:type="dxa"/>
+              <w:right w:w="90" w:type="dxa"/>
+            </w:tcMar>
+            <w:shd w:val="clear" w:color="auto" w:fill="F4F6F9"/>
+            <w:tcBorders>
+              <w:top w:val="nil" w:sz="0" w:color="FFFFFF"/>
+              <w:left w:val="nil" w:sz="0" w:color="FFFFFF"/>
+              <w:bottom w:val="single" w:sz="4" w:color="D5DAE1"/>
+              <w:right w:val="nil" w:sz="0" w:color="FFFFFF"/>
+            </w:tcBorders>
+          </w:tcPr>
+          <w:p>
+            <w:pPr>
+              <w:spacing w:after="0"/>
+            </w:pPr>
+            <w:r>
+              <w:rPr>
+                <w:sz w:val="18"/>
+              </w:rPr>
+              <w:t>A false discovery rate estimated by counting how many calls the method makes on shuffled data</w:t>
+            </w:r>
+          </w:p>
+        </w:tc>
+      </w:tr>
+      <w:tr>
+        <w:trPr>
+          <w:cantSplit w:val="true"/>
+        </w:trPr>
+        <w:tc>
+          <w:tcPr>
+            <w:tcW w:type="dxa" w:w="2608"/>
+            <w:tcMar>
+              <w:top w:w="50" w:type="dxa"/>
+              <w:left w:w="90" w:type="dxa"/>
+              <w:bottom w:w="50" w:type="dxa"/>
+              <w:right w:w="90" w:type="dxa"/>
+            </w:tcMar>
+            <w:shd w:val="clear" w:color="auto" w:fill="F4F6F9"/>
+            <w:tcBorders>
+              <w:top w:val="nil" w:sz="0" w:color="FFFFFF"/>
+              <w:left w:val="nil" w:sz="0" w:color="FFFFFF"/>
+              <w:bottom w:val="single" w:sz="4" w:color="D5DAE1"/>
+              <w:right w:val="nil" w:sz="0" w:color="FFFFFF"/>
+            </w:tcBorders>
+          </w:tcPr>
+          <w:p>
+            <w:pPr>
+              <w:spacing w:after="0"/>
+            </w:pPr>
+            <w:r>
+              <w:rPr>
+                <w:sz w:val="18"/>
+              </w:rPr>
+              <w:t>SELECT</w:t>
+            </w:r>
+          </w:p>
+        </w:tc>
+        <w:tc>
+          <w:tcPr>
+            <w:tcW w:type="dxa" w:w="7030"/>
+            <w:tcMar>
+              <w:top w:w="50" w:type="dxa"/>
+              <w:left w:w="90" w:type="dxa"/>
+              <w:bottom w:w="50" w:type="dxa"/>
+              <w:right w:w="90" w:type="dxa"/>
+            </w:tcMar>
+            <w:shd w:val="clear" w:color="auto" w:fill="F4F6F9"/>
+            <w:tcBorders>
+              <w:top w:val="nil" w:sz="0" w:color="FFFFFF"/>
+              <w:left w:val="nil" w:sz="0" w:color="FFFFFF"/>
+              <w:bottom w:val="single" w:sz="4" w:color="D5DAE1"/>
+              <w:right w:val="nil" w:sz="0" w:color="FFFFFF"/>
+            </w:tcBorders>
+          </w:tcPr>
+          <w:p>
+            <w:pPr>
+              <w:spacing w:after="0"/>
+            </w:pPr>
+            <w:r>
+              <w:rPr>
+                <w:sz w:val="18"/>
+              </w:rPr>
+              <w:t>Mina et al. 2017: scores pairs by weighted mutual information against a shuffled null; re-implemented here for the benchmark</w:t>
+            </w:r>
+          </w:p>
+        </w:tc>
+      </w:tr>
+      <w:tr>
+        <w:trPr>
+          <w:cantSplit w:val="true"/>
+        </w:trPr>
+        <w:tc>
+          <w:tcPr>
+            <w:tcW w:type="dxa" w:w="2608"/>
+            <w:tcMar>
+              <w:top w:w="50" w:type="dxa"/>
+              <w:left w:w="90" w:type="dxa"/>
+              <w:bottom w:w="50" w:type="dxa"/>
+              <w:right w:w="90" w:type="dxa"/>
+            </w:tcMar>
+            <w:shd w:val="clear" w:color="auto" w:fill="F4F6F9"/>
+            <w:tcBorders>
+              <w:top w:val="nil" w:sz="0" w:color="FFFFFF"/>
+              <w:left w:val="nil" w:sz="0" w:color="FFFFFF"/>
+              <w:bottom w:val="single" w:sz="4" w:color="D5DAE1"/>
+              <w:right w:val="nil" w:sz="0" w:color="FFFFFF"/>
+            </w:tcBorders>
+          </w:tcPr>
+          <w:p>
+            <w:pPr>
+              <w:spacing w:after="0"/>
+            </w:pPr>
+            <w:r>
+              <w:rPr>
+                <w:sz w:val="18"/>
+              </w:rPr>
+              <w:t>SelectSim</w:t>
+            </w:r>
+          </w:p>
+        </w:tc>
+        <w:tc>
+          <w:tcPr>
+            <w:tcW w:type="dxa" w:w="7030"/>
+            <w:tcMar>
+              <w:top w:w="50" w:type="dxa"/>
+              <w:left w:w="90" w:type="dxa"/>
+              <w:bottom w:w="50" w:type="dxa"/>
+              <w:right w:w="90" w:type="dxa"/>
+            </w:tcMar>
+            <w:shd w:val="clear" w:color="auto" w:fill="F4F6F9"/>
+            <w:tcBorders>
+              <w:top w:val="nil" w:sz="0" w:color="FFFFFF"/>
+              <w:left w:val="nil" w:sz="0" w:color="FFFFFF"/>
+              <w:bottom w:val="single" w:sz="4" w:color="D5DAE1"/>
+              <w:right w:val="nil" w:sz="0" w:color="FFFFFF"/>
+            </w:tcBorders>
+          </w:tcPr>
+          <w:p>
+            <w:pPr>
+              <w:spacing w:after="0"/>
+            </w:pPr>
+            <w:r>
+              <w:rPr>
+                <w:sz w:val="18"/>
+              </w:rPr>
+              <w:t>Iyer et al. 2026: the closest recent co-mutation atlas (GENIE MSK + DFCI and TCGA, mutations only)</w:t>
+            </w:r>
+          </w:p>
+        </w:tc>
+      </w:tr>
+      <w:tr>
+        <w:trPr>
+          <w:cantSplit w:val="true"/>
+        </w:trPr>
+        <w:tc>
+          <w:tcPr>
+            <w:tcW w:type="dxa" w:w="2608"/>
+            <w:tcMar>
+              <w:top w:w="50" w:type="dxa"/>
+              <w:left w:w="90" w:type="dxa"/>
+              <w:bottom w:w="50" w:type="dxa"/>
+              <w:right w:w="90" w:type="dxa"/>
+            </w:tcMar>
+            <w:shd w:val="clear" w:color="auto" w:fill="F4F6F9"/>
+            <w:tcBorders>
+              <w:top w:val="nil" w:sz="0" w:color="FFFFFF"/>
+              <w:left w:val="nil" w:sz="0" w:color="FFFFFF"/>
+              <w:bottom w:val="single" w:sz="4" w:color="D5DAE1"/>
+              <w:right w:val="nil" w:sz="0" w:color="FFFFFF"/>
+            </w:tcBorders>
+          </w:tcPr>
+          <w:p>
+            <w:pPr>
+              <w:spacing w:after="0"/>
+            </w:pPr>
+            <w:r>
+              <w:rPr>
+                <w:sz w:val="18"/>
+              </w:rPr>
+              <w:t>MLA (mutation load association)</w:t>
+            </w:r>
+          </w:p>
+        </w:tc>
+        <w:tc>
+          <w:tcPr>
+            <w:tcW w:type="dxa" w:w="7030"/>
+            <w:tcMar>
+              <w:top w:w="50" w:type="dxa"/>
+              <w:left w:w="90" w:type="dxa"/>
+              <w:bottom w:w="50" w:type="dxa"/>
+              <w:right w:w="90" w:type="dxa"/>
+            </w:tcMar>
+            <w:shd w:val="clear" w:color="auto" w:fill="F4F6F9"/>
+            <w:tcBorders>
+              <w:top w:val="nil" w:sz="0" w:color="FFFFFF"/>
+              <w:left w:val="nil" w:sz="0" w:color="FFFFFF"/>
+              <w:bottom w:val="single" w:sz="4" w:color="D5DAE1"/>
+              <w:right w:val="nil" w:sz="0" w:color="FFFFFF"/>
+            </w:tcBorders>
+          </w:tcPr>
+          <w:p>
+            <w:pPr>
+              <w:spacing w:after="0"/>
+            </w:pPr>
+            <w:r>
+              <w:rPr>
+                <w:sz w:val="18"/>
+              </w:rPr>
+              <w:t>van de Haar 2019: does a gene tend to be altered in low-load or high-load tumours? Strongly negative values signal load confounding</w:t>
+            </w:r>
+          </w:p>
+        </w:tc>
+      </w:tr>
+      <w:tr>
+        <w:trPr>
+          <w:cantSplit w:val="true"/>
+        </w:trPr>
+        <w:tc>
+          <w:tcPr>
+            <w:tcW w:type="dxa" w:w="2608"/>
+            <w:tcMar>
+              <w:top w:w="50" w:type="dxa"/>
+              <w:left w:w="90" w:type="dxa"/>
+              <w:bottom w:w="50" w:type="dxa"/>
+              <w:right w:w="90" w:type="dxa"/>
+            </w:tcMar>
+            <w:shd w:val="clear" w:color="auto" w:fill="F4F6F9"/>
+            <w:tcBorders>
+              <w:top w:val="nil" w:sz="0" w:color="FFFFFF"/>
+              <w:left w:val="nil" w:sz="0" w:color="FFFFFF"/>
+              <w:bottom w:val="single" w:sz="4" w:color="D5DAE1"/>
+              <w:right w:val="nil" w:sz="0" w:color="FFFFFF"/>
+            </w:tcBorders>
+          </w:tcPr>
+          <w:p>
+            <w:pPr>
+              <w:spacing w:after="0"/>
+            </w:pPr>
+            <w:r>
+              <w:rPr>
+                <w:sz w:val="18"/>
+              </w:rPr>
+              <w:t>novelty audit</w:t>
+            </w:r>
+          </w:p>
+        </w:tc>
+        <w:tc>
+          <w:tcPr>
+            <w:tcW w:type="dxa" w:w="7030"/>
+            <w:tcMar>
+              <w:top w:w="50" w:type="dxa"/>
+              <w:left w:w="90" w:type="dxa"/>
+              <w:bottom w:w="50" w:type="dxa"/>
+              <w:right w:w="90" w:type="dxa"/>
+            </w:tcMar>
+            <w:shd w:val="clear" w:color="auto" w:fill="F4F6F9"/>
+            <w:tcBorders>
+              <w:top w:val="nil" w:sz="0" w:color="FFFFFF"/>
+              <w:left w:val="nil" w:sz="0" w:color="FFFFFF"/>
+              <w:bottom w:val="single" w:sz="4" w:color="D5DAE1"/>
+              <w:right w:val="nil" w:sz="0" w:color="FFFFFF"/>
+            </w:tcBorders>
+          </w:tcPr>
+          <w:p>
+            <w:pPr>
+              <w:spacing w:after="0"/>
+            </w:pPr>
+            <w:r>
+              <w:rPr>
+                <w:sz w:val="18"/>
+              </w:rPr>
+              <w:t>Checking every robust pair against the literature and the SelectSim atlas before calling anything new</w:t>
+            </w:r>
+          </w:p>
+        </w:tc>
+      </w:tr>
+      <w:tr>
+        <w:trPr>
+          <w:cantSplit w:val="true"/>
+        </w:trPr>
+        <w:tc>
+          <w:tcPr>
+            <w:tcW w:type="dxa" w:w="2608"/>
+            <w:tcMar>
+              <w:top w:w="50" w:type="dxa"/>
+              <w:left w:w="90" w:type="dxa"/>
+              <w:bottom w:w="50" w:type="dxa"/>
+              <w:right w:w="90" w:type="dxa"/>
+            </w:tcMar>
+            <w:shd w:val="clear" w:color="auto" w:fill="F4F6F9"/>
+            <w:tcBorders>
+              <w:top w:val="nil" w:sz="0" w:color="FFFFFF"/>
+              <w:left w:val="nil" w:sz="0" w:color="FFFFFF"/>
+              <w:bottom w:val="single" w:sz="4" w:color="D5DAE1"/>
+              <w:right w:val="nil" w:sz="0" w:color="FFFFFF"/>
+            </w:tcBorders>
+          </w:tcPr>
+          <w:p>
+            <w:pPr>
+              <w:spacing w:after="0"/>
+            </w:pPr>
+            <w:r>
+              <w:rPr>
+                <w:sz w:val="18"/>
+              </w:rPr>
+              <w:t>oncoprint</w:t>
+            </w:r>
+          </w:p>
+        </w:tc>
+        <w:tc>
+          <w:tcPr>
+            <w:tcW w:type="dxa" w:w="7030"/>
+            <w:tcMar>
+              <w:top w:w="50" w:type="dxa"/>
+              <w:left w:w="90" w:type="dxa"/>
+              <w:bottom w:w="50" w:type="dxa"/>
+              <w:right w:w="90" w:type="dxa"/>
+            </w:tcMar>
+            <w:shd w:val="clear" w:color="auto" w:fill="F4F6F9"/>
+            <w:tcBorders>
+              <w:top w:val="nil" w:sz="0" w:color="FFFFFF"/>
+              <w:left w:val="nil" w:sz="0" w:color="FFFFFF"/>
+              <w:bottom w:val="single" w:sz="4" w:color="D5DAE1"/>
+              <w:right w:val="nil" w:sz="0" w:color="FFFFFF"/>
+            </w:tcBorders>
+          </w:tcPr>
+          <w:p>
+            <w:pPr>
+              <w:spacing w:after="0"/>
+            </w:pPr>
+            <w:r>
+              <w:rPr>
+                <w:sz w:val="18"/>
+              </w:rPr>
+              <w:t>A grid with genes as rows and patients as columns, coloured by alteration type; shows exclusivity as a staircase</w:t>
+            </w:r>
+          </w:p>
+        </w:tc>
+      </w:tr>
+      <w:tr>
+        <w:trPr>
+          <w:cantSplit w:val="true"/>
+        </w:trPr>
+        <w:tc>
+          <w:tcPr>
+            <w:tcW w:type="dxa" w:w="2608"/>
+            <w:tcMar>
+              <w:top w:w="50" w:type="dxa"/>
+              <w:left w:w="90" w:type="dxa"/>
+              <w:bottom w:w="50" w:type="dxa"/>
+              <w:right w:w="90" w:type="dxa"/>
+            </w:tcMar>
+            <w:shd w:val="clear" w:color="auto" w:fill="F4F6F9"/>
+            <w:tcBorders>
+              <w:top w:val="nil" w:sz="0" w:color="FFFFFF"/>
+              <w:left w:val="nil" w:sz="0" w:color="FFFFFF"/>
+              <w:bottom w:val="single" w:sz="4" w:color="D5DAE1"/>
+              <w:right w:val="nil" w:sz="0" w:color="FFFFFF"/>
+            </w:tcBorders>
+          </w:tcPr>
+          <w:p>
+            <w:pPr>
+              <w:spacing w:after="0"/>
+            </w:pPr>
+            <w:r>
+              <w:rPr>
+                <w:sz w:val="18"/>
+              </w:rPr>
+              <w:t>UpSet plot</w:t>
+            </w:r>
+          </w:p>
+        </w:tc>
+        <w:tc>
+          <w:tcPr>
+            <w:tcW w:type="dxa" w:w="7030"/>
+            <w:tcMar>
+              <w:top w:w="50" w:type="dxa"/>
+              <w:left w:w="90" w:type="dxa"/>
+              <w:bottom w:w="50" w:type="dxa"/>
+              <w:right w:w="90" w:type="dxa"/>
+            </w:tcMar>
+            <w:shd w:val="clear" w:color="auto" w:fill="F4F6F9"/>
+            <w:tcBorders>
+              <w:top w:val="nil" w:sz="0" w:color="FFFFFF"/>
+              <w:left w:val="nil" w:sz="0" w:color="FFFFFF"/>
+              <w:bottom w:val="single" w:sz="4" w:color="D5DAE1"/>
+              <w:right w:val="nil" w:sz="0" w:color="FFFFFF"/>
+            </w:tcBorders>
+          </w:tcPr>
+          <w:p>
+            <w:pPr>
+              <w:spacing w:after="0"/>
+            </w:pPr>
+            <w:r>
+              <w:rPr>
+                <w:sz w:val="18"/>
+              </w:rPr>
+              <w:t>A bar chart of how many patients carry each exact combination of alterations</w:t>
+            </w:r>
+          </w:p>
+        </w:tc>
+      </w:tr>
     </w:tbl>
     <w:p>
       <w:pPr>
@@ -30982,6 +32174,69 @@
                 <w:sz w:val="18"/>
               </w:rPr>
               <w:t>SELECT re-implemented from its published methods and benchmarked (calibrated; best at ranking the strongest pairs); review statements about van de Haar 2019 and Scharpf 2022 checked against their full texts and corrected; mutation-load confounding check added (script 21); Mina 2020 citations made precise</w:t>
+            </w:r>
+          </w:p>
+        </w:tc>
+      </w:tr>
+      <w:tr>
+        <w:trPr>
+          <w:cantSplit w:val="true"/>
+        </w:trPr>
+        <w:tc>
+          <w:tcPr>
+            <w:tcW w:type="dxa" w:w="1928"/>
+            <w:tcMar>
+              <w:top w:w="50" w:type="dxa"/>
+              <w:left w:w="90" w:type="dxa"/>
+              <w:bottom w:w="50" w:type="dxa"/>
+              <w:right w:w="90" w:type="dxa"/>
+            </w:tcMar>
+            <w:shd w:val="clear" w:color="auto" w:fill="F4F6F9"/>
+            <w:tcBorders>
+              <w:top w:val="nil" w:sz="0" w:color="FFFFFF"/>
+              <w:left w:val="nil" w:sz="0" w:color="FFFFFF"/>
+              <w:bottom w:val="single" w:sz="4" w:color="D5DAE1"/>
+              <w:right w:val="nil" w:sz="0" w:color="FFFFFF"/>
+            </w:tcBorders>
+          </w:tcPr>
+          <w:p>
+            <w:pPr>
+              <w:spacing w:after="0"/>
+            </w:pPr>
+            <w:r>
+              <w:rPr>
+                <w:sz w:val="18"/>
+              </w:rPr>
+              <w:t>27 Oct 2026</w:t>
+            </w:r>
+          </w:p>
+        </w:tc>
+        <w:tc>
+          <w:tcPr>
+            <w:tcW w:type="dxa" w:w="7710"/>
+            <w:tcMar>
+              <w:top w:w="50" w:type="dxa"/>
+              <w:left w:w="90" w:type="dxa"/>
+              <w:bottom w:w="50" w:type="dxa"/>
+              <w:right w:w="90" w:type="dxa"/>
+            </w:tcMar>
+            <w:shd w:val="clear" w:color="auto" w:fill="F4F6F9"/>
+            <w:tcBorders>
+              <w:top w:val="nil" w:sz="0" w:color="FFFFFF"/>
+              <w:left w:val="nil" w:sz="0" w:color="FFFFFF"/>
+              <w:bottom w:val="single" w:sz="4" w:color="D5DAE1"/>
+              <w:right w:val="nil" w:sz="0" w:color="FFFFFF"/>
+            </w:tcBorders>
+          </w:tcPr>
+          <w:p>
+            <w:pPr>
+              <w:spacing w:after="0"/>
+            </w:pPr>
+            <w:r>
+              <w:rPr>
+                <w:sz w:val="18"/>
+              </w:rPr>
+              <w:t>Individual-level GENIE tables and patient IDs removed from the public repository and its history; notebook 01 shows table schemas instead of rows; this guide updated; development paused for reading</w:t>
             </w:r>
           </w:p>
         </w:tc>

</xml_diff>

<commit_message>
Organise figures by phase, one figure per step, shown at that step in each notebook
results/figures/phase1_data, phase2_pair_test, phase3_lookup_tool, phase4_biology and
validation replace the combined thesis-style figures; one R script per phase. Each
notebook shows its figures right after the step they come from, with a one-line caption.
Simplified: candidates only (no replication marks), lung network dropped, new
mutation-load figure (5.5). README, scripts README, supervisor summary and the
onboarding guide updated.
</commit_message>
<xml_diff>
--- a/docs/FYP_onboarding_guide.docx
+++ b/docs/FYP_onboarding_guide.docx
@@ -22304,7 +22304,7 @@
     <w:p>
       <w:r>
         <w:rPr/>
-        <w:t>All results are drawn as publication figures in R (scripts/figures/; rebuild everything with bash scripts/figures/run_all.sh). Each is saved as a vector PDF for the thesis and a 300-dpi PNG for slides in results/figures/. Figure types follow the co-mutation literature (GENIE 2017, DISCOVER, maftools, Sanchez-Vega 2018, Park &amp; Lehner 2015, van de Haar 2019, SelectSim 2026). Colours: green = co-occurring, purple = exclusive. Each notebook also shows its own figures in a “Publication figures” section just before its Discussion: Fig 1 in notebook 01; Fig 3 and S1 in 02; Fig 6 and S2 in 03; Figs 4, 5 and S4 in 04; Fig 2, S3, S5 and S6 in 05.</w:t>
+        <w:t>All results are drawn as figures in R, organised by phase with one figure per key step (results/figures/phase1_data/ ... validation/; rebuild everything with bash scripts/figures/run_all.sh). Each notebook shows its figures right after the step they come from, with a one-line caption. Each figure is saved as a PDF for the thesis and a PNG for slides. Colours: green = co-occurring, purple = exclusive.</w:t>
       </w:r>
     </w:p>
     <w:p>
@@ -22315,8 +22315,8 @@
       <w:r>
         <w:drawing>
           <wp:inline xmlns:a="http://schemas.openxmlformats.org/drawingml/2006/main" xmlns:pic="http://schemas.openxmlformats.org/drawingml/2006/picture">
-            <wp:extent cx="5577840" cy="6096649"/>
-            <wp:docPr id="7" name="Picture 7"/>
+            <wp:extent cx="5577840" cy="2896037"/>
+            <wp:docPr id="10" name="Picture 10"/>
             <wp:cNvGraphicFramePr>
               <a:graphicFrameLocks noChangeAspect="1"/>
             </wp:cNvGraphicFramePr>
@@ -22324,11 +22324,11 @@
               <a:graphicData uri="http://schemas.openxmlformats.org/drawingml/2006/picture">
                 <pic:pic>
                   <pic:nvPicPr>
-                    <pic:cNvPr id="0" name="fig4_biology.png"/>
+                    <pic:cNvPr id="0" name="4.1_pathway_structure.png"/>
                     <pic:cNvPicPr/>
                   </pic:nvPicPr>
                   <pic:blipFill>
-                    <a:blip r:embed="rId17"/>
+                    <a:blip r:embed="rId21"/>
                     <a:stretch>
                       <a:fillRect/>
                     </a:stretch>
@@ -22336,7 +22336,7 @@
                   <pic:spPr>
                     <a:xfrm>
                       <a:off x="0" y="0"/>
-                      <a:ext cx="5577840" cy="6096649"/>
+                      <a:ext cx="5577840" cy="2896037"/>
                     </a:xfrm>
                     <a:prstGeom prst="rect"/>
                   </pic:spPr>
@@ -22356,7 +22356,7 @@
           <w:color w:val="555B66"/>
           <w:sz w:val="18"/>
         </w:rPr>
-        <w:t>Figure 7. Biology (Figure 4 of the figure set). a, share of tested pairs that are candidates within and between the 10 Sanchez-Vega pathways; b, exclusivity is pathway-bound (35% vs 14%); c, the same pair across cancer types, reversing vs universal; d, copy-number burden check for the 25 copy-number-driven pairs.</w:t>
+        <w:t>Figure 7. Pathway structure (results/figures/phase4_biology/4.1). Genes in the same pathway avoid each other far more often than genes in different pathways.</w:t>
       </w:r>
     </w:p>
     <w:p>
@@ -22367,8 +22367,8 @@
       <w:r>
         <w:drawing>
           <wp:inline xmlns:a="http://schemas.openxmlformats.org/drawingml/2006/main" xmlns:pic="http://schemas.openxmlformats.org/drawingml/2006/picture">
-            <wp:extent cx="5577840" cy="5792074"/>
-            <wp:docPr id="8" name="Picture 8"/>
+            <wp:extent cx="5577840" cy="2436595"/>
+            <wp:docPr id="11" name="Picture 11"/>
             <wp:cNvGraphicFramePr>
               <a:graphicFrameLocks noChangeAspect="1"/>
             </wp:cNvGraphicFramePr>
@@ -22376,11 +22376,11 @@
               <a:graphicData uri="http://schemas.openxmlformats.org/drawingml/2006/picture">
                 <pic:pic>
                   <pic:nvPicPr>
-                    <pic:cNvPr id="0" name="fig5_fusions_alleles.png"/>
+                    <pic:cNvPr id="0" name="2.6_lung_oncoprint.png"/>
                     <pic:cNvPicPr/>
                   </pic:nvPicPr>
                   <pic:blipFill>
-                    <a:blip r:embed="rId18"/>
+                    <a:blip r:embed="rId22"/>
                     <a:stretch>
                       <a:fillRect/>
                     </a:stretch>
@@ -22388,7 +22388,7 @@
                   <pic:spPr>
                     <a:xfrm>
                       <a:off x="0" y="0"/>
-                      <a:ext cx="5577840" cy="5792074"/>
+                      <a:ext cx="5577840" cy="2436595"/>
                     </a:xfrm>
                     <a:prstGeom prst="rect"/>
                   </pic:spPr>
@@ -22408,7 +22408,7 @@
           <w:color w:val="555B66"/>
           <w:sz w:val="18"/>
         </w:rPr>
-        <w:t>Figure 8. Fusions and variants (Figure 5 of the figure set). a, lung cancer oncoprint: EGFR, KRAS and ALK/ROS1/RET fusions form a staircase of mutual exclusivity; b, fusion partners per cancer type; c, KRAS variant partners before and after adjusting for the smoking signature.</w:t>
+        <w:t>Figure 8. Lung cancer oncoprint (results/figures/phase2_pair_test/2.6). Each column is a patient: EGFR, KRAS and ALK/ROS1/RET fusions form a staircase -- most tumours carry only one of them.</w:t>
       </w:r>
     </w:p>
     <w:p>
@@ -22426,11 +22426,13 @@
         <w:rPr>
           <w:b/>
         </w:rPr>
-        <w:t>Fig 1 Data:</w:t>
-      </w:r>
-      <w:r>
-        <w:rPr/>
-        <w:t xml:space="preserve"> patient flow; cohort by centre; panel metadata vs released data; alterations per patient.</w:t>
+        <w:t>Phase 1 (notebook 01):</w:t>
+      </w:r>
+      <w:r>
+        <w:rPr>
+          <w:b w:val="0"/>
+        </w:rPr>
+        <w:t xml:space="preserve"> 1.1 patient flow; 1.2 cohort by cancer type; 1.3 what panels claim vs release; 1.4 alterations per patient.</w:t>
       </w:r>
     </w:p>
     <w:p>
@@ -22442,11 +22444,13 @@
         <w:rPr>
           <w:b/>
         </w:rPr>
-        <w:t>Fig 2 Can the test be trusted?</w:t>
-      </w:r>
-      <w:r>
-        <w:rPr/>
-        <w:t xml:space="preserve"> null p-value histograms; head-to-head benchmark; GENIE vs TCGA effects.</w:t>
+        <w:t>Phase 2 (notebook 02):</w:t>
+      </w:r>
+      <w:r>
+        <w:rPr>
+          <w:b w:val="0"/>
+        </w:rPr>
+        <w:t xml:space="preserve"> 2.1 why not Fisher; 2.2 filter funnel; 2.3 pair heatmaps; 2.4 all pairs (volcano); 2.5 fusion partners; 2.6 lung oncoprint.</w:t>
       </w:r>
     </w:p>
     <w:p>
@@ -22458,11 +22462,13 @@
         <w:rPr>
           <w:b/>
         </w:rPr>
-        <w:t>Fig 3 Landscape:</w:t>
-      </w:r>
-      <w:r>
-        <w:rPr/>
-        <w:t xml:space="preserve"> triangle heatmaps (lung, breast, colorectal); volcano of all 6,697 pairs; lung interaction network.</w:t>
+        <w:t>Phase 3 (notebook 03):</w:t>
+      </w:r>
+      <w:r>
+        <w:rPr>
+          <w:b w:val="0"/>
+        </w:rPr>
+        <w:t xml:space="preserve"> 3.1 lookup example; 3.2 exact combinations; 3.3 partner prediction; 3.4 MSK vs other centres.</w:t>
       </w:r>
     </w:p>
     <w:p>
@@ -22474,21 +22480,13 @@
         <w:rPr>
           <w:b/>
         </w:rPr>
-        <w:t>Fig 4 Biology</w:t>
-      </w:r>
-      <w:r>
-        <w:rPr/>
-        <w:t xml:space="preserve"> and </w:t>
+        <w:t>Phase 4 (notebook 04):</w:t>
       </w:r>
       <w:r>
         <w:rPr>
-          <w:b/>
+          <w:b w:val="0"/>
         </w:rPr>
-        <w:t>Fig 5 Fusions and variants</w:t>
-      </w:r>
-      <w:r>
-        <w:rPr/>
-        <w:t xml:space="preserve"> (shown above).</w:t>
+        <w:t xml:space="preserve"> 4.1 pathway structure; 4.2 pairs across cancer types; 4.3 KRAS/TP53 example; 4.4 variants and smoking; 4.5 rare combinations; 4.6 copy-number burden check.</w:t>
       </w:r>
     </w:p>
     <w:p>
@@ -22500,27 +22498,13 @@
         <w:rPr>
           <w:b/>
         </w:rPr>
-        <w:t>Fig 6 The tool:</w:t>
-      </w:r>
-      <w:r>
-        <w:rPr/>
-        <w:t xml:space="preserve"> KRAS G12C partners; partner prediction vs base rates; MSK vs other-centre frequencies.</w:t>
-      </w:r>
-    </w:p>
-    <w:p>
-      <w:pPr>
-        <w:pStyle w:val="ListBullet"/>
-        <w:spacing w:after="60"/>
-      </w:pPr>
+        <w:t>Validation (notebook 05):</w:t>
+      </w:r>
       <w:r>
         <w:rPr>
-          <w:b/>
+          <w:b w:val="0"/>
         </w:rPr>
-        <w:t>S1-S6:</w:t>
-      </w:r>
-      <w:r>
-        <w:rPr/>
-        <w:t xml:space="preserve"> filter funnel; UpSet of lung drivers; KRAS/TP53 forest plot; rare combinations; dN/dS route; exclusive gene sets.</w:t>
+        <w:t xml:space="preserve"> 5.1 method benchmark; 5.2 TCGA agreement; 5.3 dN/dS route; 5.4 gene sets; 5.5 mutation-load check.</w:t>
       </w:r>
     </w:p>
     <w:p>
@@ -23636,7 +23620,7 @@
       <w:r>
         <w:drawing>
           <wp:inline xmlns:a="http://schemas.openxmlformats.org/drawingml/2006/main" xmlns:pic="http://schemas.openxmlformats.org/drawingml/2006/picture">
-            <wp:extent cx="5577840" cy="4571196"/>
+            <wp:extent cx="5577840" cy="4266622"/>
             <wp:docPr id="9" name="Picture 9"/>
             <wp:cNvGraphicFramePr>
               <a:graphicFrameLocks noChangeAspect="1"/>
@@ -23645,11 +23629,11 @@
               <a:graphicData uri="http://schemas.openxmlformats.org/drawingml/2006/picture">
                 <pic:pic>
                   <pic:nvPicPr>
-                    <pic:cNvPr id="0" name="fig2_method_validity.png"/>
+                    <pic:cNvPr id="0" name="5.1_method_benchmark.png"/>
                     <pic:cNvPicPr/>
                   </pic:nvPicPr>
                   <pic:blipFill>
-                    <a:blip r:embed="rId19"/>
+                    <a:blip r:embed="rId20"/>
                     <a:stretch>
                       <a:fillRect/>
                     </a:stretch>
@@ -23657,7 +23641,7 @@
                   <pic:spPr>
                     <a:xfrm>
                       <a:off x="0" y="0"/>
-                      <a:ext cx="5577840" cy="4571196"/>
+                      <a:ext cx="5577840" cy="4266622"/>
                     </a:xfrm>
                     <a:prstGeom prst="rect"/>
                   </pic:spPr>
@@ -23677,7 +23661,7 @@
           <w:color w:val="555B66"/>
           <w:sz w:val="18"/>
         </w:rPr>
-        <w:t>Figure 6. Figure 2 of the figure set. a, p-values on null data with no real gene-gene links (flat = calibrated); b, false positives and TCGA replication per method; c, GENIE vs TCGA effect for every testable pair.</w:t>
+        <w:t>Figure 6. Method benchmark (results/figures/validation/5.1). Top: p-values on data with no real links (flat = honest). Bottom: false positives and replication in TCGA for each method.</w:t>
       </w:r>
     </w:p>
     <w:tbl>
@@ -26834,7 +26818,7 @@
               <w:rPr>
                 <w:sz w:val="18"/>
               </w:rPr>
-              <w:t>6 main + 6 supplementary; rebuilt by scripts/figures/run_all.sh</w:t>
+              <w:t>One figure per key step, organised by phase and shown in each notebook; rebuilt by scripts/figures/run_all.sh</w:t>
             </w:r>
           </w:p>
         </w:tc>
@@ -28827,7 +28811,7 @@
               <w:rPr>
                 <w:sz w:val="18"/>
               </w:rPr>
-              <w:t>R figure scripts plus a Python export step; run_all.sh rebuilds every figure</w:t>
+              <w:t>One R script per phase plus a Python export step; run_all.sh rebuilds every figure</w:t>
             </w:r>
           </w:p>
         </w:tc>
@@ -28891,7 +28875,7 @@
               <w:rPr>
                 <w:sz w:val="18"/>
               </w:rPr>
-              <w:t>Publication figures (PDF and 300-dpi PNG); tracked in git; each is also shown in the notebook of its phase</w:t>
+              <w:t>Figures by phase (phase1_data/ ... validation/), one per key step, PDF and PNG; tracked in git; each is shown in its notebook at the step it comes from</w:t>
             </w:r>
           </w:p>
         </w:tc>

</xml_diff>

<commit_message>
Phase 2b judged by precision and recall; trim 02c; Phase 1 hands Phase 2 three checked tables
- Phase 2b (notebook 02b): precision and recall only. Data with no real links, a simulation with
  planted links in three scenarios (script 22, all methods on identical data), 29 textbook pairs
  chosen beforehand (data/curated/), the strongest pairs checked against the literature, and TCGA
  (direction against a control baseline, effect correlation). New Phase 2b figure.
- Notebook 02c trimmed to what later steps use: hypermutated, mutations only, burden flag, fusion
  screen, mutation-load check, method comparison on real data. Gene-set script and unused tables removed.
- Phase 1 hand-off (notebook 01, Section 9): cohort (one row per patient, TMB group), events and
  testability, checked by scripts/validation/check_phase1_handoff.py. Phase 2 Step 1 reads only these;
  its inputs are identical to before. New Phase 1 figure showing what Phase 2 receives.
- Docs and onboarding guide updated.
</commit_message>
<xml_diff>
--- a/docs/FYP_onboarding_guide.docx
+++ b/docs/FYP_onboarding_guide.docx
@@ -2211,14 +2211,13 @@
                 <w:b/>
                 <w:sz w:val="20"/>
               </w:rPr>
-              <w:t>•  Part 10.4:</w:t>
+              <w:t>•  Part 10 (29 Oct): rewritten around precision and recall -- a simulation with planted links, 29 textbook pairs, and TCGA.</w:t>
             </w:r>
             <w:r>
               <w:rPr>
                 <w:b w:val="0"/>
                 <w:sz w:val="20"/>
               </w:rPr>
-              <w:t xml:space="preserve"> SELECT re-implemented from its published methods and added to the benchmark.</w:t>
             </w:r>
           </w:p>
           <w:p>
@@ -2230,14 +2229,13 @@
                 <w:b/>
                 <w:sz w:val="20"/>
               </w:rPr>
-              <w:t>•  Part 10.6:</w:t>
+              <w:t>•  Part 10.6: van de Haar's mutation-load check and the real-data method comparison, now side checks in notebook 02c (trimmed to what later steps use).</w:t>
             </w:r>
             <w:r>
               <w:rPr>
                 <w:b w:val="0"/>
                 <w:sz w:val="20"/>
               </w:rPr>
-              <w:t xml:space="preserve"> van de Haar's mutation-load confounding check -- why the non-hypermutated split matters.</w:t>
             </w:r>
           </w:p>
           <w:p>
@@ -2276,6 +2274,24 @@
                 <w:sz w:val="20"/>
               </w:rPr>
               <w:t xml:space="preserve"> notebook 02 now follows seven plain steps; side analyses moved to notebook 02c, validation is notebook 02b and the deep dive is now notebook 05 (28 Oct). Figures simplified, one per phase.</w:t>
+            </w:r>
+          </w:p>
+          <w:p>
+            <w:pPr>
+              <w:spacing w:after="60"/>
+            </w:pPr>
+            <w:r>
+              <w:rPr>
+                <w:b/>
+                <w:sz w:val="20"/>
+              </w:rPr>
+              <w:t>Part 6.5 (29 Oct): Phase 1 hands Phase 2 three checked tables (cohort, events, testability); new Phase 1 figure showing exactly what Phase 2 receives.</w:t>
+            </w:r>
+            <w:r>
+              <w:rPr>
+                <w:b w:val="0"/>
+                <w:sz w:val="20"/>
+              </w:rPr>
             </w:r>
           </w:p>
         </w:tc>
@@ -10825,11 +10841,9 @@
         <w:rPr>
           <w:b/>
         </w:rPr>
-        <w:t>Validation built in:</w:t>
-      </w:r>
-      <w:r>
-        <w:t xml:space="preserve"> out-of-centre replication for every pair, an independent cohort (TCGA) and an independent statistical route (silent-mutation ratios).</w:t>
-      </w:r>
+        <w:t>Validation built in: out-of-centre replication for every pair, an independent cohort (TCGA), a simulation where the truth is known, and 29 textbook pairs.</w:t>
+      </w:r>
+      <w:r/>
     </w:p>
     <w:p>
       <w:pPr>
@@ -15902,6 +15916,98 @@
     </w:p>
     <w:p>
       <w:pPr>
+        <w:pStyle w:val="Heading2"/>
+      </w:pPr>
+      <w:r>
+        <w:t>6.5  Hand-off to Phase 2 (added 29 October)</w:t>
+      </w:r>
+    </w:p>
+    <w:p>
+      <w:pPr/>
+      <w:r>
+        <w:t>Phase 1 now ends by writing the only three tables Phase 2 reads, so every decision about patients and data is made here and Phase 2 makes only statistical choices:</w:t>
+      </w:r>
+    </w:p>
+    <w:p>
+      <w:pPr>
+        <w:pStyle w:val="ListBullet"/>
+      </w:pPr>
+      <w:r>
+        <w:t>cohort -- one row per patient (227,696; one sample each), with what was tested and a TMB group: 159,390 not hypermutated (the Phase 2 analysis), 24,452 hypermutated (TMB 10-100, Phase 2c), 658 ultramutated (TMB &gt;= 100, left out) and 43,196 with TMB unknown (panel under 1 Mb, left out).</w:t>
+      </w:r>
+    </w:p>
+    <w:p>
+      <w:pPr>
+        <w:pStyle w:val="ListBullet"/>
+      </w:pPr>
+      <w:r>
+        <w:t>events -- their 1,704,134 driver events: mutations, deep copy-number changes in the direction of the gene's role, and driver fusions.</w:t>
+      </w:r>
+    </w:p>
+    <w:p>
+      <w:pPr>
+        <w:pStyle w:val="ListBullet"/>
+      </w:pPr>
+      <w:r>
+        <w:t>testability -- one table of which panel tests which gene feature for mutation, copy number and fusion.</w:t>
+      </w:r>
+    </w:p>
+    <w:p>
+      <w:pPr>
+        <w:pStyle w:val="ListBullet"/>
+      </w:pPr>
+      <w:r>
+        <w:t>A check script (scripts/validation/check_phase1_handoff.py) verifies one row per patient, that every event belongs to a cohort patient, and that 99.8% of events were testable on their patient's panel. Phase 2's inputs were confirmed identical before and after the change.</w:t>
+      </w:r>
+    </w:p>
+    <w:p>
+      <w:pPr/>
+      <w:r>
+        <w:drawing>
+          <wp:inline xmlns:a="http://schemas.openxmlformats.org/drawingml/2006/main" xmlns:pic="http://schemas.openxmlformats.org/drawingml/2006/picture">
+            <wp:extent cx="5760000" cy="6767534"/>
+            <wp:docPr id="15" name="Picture 15"/>
+            <wp:cNvGraphicFramePr>
+              <a:graphicFrameLocks noChangeAspect="1"/>
+            </wp:cNvGraphicFramePr>
+            <a:graphic>
+              <a:graphicData uri="http://schemas.openxmlformats.org/drawingml/2006/picture">
+                <pic:pic>
+                  <pic:nvPicPr>
+                    <pic:cNvPr id="0" name="figure_phase1.png"/>
+                    <pic:cNvPicPr/>
+                  </pic:nvPicPr>
+                  <pic:blipFill>
+                    <a:blip r:embed="rId26"/>
+                    <a:stretch>
+                      <a:fillRect/>
+                    </a:stretch>
+                  </pic:blipFill>
+                  <pic:spPr>
+                    <a:xfrm>
+                      <a:off x="0" y="0"/>
+                      <a:ext cx="5760000" cy="6767534"/>
+                    </a:xfrm>
+                    <a:prstGeom prst="rect"/>
+                  </pic:spPr>
+                </pic:pic>
+              </a:graphicData>
+            </a:graphic>
+          </wp:inline>
+        </w:drawing>
+      </w:r>
+    </w:p>
+    <w:p>
+      <w:pPr/>
+      <w:r>
+        <w:t>Figure 9. Phase 1 at a glance (results/figures/phase1_data/figure_phase1). a, patient flow -- every filter between GENIE and the Phase 2 cohort; b, TMB groups in the 15 largest cancer types; c, filters per alteration type; d, what Phase 2 receives: 616,817 events for 112,779 patients (mutations 65%, amplifications 24%, deep deletions 10%, fusions 1%).</w:t>
+      </w:r>
+    </w:p>
+    <w:p>
+      <w:pPr/>
+    </w:p>
+    <w:p>
+      <w:pPr>
         <w:spacing w:before="120"/>
       </w:pPr>
       <w:r>
@@ -15910,14 +16016,13 @@
           <w:color w:val="555B66"/>
           <w:sz w:val="17"/>
         </w:rPr>
-        <w:t>Source files for this part:</w:t>
+        <w:t>Source files for this part: notebooks/01_phase1_preprocessing.ipynb (Section 9: hand-off), scripts/validation/check_phase1_handoff.py, README.md (Phase 1), docs/supervisor_summary.md.</w:t>
       </w:r>
       <w:r>
         <w:rPr>
           <w:color w:val="555B66"/>
           <w:sz w:val="17"/>
         </w:rPr>
-        <w:t xml:space="preserve"> notebooks/01_phase1_preprocessing.ipynb, README.md (Phase 1), docs/supervisor_summary.md.</w:t>
       </w:r>
     </w:p>
     <w:p>
@@ -17552,119 +17657,81 @@
         <w:rPr>
           <w:b/>
         </w:rPr>
-        <w:t>Known biology recovered:</w:t>
-      </w:r>
-      <w:r>
-        <w:t xml:space="preserve"> </w:t>
-      </w:r>
+        <w:t>Known biology recovered: KRAS/EGFR, KRAS/BRAF, EGFR/IDH1 and PIK3CA/PTEN (breast) exclusive; MDM2 amplification vs TP53 mutation exclusive across cancer types; KEAP1/STK11 co-mutated in lung.</w:t>
+      </w:r>
+      <w:r/>
       <w:r>
         <w:rPr>
           <w:i/>
         </w:rPr>
-        <w:t>KRAS</w:t>
-      </w:r>
-      <w:r>
-        <w:t>/</w:t>
-      </w:r>
+      </w:r>
+      <w:r/>
       <w:r>
         <w:rPr>
           <w:i/>
         </w:rPr>
-        <w:t>EGFR</w:t>
-      </w:r>
-      <w:r>
-        <w:t xml:space="preserve">, </w:t>
-      </w:r>
+      </w:r>
+      <w:r/>
       <w:r>
         <w:rPr>
           <w:i/>
         </w:rPr>
-        <w:t>KRAS</w:t>
-      </w:r>
-      <w:r>
-        <w:t>/</w:t>
-      </w:r>
+      </w:r>
+      <w:r/>
       <w:r>
         <w:rPr>
           <w:i/>
         </w:rPr>
-        <w:t>BRAF</w:t>
-      </w:r>
-      <w:r>
-        <w:t xml:space="preserve">, </w:t>
-      </w:r>
+      </w:r>
+      <w:r/>
       <w:r>
         <w:rPr>
           <w:i/>
         </w:rPr>
-        <w:t>EGFR</w:t>
-      </w:r>
-      <w:r>
-        <w:t>/</w:t>
-      </w:r>
+      </w:r>
+      <w:r/>
       <w:r>
         <w:rPr>
           <w:i/>
         </w:rPr>
-        <w:t>IDH1</w:t>
-      </w:r>
-      <w:r>
-        <w:t xml:space="preserve"> and </w:t>
-      </w:r>
+      </w:r>
+      <w:r/>
       <w:r>
         <w:rPr>
           <w:i/>
         </w:rPr>
-        <w:t>PIK3CA</w:t>
-      </w:r>
-      <w:r>
-        <w:t>/</w:t>
-      </w:r>
+      </w:r>
+      <w:r/>
       <w:r>
         <w:rPr>
           <w:i/>
         </w:rPr>
-        <w:t>PTEN</w:t>
-      </w:r>
-      <w:r>
-        <w:t xml:space="preserve"> (breast) exclusive; </w:t>
-      </w:r>
+      </w:r>
+      <w:r/>
       <w:r>
         <w:rPr>
           <w:i/>
         </w:rPr>
-        <w:t>MDM2</w:t>
-      </w:r>
-      <w:r>
-        <w:t xml:space="preserve"> amplification vs </w:t>
-      </w:r>
+      </w:r>
+      <w:r/>
       <w:r>
         <w:rPr>
           <w:i/>
         </w:rPr>
-        <w:t>TP53</w:t>
-      </w:r>
-      <w:r>
-        <w:t xml:space="preserve"> mutation exclusive across cancer types; </w:t>
-      </w:r>
+      </w:r>
+      <w:r/>
       <w:r>
         <w:rPr>
           <w:i/>
         </w:rPr>
-        <w:t>KEAP1</w:t>
-      </w:r>
-      <w:r>
-        <w:t>/</w:t>
-      </w:r>
+      </w:r>
+      <w:r/>
       <w:r>
         <w:rPr>
           <w:i/>
         </w:rPr>
-        <w:t>STK11</w:t>
-      </w:r>
-      <w:r>
-        <w:t xml:space="preserve"> co-mutated in lung; the breast 11q13/8p12 co-amplification.</w:t>
-      </w:r>
+      </w:r>
+      <w:r/>
     </w:p>
     <w:p>
       <w:pPr>
@@ -22425,13 +22492,12 @@
         <w:rPr>
           <w:b/>
         </w:rPr>
-        <w:t>Phase 1 (notebook 01):</w:t>
+        <w:t>Phase 1 (notebook 01): figure_phase1 -- patient flow and every filter; TMB groups; filters per alteration type; events Phase 2 receives.</w:t>
       </w:r>
       <w:r>
         <w:rPr>
           <w:b w:val="0"/>
         </w:rPr>
-        <w:t xml:space="preserve"> figure_phase1 -- patient flow; cohort; panel claims vs data; alterations per patient.</w:t>
       </w:r>
     </w:p>
     <w:p>
@@ -22461,7 +22527,7 @@
         <w:rPr>
           <w:b/>
         </w:rPr>
-        <w:t>Phase 2b (notebook 02b): figure_phase2b -- TCGA replication with counts; GENIE vs TCGA effect for every candidate; method benchmark; agreement with the literature and SelectSim.</w:t>
+        <w:t>Phase 2b (notebook 02b): figure_phase2b -- precision in the simulation; recall by link strength; precision-recall curves; recall of textbook pairs; GENIE vs TCGA effects.</w:t>
       </w:r>
       <w:r>
         <w:rPr>
@@ -22699,85 +22765,6 @@
           <w:sz w:val="23"/>
         </w:rPr>
         <w:t>Does the whole thing hold up in patients, centres and statistical routes it was not built on?</w:t>
-      </w:r>
-    </w:p>
-    <w:p>
-      <w:pPr>
-        <w:pStyle w:val="Heading2"/>
-      </w:pPr>
-      <w:r>
-        <w:t>10.1  External validation in TCGA</w:t>
-      </w:r>
-    </w:p>
-    <w:p>
-      <w:r>
-        <w:t>TCGA, agreement with known biology and the benchmark are in notebooks/02b_phase2_validation.ipynb (Phase 2b); the mutation-load check, ranking by effect size, gene sets, dN/dS and shrinkage are side analyses in notebooks/02c_phase2_extensions.ipynb (Phase 2c, Sections I-M). Replicating in TCGA does not mean fitting the model again: the same test is run on different patients, and we ask whether each pair points the same way there and is significant. The stronger a pair is in GENIE, the more often TCGA confirms it (strongest quarter of candidates: 98% same direction, 66% significant; weakest quarter: 78% and 15%), and effect sizes correlate across the two cohorts (Spearman 0.74, 765 candidates). scripts/analyses/14_tcga_external_validation.py re-tests the same pairs, with the same test, in the TCGA PanCancer Atlas (independent patients, whole-exome sequencing, different centres and calling pipelines, non-hypermutated). Phase 1 rules were applied as closely as the data allow.</w:t>
-      </w:r>
-      <w:r>
-        <w:rPr>
-          <w:rFonts w:ascii="Menlo" w:hAnsi="Menlo" w:eastAsia="Menlo"/>
-          <w:sz w:val="18"/>
-        </w:rPr>
-      </w:r>
-      <w:r/>
-      <w:r>
-        <w:rPr>
-          <w:rFonts w:ascii="Menlo" w:hAnsi="Menlo" w:eastAsia="Menlo"/>
-          <w:sz w:val="18"/>
-        </w:rPr>
-      </w:r>
-      <w:r/>
-    </w:p>
-    <w:p>
-      <w:pPr>
-        <w:keepNext/>
-        <w:jc w:val="center"/>
-      </w:pPr>
-      <w:r>
-        <w:drawing>
-          <wp:inline xmlns:a="http://schemas.openxmlformats.org/drawingml/2006/main" xmlns:pic="http://schemas.openxmlformats.org/drawingml/2006/picture">
-            <wp:extent cx="3960000" cy="2277993"/>
-            <wp:docPr id="5" name="Picture 5"/>
-            <wp:cNvGraphicFramePr>
-              <a:graphicFrameLocks noChangeAspect="1"/>
-            </wp:cNvGraphicFramePr>
-            <a:graphic>
-              <a:graphicData uri="http://schemas.openxmlformats.org/drawingml/2006/picture">
-                <pic:pic>
-                  <pic:nvPicPr>
-                    <pic:cNvPr id="0" name="fig5_tcga.png"/>
-                    <pic:cNvPicPr/>
-                  </pic:nvPicPr>
-                  <pic:blipFill>
-                    <a:blip r:embed="rId15"/>
-                    <a:stretch>
-                      <a:fillRect/>
-                    </a:stretch>
-                  </pic:blipFill>
-                  <pic:spPr>
-                    <a:xfrm>
-                      <a:off x="0" y="0"/>
-                      <a:ext cx="3960000" cy="2277993"/>
-                    </a:xfrm>
-                    <a:prstGeom prst="rect"/>
-                  </pic:spPr>
-                </pic:pic>
-              </a:graphicData>
-            </a:graphic>
-          </wp:inline>
-        </w:drawing>
-      </w:r>
-    </w:p>
-    <w:p>
-      <w:pPr>
-        <w:jc w:val="center"/>
-      </w:pPr>
-      <w:r>
-        <w:rPr>
-          <w:color w:val="555B66"/>
-          <w:sz w:val="18"/>
-        </w:rPr>
-        <w:t>Figure 5. Share of pairs significant in TCGA in the same direction. Bracketed values are the number of pairs testable in TCGA.</w:t>
       </w:r>
     </w:p>
     <w:tbl>
@@ -23367,312 +23354,6 @@
         </w:tc>
       </w:tr>
     </w:tbl>
-    <w:p>
-      <w:pPr>
-        <w:spacing w:after="40"/>
-      </w:pPr>
-    </w:p>
-    <w:p>
-      <w:pPr>
-        <w:pStyle w:val="ListBullet"/>
-        <w:spacing w:after="60"/>
-      </w:pPr>
-      <w:r>
-        <w:t xml:space="preserve">Replicated candidates validate </w:t>
-      </w:r>
-      <w:r>
-        <w:rPr>
-          <w:b/>
-        </w:rPr>
-        <w:t>6.5x more often</w:t>
-      </w:r>
-      <w:r>
-        <w:t xml:space="preserve"> than GENIE-null pairs, and none reverses. </w:t>
-      </w:r>
-      <w:r>
-        <w:rPr>
-          <w:i/>
-        </w:rPr>
-        <w:t>KEAP1</w:t>
-      </w:r>
-      <w:r>
-        <w:t>/</w:t>
-      </w:r>
-      <w:r>
-        <w:rPr>
-          <w:i/>
-        </w:rPr>
-        <w:t>STK11</w:t>
-      </w:r>
-      <w:r>
-        <w:t xml:space="preserve">, </w:t>
-      </w:r>
-      <w:r>
-        <w:rPr>
-          <w:i/>
-        </w:rPr>
-        <w:t>EGFR</w:t>
-      </w:r>
-      <w:r>
-        <w:t>/</w:t>
-      </w:r>
-      <w:r>
-        <w:rPr>
-          <w:i/>
-        </w:rPr>
-        <w:t>KRAS</w:t>
-      </w:r>
-      <w:r>
-        <w:t xml:space="preserve">, </w:t>
-      </w:r>
-      <w:r>
-        <w:rPr>
-          <w:i/>
-        </w:rPr>
-        <w:t>CCND1</w:t>
-      </w:r>
-      <w:r>
-        <w:t>/</w:t>
-      </w:r>
-      <w:r>
-        <w:rPr>
-          <w:i/>
-        </w:rPr>
-        <w:t>FGFR1</w:t>
-      </w:r>
-      <w:r>
-        <w:t xml:space="preserve"> and </w:t>
-      </w:r>
-      <w:r>
-        <w:rPr>
-          <w:i/>
-        </w:rPr>
-        <w:t>CDKN2A</w:t>
-      </w:r>
-      <w:r>
-        <w:t>/</w:t>
-      </w:r>
-      <w:r>
-        <w:rPr>
-          <w:i/>
-        </w:rPr>
-        <w:t>EGFR</w:t>
-      </w:r>
-      <w:r>
-        <w:t xml:space="preserve"> are confirmed.</w:t>
-      </w:r>
-    </w:p>
-    <w:p>
-      <w:pPr>
-        <w:pStyle w:val="ListBullet"/>
-        <w:spacing w:after="60"/>
-      </w:pPr>
-      <w:r>
-        <w:t>TCGA is about 20x smaller, so a non-significant TCGA result mostly reflects low power.</w:t>
-      </w:r>
-    </w:p>
-    <w:p>
-      <w:pPr>
-        <w:pStyle w:val="ListBullet"/>
-        <w:spacing w:after="60"/>
-      </w:pPr>
-      <w:r>
-        <w:t>Agreement is lowest in lung cancer (79%), where TCGA is half squamous and smoking-related while GENIE is mostly adenocarcinoma.</w:t>
-      </w:r>
-    </w:p>
-    <w:p>
-      <w:pPr>
-        <w:pStyle w:val="Heading2"/>
-      </w:pPr>
-      <w:r>
-        <w:t>10.2  An independent statistical route: conditional selection</w:t>
-      </w:r>
-    </w:p>
-    <w:p>
-      <w:r>
-        <w:t>Borrowing Coselens' idea (</w:t>
-      </w:r>
-      <w:r>
-        <w:rPr>
-          <w:rFonts w:ascii="Menlo" w:hAnsi="Menlo" w:eastAsia="Menlo"/>
-          <w:sz w:val="18"/>
-        </w:rPr>
-        <w:t>17_conditional_selection_dnds.py</w:t>
-      </w:r>
-      <w:r>
-        <w:t>): if gene A helps gene B get selected, B's ratio of protein-changing to silent mutations should be higher in A-mutant tumours. Silent mutations measure each group's background mutation rate, so this controls mutation load by a completely different route than the conditional test.</w:t>
-      </w:r>
-    </w:p>
-    <w:p>
-      <w:pPr>
-        <w:pStyle w:val="ListBullet"/>
-        <w:spacing w:after="60"/>
-      </w:pPr>
-      <w:r>
-        <w:t xml:space="preserve">219 testable directions among mutation-driven replicated candidates; direction agrees with Phase 2 in </w:t>
-      </w:r>
-      <w:r>
-        <w:rPr>
-          <w:b/>
-        </w:rPr>
-        <w:t>84%</w:t>
-      </w:r>
-      <w:r>
-        <w:t xml:space="preserve">, and in </w:t>
-      </w:r>
-      <w:r>
-        <w:rPr>
-          <w:b/>
-        </w:rPr>
-        <w:t>100% of the 53</w:t>
-      </w:r>
-      <w:r>
-        <w:t xml:space="preserve"> that are themselves significant.</w:t>
-      </w:r>
-    </w:p>
-    <w:p>
-      <w:pPr>
-        <w:pStyle w:val="ListBullet"/>
-        <w:spacing w:after="60"/>
-      </w:pPr>
-      <w:r>
-        <w:t xml:space="preserve">Example: </w:t>
-      </w:r>
-      <w:r>
-        <w:rPr>
-          <w:i/>
-        </w:rPr>
-        <w:t>IDH1</w:t>
-      </w:r>
-      <w:r>
-        <w:t xml:space="preserve">-mutant gliomas carry 8x more protein-changing (relative to silent) </w:t>
-      </w:r>
-      <w:r>
-        <w:rPr>
-          <w:i/>
-        </w:rPr>
-        <w:t>CIC</w:t>
-      </w:r>
-      <w:r>
-        <w:t xml:space="preserve"> mutations than </w:t>
-      </w:r>
-      <w:r>
-        <w:rPr>
-          <w:i/>
-        </w:rPr>
-        <w:t>IDH1</w:t>
-      </w:r>
-      <w:r>
-        <w:t>-wild-type gliomas, the biology of oligodendroglioma.</w:t>
-      </w:r>
-    </w:p>
-    <w:p>
-      <w:pPr>
-        <w:pStyle w:val="ListBullet"/>
-        <w:spacing w:after="60"/>
-      </w:pPr>
-      <w:r>
-        <w:t>Limit: panels report few silent mutations per gene, and subtype confounding is shared with the main analysis.</w:t>
-      </w:r>
-    </w:p>
-    <w:p>
-      <w:pPr>
-        <w:pStyle w:val="Heading2"/>
-      </w:pPr>
-      <w:r>
-        <w:t>10.3  Partial pooling across cancer types</w:t>
-      </w:r>
-    </w:p>
-    <w:p>
-      <w:r>
-        <w:t>Borrowing Scharpf's idea (</w:t>
-      </w:r>
-      <w:r>
-        <w:rPr>
-          <w:rFonts w:ascii="Menlo" w:hAnsi="Menlo" w:eastAsia="Menlo"/>
-          <w:sz w:val="18"/>
-        </w:rPr>
-        <w:t>18_hierarchical_shrinkage.py</w:t>
-      </w:r>
-      <w:r>
-        <w:t>): pull each cancer type's effect toward the pair's pooled effect, more when the estimate is noisy. Against TCGA effects over 2,152 testable pairs, correlation rises 0.691 → 0.700 and squared error falls 0.206 → 0.195; for noisy estimates (&lt;30 co-altered patients) correlation rises 0.558 → 0.577. A modest gain that also blurs cancer-type specificity, so pooled estimates are kept as an extra column, not used for headline calls.</w:t>
-      </w:r>
-    </w:p>
-    <w:p>
-      <w:pPr>
-        <w:pStyle w:val="Heading2"/>
-      </w:pPr>
-      <w:r>
-        <w:t>10.4  Head-to-head benchmark of the method families</w:t>
-      </w:r>
-    </w:p>
-    <w:p>
-      <w:r>
-        <w:rPr>
-          <w:rFonts w:ascii="Menlo" w:hAnsi="Menlo" w:eastAsia="Menlo"/>
-          <w:sz w:val="18"/>
-        </w:rPr>
-        <w:t>15_method_benchmark.py</w:t>
-      </w:r>
-      <w:r>
-        <w:rPr>
-          <w:b w:val="0"/>
-        </w:rPr>
-        <w:t xml:space="preserve"> ran each family on identical patients and pairs (9 cancer types, 2,553 pairs, panels covering every gene used) and scored it two ways: false positives on null data that keep every patient's alteration count and every gene's frequency but destroy gene-gene links, and replication of each method's significant calls in TCGA. SELECT (Mina 2017) was re-implemented from its published Methods S1 (weighted mutual information, 1,000 margin-preserving randomisations within subtypes, effect size and empirical FDR); a first simplified “SELECT-style” score without a null was withdrawn because it was not SELECT.</w:t>
-      </w:r>
-    </w:p>
-    <w:p>
-      <w:pPr>
-        <w:keepNext/>
-        <w:jc w:val="center"/>
-      </w:pPr>
-      <w:r>
-        <w:drawing>
-          <wp:inline xmlns:a="http://schemas.openxmlformats.org/drawingml/2006/main" xmlns:pic="http://schemas.openxmlformats.org/drawingml/2006/picture">
-            <wp:extent cx="5577840" cy="5332631"/>
-            <wp:docPr id="12" name="Picture 12"/>
-            <wp:cNvGraphicFramePr>
-              <a:graphicFrameLocks noChangeAspect="1"/>
-            </wp:cNvGraphicFramePr>
-            <a:graphic>
-              <a:graphicData uri="http://schemas.openxmlformats.org/drawingml/2006/picture">
-                <pic:pic>
-                  <pic:nvPicPr>
-                    <pic:cNvPr id="0" name="figure_validation.png"/>
-                    <pic:cNvPicPr/>
-                  </pic:nvPicPr>
-                  <pic:blipFill>
-                    <a:blip r:embed="rId23"/>
-                    <a:stretch>
-                      <a:fillRect/>
-                    </a:stretch>
-                  </pic:blipFill>
-                  <pic:spPr>
-                    <a:xfrm>
-                      <a:off x="0" y="0"/>
-                      <a:ext cx="5577840" cy="5332631"/>
-                    </a:xfrm>
-                    <a:prstGeom prst="rect"/>
-                  </pic:spPr>
-                </pic:pic>
-              </a:graphicData>
-            </a:graphic>
-          </wp:inline>
-        </w:drawing>
-      </w:r>
-    </w:p>
-    <w:p>
-      <w:pPr>
-        <w:jc w:val="center"/>
-      </w:pPr>
-      <w:r>
-        <w:rPr>
-          <w:color w:val="555B66"/>
-          <w:sz w:val="18"/>
-        </w:rPr>
-        <w:t>Figure 6. Phase 2b validation at a glance (results/figures/phase2b_validation/figure_phase2b). a, TCGA: of the pairs TCGA can test, how many keep their direction and are significant there (n under each bar); b, GENIE vs TCGA effect for every candidate testable in both, well-known pairs circled; c, method benchmark; d, agreement with the literature and the SelectSim atlas.</w:t>
-      </w:r>
-    </w:p>
     <w:tbl>
       <w:tblPr>
         <w:tblW w:type="auto" w:w="0"/>
@@ -24739,160 +24420,6 @@
         </w:tc>
       </w:tr>
     </w:tbl>
-    <w:p>
-      <w:pPr>
-        <w:spacing w:after="40"/>
-      </w:pPr>
-    </w:p>
-    <w:p>
-      <w:pPr>
-        <w:pStyle w:val="ListBullet"/>
-        <w:spacing w:after="60"/>
-      </w:pPr>
-      <w:r>
-        <w:rPr>
-          <w:b/>
-        </w:rPr>
-        <w:rPr>
-          <w:b/>
-        </w:rPr>
-        <w:t>Calibration needs a margin-preserving null.</w:t>
-      </w:r>
-      <w:r>
-        <w:rPr>
-          <w:b w:val="0"/>
-        </w:rPr>
-        <w:t xml:space="preserve"> The conditional test (exact) and SELECT (by randomisation) are both calibrated; Fisher over-calls, and the DISCOVER-style plug-in is worst, with 18% of null pairs surviving FDR, all as false exclusivity.</w:t>
-      </w:r>
-    </w:p>
-    <w:p>
-      <w:pPr>
-        <w:pStyle w:val="ListBullet"/>
-        <w:spacing w:after="60"/>
-      </w:pPr>
-      <w:r>
-        <w:rPr>
-          <w:b/>
-        </w:rPr>
-        <w:rPr>
-          <w:b/>
-        </w:rPr>
-        <w:t>Our calls replicate best</w:t>
-      </w:r>
-      <w:r>
-        <w:rPr>
-          <w:b w:val="0"/>
-        </w:rPr>
-        <w:t xml:space="preserve"> (37% vs 34% for SELECT and 29% for Fisher) with fewer calls: the extra calls of the other methods are mostly the ones that fail.</w:t>
-      </w:r>
-    </w:p>
-    <w:p>
-      <w:pPr>
-        <w:pStyle w:val="ListBullet"/>
-        <w:spacing w:after="60"/>
-      </w:pPr>
-      <w:r>
-        <w:rPr>
-          <w:b/>
-        </w:rPr>
-        <w:t>The strongest pairs are found by every method</w:t>
-      </w:r>
-      <w:r>
-        <w:t xml:space="preserve"> (84-92% of each method's top 50 replicate). Methods differ on the marginal calls, which is where false positives live, and where a clinician's query usually lands.</w:t>
-      </w:r>
-    </w:p>
-    <w:p>
-      <w:pPr>
-        <w:pStyle w:val="ListBullet"/>
-        <w:spacing w:after="60"/>
-      </w:pPr>
-      <w:r>
-        <w:rPr>
-          <w:b/>
-        </w:rPr>
-        <w:t>Honest caveat:</w:t>
-      </w:r>
-      <w:r>
-        <w:t xml:space="preserve"> subtype strata rank slightly lower at the top 200 pairs (56% vs 63% for the conditional test without strata), because the pairs they remove are subtype markers that TCGA reproduces too. External replication cannot penalise an artefact the two cohorts share, so the case for strata rests on the removed pairs being textbook subtype markers (</w:t>
-      </w:r>
-      <w:r>
-        <w:rPr>
-          <w:i/>
-        </w:rPr>
-        <w:t>CIC</w:t>
-      </w:r>
-      <w:r>
-        <w:t xml:space="preserve"> vs </w:t>
-      </w:r>
-      <w:r>
-        <w:rPr>
-          <w:i/>
-        </w:rPr>
-        <w:t>PTEN</w:t>
-      </w:r>
-      <w:r>
-        <w:t xml:space="preserve">, </w:t>
-      </w:r>
-      <w:r>
-        <w:rPr>
-          <w:i/>
-        </w:rPr>
-        <w:t>CDH1</w:t>
-      </w:r>
-      <w:r>
-        <w:t xml:space="preserve"> vs </w:t>
-      </w:r>
-      <w:r>
-        <w:rPr>
-          <w:i/>
-        </w:rPr>
-        <w:t>ERBB2</w:t>
-      </w:r>
-      <w:r>
-        <w:t>).</w:t>
-      </w:r>
-    </w:p>
-    <w:p>
-      <w:pPr>
-        <w:pStyle w:val="ListBullet"/>
-        <w:spacing w:after="60"/>
-      </w:pPr>
-      <w:r>
-        <w:rPr>
-          <w:b/>
-        </w:rPr>
-        <w:rPr>
-          <w:b/>
-        </w:rPr>
-        <w:t>SELECT ranks the very strongest pairs best</w:t>
-      </w:r>
-      <w:r>
-        <w:rPr>
-          <w:b w:val="0"/>
-        </w:rPr>
-        <w:t xml:space="preserve"> (96% of its top 50 and 84% of its top 100 replicate): its effect size is a good ranking score. Our advantage is the precision of the significant list, not the top of the ranking.</w:t>
-      </w:r>
-    </w:p>
-    <w:p>
-      <w:pPr>
-        <w:pStyle w:val="Heading2"/>
-      </w:pPr>
-      <w:r>
-        <w:t>10.5  Exclusive gene sets: does the load-aware idea carry over?</w:t>
-      </w:r>
-    </w:p>
-    <w:p>
-      <w:r>
-        <w:rPr>
-          <w:rFonts w:ascii="Menlo" w:hAnsi="Menlo" w:eastAsia="Menlo"/>
-          <w:sz w:val="18"/>
-        </w:rPr>
-        <w:t>16_exclusive_gene_sets.py</w:t>
-      </w:r>
-      <w:r>
-        <w:t xml:space="preserve"> compared Dendrix's “coverage minus overlap” score with a load-aware version that uses the conditional model's expected overlap. Both scored every gene triple among the 35 most altered genes in 6 cancer types, judged by whether the top 20 sets form one known pathway.</w:t>
-      </w:r>
-    </w:p>
     <w:tbl>
       <w:tblPr>
         <w:tblW w:type="auto" w:w="0"/>
@@ -25259,267 +24786,6 @@
         </w:tc>
       </w:tr>
     </w:tbl>
-    <w:p>
-      <w:pPr>
-        <w:spacing w:after="40"/>
-      </w:pPr>
-    </w:p>
-    <w:p>
-      <w:r>
-        <w:t xml:space="preserve">The top load-aware sets are textbook pathways: </w:t>
-      </w:r>
-      <w:r>
-        <w:rPr>
-          <w:i/>
-        </w:rPr>
-        <w:t>BRAF</w:t>
-      </w:r>
-      <w:r>
-        <w:t>/</w:t>
-      </w:r>
-      <w:r>
-        <w:rPr>
-          <w:i/>
-        </w:rPr>
-        <w:t>KRAS</w:t>
-      </w:r>
-      <w:r>
-        <w:t>/</w:t>
-      </w:r>
-      <w:r>
-        <w:rPr>
-          <w:i/>
-        </w:rPr>
-        <w:t>NRAS</w:t>
-      </w:r>
-      <w:r>
-        <w:t xml:space="preserve"> (colorectal), </w:t>
-      </w:r>
-      <w:r>
-        <w:rPr>
-          <w:i/>
-        </w:rPr>
-        <w:t>AKT1</w:t>
-      </w:r>
-      <w:r>
-        <w:t>/</w:t>
-      </w:r>
-      <w:r>
-        <w:rPr>
-          <w:i/>
-        </w:rPr>
-        <w:t>PIK3CA</w:t>
-      </w:r>
-      <w:r>
-        <w:t>/</w:t>
-      </w:r>
-      <w:r>
-        <w:rPr>
-          <w:i/>
-        </w:rPr>
-        <w:t>PIK3R1</w:t>
-      </w:r>
-      <w:r>
-        <w:t xml:space="preserve"> (endometrial), </w:t>
-      </w:r>
-      <w:r>
-        <w:rPr>
-          <w:i/>
-        </w:rPr>
-        <w:t>CDK4</w:t>
-      </w:r>
-      <w:r>
-        <w:t>/</w:t>
-      </w:r>
-      <w:r>
-        <w:rPr>
-          <w:i/>
-        </w:rPr>
-        <w:t>CDKN2A</w:t>
-      </w:r>
-      <w:r>
-        <w:t>/</w:t>
-      </w:r>
-      <w:r>
-        <w:rPr>
-          <w:i/>
-        </w:rPr>
-        <w:t>RB1</w:t>
-      </w:r>
-      <w:r>
-        <w:t xml:space="preserve"> (glioma), </w:t>
-      </w:r>
-      <w:r>
-        <w:rPr>
-          <w:i/>
-        </w:rPr>
-        <w:t>EGFR</w:t>
-      </w:r>
-      <w:r>
-        <w:t>/</w:t>
-      </w:r>
-      <w:r>
-        <w:rPr>
-          <w:i/>
-        </w:rPr>
-        <w:t>ERBB2</w:t>
-      </w:r>
-      <w:r>
-        <w:t>/</w:t>
-      </w:r>
-      <w:r>
-        <w:rPr>
-          <w:i/>
-        </w:rPr>
-        <w:t>KRAS</w:t>
-      </w:r>
-      <w:r>
-        <w:t xml:space="preserve"> (lung). Dendrix instead bundles </w:t>
-      </w:r>
-      <w:r>
-        <w:rPr>
-          <w:i/>
-        </w:rPr>
-        <w:t>TP53</w:t>
-      </w:r>
-      <w:r>
-        <w:t xml:space="preserve"> with other common genes (</w:t>
-      </w:r>
-      <w:r>
-        <w:rPr>
-          <w:i/>
-        </w:rPr>
-        <w:t>ATM</w:t>
-      </w:r>
-      <w:r>
-        <w:t>/</w:t>
-      </w:r>
-      <w:r>
-        <w:rPr>
-          <w:i/>
-        </w:rPr>
-        <w:t>SMAD2</w:t>
-      </w:r>
-      <w:r>
-        <w:t>/</w:t>
-      </w:r>
-      <w:r>
-        <w:rPr>
-          <w:i/>
-        </w:rPr>
-        <w:t>TP53</w:t>
-      </w:r>
-      <w:r>
-        <w:t xml:space="preserve">, </w:t>
-      </w:r>
-      <w:r>
-        <w:rPr>
-          <w:i/>
-        </w:rPr>
-        <w:t>KRAS</w:t>
-      </w:r>
-      <w:r>
-        <w:t>/</w:t>
-      </w:r>
-      <w:r>
-        <w:rPr>
-          <w:i/>
-        </w:rPr>
-        <w:t>MDM2</w:t>
-      </w:r>
-      <w:r>
-        <w:t>/</w:t>
-      </w:r>
-      <w:r>
-        <w:rPr>
-          <w:i/>
-        </w:rPr>
-        <w:t>TP53</w:t>
-      </w:r>
-      <w:r>
-        <w:t xml:space="preserve">), because a coverage score that ignores mutation load rewards whatever is frequent. </w:t>
-      </w:r>
-      <w:r>
-        <w:rPr>
-          <w:b/>
-        </w:rPr>
-        <w:t>The load-aware null matters for sets as it does for pairs.</w:t>
-      </w:r>
-    </w:p>
-    <w:p>
-      <w:pPr>
-        <w:pStyle w:val="Heading2"/>
-      </w:pPr>
-      <w:r>
-        <w:t>10.6  Mutation-load confounding: van de Haar's diagnostic (notebook 02c, Section L)</w:t>
-      </w:r>
-    </w:p>
-    <w:p>
-      <w:r>
-        <w:rPr>
-          <w:rFonts w:ascii="Menlo" w:hAnsi="Menlo" w:eastAsia="Menlo"/>
-          <w:sz w:val="18"/>
-        </w:rPr>
-        <w:t>21_mutation_load_confounding.py</w:t>
-      </w:r>
-      <w:r>
-        <w:t xml:space="preserve"> runs the check van de Haar et al. (2019) used to show that most published mutual exclusivity is confounded by mutation load. Each gene gets a mutation load association (MLA): is it altered more in low-load or high-load tumours? On exome data, every method they tested called far more exclusive pairs for low-MLA genes (correlation r = -0.60 to -0.87).</w:t>
-      </w:r>
-    </w:p>
-    <w:p>
-      <w:pPr>
-        <w:pStyle w:val="ListBullet"/>
-        <w:spacing w:after="60"/>
-      </w:pPr>
-      <w:r>
-        <w:rPr>
-          <w:b/>
-        </w:rPr>
-        <w:t xml:space="preserve">Not seen on GENIE panels in our design. </w:t>
-      </w:r>
-      <w:r>
-        <w:rPr>
-          <w:b w:val="0"/>
-        </w:rPr>
-        <w:t>With non-hypermutated tumours only, the correlation is slightly positive for every method (Fisher +0.09, DISCOVER-style +0.19, SELECT +0.07, ours +0.13).</w:t>
-      </w:r>
-    </w:p>
-    <w:p>
-      <w:pPr>
-        <w:pStyle w:val="ListBullet"/>
-        <w:spacing w:after="60"/>
-      </w:pPr>
-      <w:r>
-        <w:rPr>
-          <w:b/>
-        </w:rPr>
-        <w:t xml:space="preserve">A weak version appears once hypermutated tumours are included </w:t>
-      </w:r>
-      <w:r>
-        <w:rPr>
-          <w:b w:val="0"/>
-        </w:rPr>
-        <w:t>(Fisher -0.24, ours -0.23): our test alone does not remove it.</w:t>
-      </w:r>
-    </w:p>
-    <w:p>
-      <w:pPr>
-        <w:pStyle w:val="ListBullet"/>
-        <w:spacing w:after="60"/>
-      </w:pPr>
-      <w:r>
-        <w:rPr>
-          <w:b/>
-        </w:rPr>
-        <w:t xml:space="preserve">So the split removes it. </w:t>
-      </w:r>
-      <w:r>
-        <w:rPr>
-          <w:b w:val="0"/>
-        </w:rPr>
-        <w:t>Analysing non-hypermutated tumours separately (Prof. Wong's suggestion) is what protects against load confounding; the conditional test protects calibration. They fix different problems, which is why the design keeps both.</w:t>
-      </w:r>
-    </w:p>
     <w:tbl>
       <w:tblPr>
         <w:tblW w:type="auto" w:w="0"/>
@@ -25572,7 +24838,7 @@
               <w:rPr>
                 <w:sz w:val="20"/>
               </w:rPr>
-              <w:t>•  The main design choice is confirmed from three directions: null calibration, independent patients (TCGA) and an independent signal (silent-mutation ratios).</w:t>
+              <w:t>•  Highest precision (99% in realistic simulation; 2% of unlinked pairs called), and the most real links found at any given precision.</w:t>
             </w:r>
           </w:p>
           <w:p>
@@ -25583,7 +24849,7 @@
               <w:rPr>
                 <w:sz w:val="20"/>
               </w:rPr>
-              <w:t>•  The advantage is in the long tail of moderate effects, not in headline pairs.</w:t>
+              <w:t>•  All methods find the famous pairs; ours misses some weak and exclusive links -- the cost of a stricter test.</w:t>
             </w:r>
           </w:p>
           <w:p>
@@ -25605,7 +24871,7 @@
               <w:rPr>
                 <w:sz w:val="20"/>
               </w:rPr>
-              <w:t>•  SELECT, re-implemented faithfully, is the closest alternative: calibrated and best at ranking the strongest pairs. Shrinkage was borrowed but not adopted (small gain, blurs specificity).</w:t>
+              <w:t>•  SELECT, re-implemented faithfully, is the closest alternative: calibrated, but with 52% precision in realistic simulation; slightly better at ranking the very strongest pairs.</w:t>
             </w:r>
           </w:p>
           <w:p>
@@ -25627,20 +24893,18 @@
               <w:rPr>
                 <w:sz w:val="20"/>
               </w:rPr>
-              <w:t xml:space="preserve">All tables of this part are reproduced in </w:t>
+              <w:t>All tables of this part are reproduced in notebooks/02b_phase2_validation.ipynb (side checks in 02c).</w:t>
             </w:r>
             <w:r>
               <w:rPr>
                 <w:rFonts w:ascii="Menlo" w:hAnsi="Menlo" w:eastAsia="Menlo"/>
                 <w:sz w:val="20"/>
               </w:rPr>
-              <w:t>notebooks/02b_phase2_validation.ipynb</w:t>
             </w:r>
             <w:r>
               <w:rPr>
                 <w:sz w:val="20"/>
               </w:rPr>
-              <w:t>.</w:t>
             </w:r>
           </w:p>
         </w:tc>
@@ -25648,26 +24912,251 @@
     </w:tbl>
     <w:p>
       <w:pPr>
-        <w:spacing w:after="40"/>
+        <w:pStyle w:val="Heading2"/>
       </w:pPr>
+      <w:r>
+        <w:t>10.1  What a good test must do</w:t>
+      </w:r>
+    </w:p>
+    <w:p>
+      <w:pPr/>
+      <w:r>
+        <w:t>Two measures, equally important: precision (of the pairs the test calls, how many are real) and recall (of the real pairs, how many it finds). A test that calls nothing makes no wrong calls but finds nothing; one that calls everything finds every real pair among thousands of wrong ones. notebooks/02b_phase2_validation.ipynb reports both, comparing our test with Fisher's test (cBioPortal, maftools), a DISCOVER-style test and SELECT (Mina 2017, re-implemented from its published methods) on identical data.</w:t>
+      </w:r>
+    </w:p>
+    <w:p>
+      <w:pPr>
+        <w:pStyle w:val="Heading2"/>
+      </w:pPr>
+      <w:r>
+        <w:t>10.2  Data with no real links</w:t>
+      </w:r>
+    </w:p>
+    <w:p>
+      <w:pPr>
+        <w:pStyle w:val="ListBullet"/>
+      </w:pPr>
+      <w:r>
+        <w:t>Real data from 9 cancer types, shuffled so every patient keeps its number of alterations and every gene its frequency, but any link between genes is destroyed (15_method_benchmark.py). Every call here is false.</w:t>
+      </w:r>
+    </w:p>
+    <w:p>
+      <w:pPr>
+        <w:pStyle w:val="ListBullet"/>
+      </w:pPr>
+      <w:r>
+        <w:t>Fisher calls 11% of these pairs at p &lt; 0.05 and the DISCOVER-style test 33% (18% even after FDR): both mistake a tumour's alteration load for gene-gene interaction. Ours calls 2% (0% after FDR), SELECT 4%.</w:t>
+      </w:r>
+    </w:p>
+    <w:p>
+      <w:pPr>
+        <w:pStyle w:val="ListBullet"/>
+      </w:pPr>
+      <w:r>
+        <w:t>In real data, no candidate is significant in the opposite direction in TCGA.</w:t>
+      </w:r>
+    </w:p>
+    <w:p>
+      <w:pPr>
+        <w:pStyle w:val="Heading2"/>
+      </w:pPr>
+      <w:r>
+        <w:t>10.3  Precision and recall: a simulation where the truth is known</w:t>
+      </w:r>
+    </w:p>
+    <w:p>
+      <w:pPr/>
+      <w:r>
+        <w:t>22_planted_signal_simulation.py plants links of known strength (co-occurring at 1.5x, 2x, 3x; exclusive at 1/1.5, 1/2, 1/3) into data without links, 4 per cancer type, and runs every method on the same data. To avoid a set-up that favours our test, the background is made three ways: S1 from our own model (a sanity check), S2 the real data with links removed (realistic), and S3 with what our test does not model -- a hidden patient group and some hypermutated-like patients (a stress test). A planted link counts as found only if called in the right direction.</w:t>
+      </w:r>
+    </w:p>
+    <w:p>
+      <w:pPr>
+        <w:pStyle w:val="ListBullet"/>
+      </w:pPr>
+      <w:r>
+        <w:t>Realistic data (S2), q &lt; 0.05: ours has precision 99% and recall 51%; SELECT 52% and 48%. Fisher and DISCOVER-style reach recall 58-63% only at a precision of 3.5-7%.</w:t>
+      </w:r>
+    </w:p>
+    <w:p>
+      <w:pPr>
+        <w:pStyle w:val="ListBullet"/>
+      </w:pPr>
+      <w:r>
+        <w:t>At the same precision, ours finds the most: recall 57% at 95% precision, against 19% for SELECT and 4% or less for Fisher and DISCOVER-style. This is the fair comparison, because any method raises its recall by calling more pairs, at the cost of precision.</w:t>
+      </w:r>
+    </w:p>
+    <w:p>
+      <w:pPr>
+        <w:pStyle w:val="ListBullet"/>
+      </w:pPr>
+      <w:r>
+        <w:t>What ours misses: weak co-occurrence (1.5x) and part of the exclusive links (recall 31-56%). Avoidance is harder to detect -- a shortfall of patients with both, bounded at zero. A looser cut-off (q &lt; 0.2) raises recall by 7 points but lowers precision to 90%, so a second, looser tier was not added.</w:t>
+      </w:r>
+    </w:p>
+    <w:p>
+      <w:pPr>
+        <w:pStyle w:val="ListBullet"/>
+      </w:pPr>
+      <w:r>
+        <w:t>S1: precision 91%; every wrong call shares a gene with a planted link (a by-product of moving alterations when planting); among unlinked pairs only 2.4% reach p &lt; 0.05.</w:t>
+      </w:r>
+    </w:p>
+    <w:p>
+      <w:pPr>
+        <w:pStyle w:val="ListBullet"/>
+      </w:pPr>
+      <w:r>
+        <w:t>Limit (S3): a strong hidden patient group that no test sees breaks every method, ours included (precision 1-8%). The test is only as good as its strata -- which is why rates are fitted within detailed subtypes and hypermutated tumours are analysed separately.</w:t>
+      </w:r>
+    </w:p>
+    <w:p>
+      <w:pPr>
+        <w:keepNext/>
+        <w:jc w:val="center"/>
+      </w:pPr>
+      <w:r>
+        <w:drawing>
+          <wp:inline xmlns:a="http://schemas.openxmlformats.org/drawingml/2006/main" xmlns:pic="http://schemas.openxmlformats.org/drawingml/2006/picture">
+            <wp:extent cx="5577840" cy="7314946"/>
+            <wp:docPr id="12" name="Picture 12"/>
+            <wp:cNvGraphicFramePr>
+              <a:graphicFrameLocks noChangeAspect="1"/>
+            </wp:cNvGraphicFramePr>
+            <a:graphic>
+              <a:graphicData uri="http://schemas.openxmlformats.org/drawingml/2006/picture">
+                <pic:pic>
+                  <pic:nvPicPr>
+                    <pic:cNvPr id="0" name="figure_validation.png"/>
+                    <pic:cNvPicPr/>
+                  </pic:nvPicPr>
+                  <pic:blipFill>
+                    <a:blip r:embed="rId23"/>
+                    <a:stretch>
+                      <a:fillRect/>
+                    </a:stretch>
+                  </pic:blipFill>
+                  <pic:spPr>
+                    <a:xfrm>
+                      <a:off x="0" y="0"/>
+                      <a:ext cx="5577840" cy="7314946"/>
+                    </a:xfrm>
+                    <a:prstGeom prst="rect"/>
+                  </pic:spPr>
+                </pic:pic>
+              </a:graphicData>
+            </a:graphic>
+          </wp:inline>
+        </w:drawing>
+      </w:r>
+    </w:p>
+    <w:p>
+      <w:pPr/>
+      <w:r>
+        <w:t>Figure 6. Phase 2b at a glance (results/figures/phase2b_validation/figure_phase2b). a, precision at q &lt; 0.05 in the three scenarios; b, recall by link strength (S2); c, precision-recall curves, circles = q &lt; 0.05 (S2); d, recall of textbook pairs in real data; e, effect in GENIE vs TCGA for every candidate.</w:t>
+      </w:r>
+    </w:p>
+    <w:p>
+      <w:pPr>
+        <w:pStyle w:val="Heading2"/>
+      </w:pPr>
+      <w:r>
+        <w:t>10.4  Known biology</w:t>
+      </w:r>
+    </w:p>
+    <w:p>
+      <w:pPr>
+        <w:pStyle w:val="ListBullet"/>
+      </w:pPr>
+      <w:r>
+        <w:t>29 textbook pairs with a published direction, chosen from the literature before looking at our results (data/curated/textbook_pairs.csv, with DOIs): ours finds 26, Fisher 28, DISCOVER-style and SELECT 27. Ours misses three weaker ones (PIK3CA + PTEN in breast and endometrial cancer, BRAF + NRAS in colorectal cancer).</w:t>
+      </w:r>
+    </w:p>
+    <w:p>
+      <w:pPr>
+        <w:pStyle w:val="ListBullet"/>
+      </w:pPr>
+      <w:r>
+        <w:t>The 10 strongest exclusive pairs are all established biology (e.g. ALK fusion vs EGFR/KRAS, GNAQ vs GNA11, H3F3A vs IDH1, ERG fusion vs SPOP). Of the 10 strongest co-occurring pairs, 5 are established, CD79B + GATA3 is a suspected subtype-marker artefact, and 4 are not yet explained: BRAF + SETD2 and CTNNB1 + SMAD4 in lung cancer, NF1 + PTPN11 in glioma, APC + SPOP in prostate cancer (data/curated/top_pairs_biology.csv).</w:t>
+      </w:r>
+    </w:p>
+    <w:p>
+      <w:pPr>
+        <w:pStyle w:val="ListBullet"/>
+      </w:pPr>
+      <w:r>
+        <w:t>Of the 386 robust pairs, 234 are well known and 109 have some reports; every pair also in the SelectSim atlas for the same cancer type agrees in direction.</w:t>
+      </w:r>
+    </w:p>
+    <w:p>
+      <w:pPr>
+        <w:pStyle w:val="Heading2"/>
+      </w:pPr>
+      <w:r>
+        <w:t>10.5  Independent patients: TCGA</w:t>
+      </w:r>
+    </w:p>
+    <w:p>
+      <w:pPr/>
+      <w:r>
+        <w:t>14_tcga_external_validation.py re-tests the same pairs with the same test in the TCGA PanCancer Atlas (independent patients, whole-exome sequencing, other centres and calling pipelines, non-hypermutated). Nothing is fitted again. TCGA is about 20x smaller, so direction and effect size are the main measures; significance in TCGA mostly reflects how many TCGA patients carry the pair.</w:t>
+      </w:r>
+    </w:p>
+    <w:p>
+      <w:pPr>
+        <w:pStyle w:val="ListBullet"/>
+      </w:pPr>
+      <w:r>
+        <w:t>Candidates keep their direction in 88% of testable pairs (replicated candidates 94%). Control pairs, not significant in GENIE, still agree 69% of the time -- so direction is only meaningful against that baseline.</w:t>
+      </w:r>
+    </w:p>
+    <w:p>
+      <w:pPr>
+        <w:pStyle w:val="ListBullet"/>
+      </w:pPr>
+      <w:r>
+        <w:t>Effect sizes correlate across the two cohorts (Spearman 0.74; 0.82 for replicated candidates; 0.43 for controls), and agreement rises with GENIE signal strength (strongest quarter of candidates: 98% same direction, 66% significant).</w:t>
+      </w:r>
+    </w:p>
+    <w:p>
+      <w:pPr>
+        <w:pStyle w:val="ListBullet"/>
+      </w:pPr>
+      <w:r>
+        <w:t>Agreement is lowest in lung cancer, where TCGA is half squamous and smoking-related while GENIE is mostly adenocarcinoma.</w:t>
+      </w:r>
+    </w:p>
+    <w:p>
+      <w:pPr>
+        <w:pStyle w:val="Heading2"/>
+      </w:pPr>
+      <w:r>
+        <w:t>10.6  Side checks (notebook 02c)</w:t>
+      </w:r>
+    </w:p>
+    <w:p>
+      <w:pPr>
+        <w:pStyle w:val="ListBullet"/>
+      </w:pPr>
+      <w:r>
+        <w:t>Mutation-load confounding (21_mutation_load_confounding.py; van de Haar 2019's diagnostic): not seen with non-hypermutated tumours for any method (correlations +0.07 to +0.19); a weak version appears once hypermutated tumours are included (Fisher -0.24, ours -0.23). The split, not the test, removes it -- the split and the conditional test fix different problems.</w:t>
+      </w:r>
+    </w:p>
+    <w:p>
+      <w:pPr>
+        <w:pStyle w:val="ListBullet"/>
+      </w:pPr>
+      <w:r>
+        <w:t>Method comparison on real data: our significant calls replicate in TCGA most often (37% vs 34% SELECT, 29% Fisher). Ranked by effect size, SELECT's 50 strongest pairs replicate slightly more often than ours (96% vs 86%; 48 vs 43 pairs, not a significant difference); all methods agree on the strongest pairs.</w:t>
+      </w:r>
     </w:p>
     <w:p>
       <w:pPr>
         <w:spacing w:before="120"/>
       </w:pPr>
-      <w:r>
-        <w:rPr>
-          <w:i/>
-          <w:color w:val="555B66"/>
-          <w:sz w:val="17"/>
-        </w:rPr>
-        <w:t>Source files for this part: notebooks/02b_phase2_validation.ipynb, notebooks/02c_phase2_extensions.ipynb (Sections I-M), results/logs/15-17 logs, scripts/analyses/14-18_*.py and 21_*.py, docs/literature_review.md §7 and §10.</w:t>
-      </w:r>
-      <w:r>
-        <w:rPr>
-          <w:color w:val="555B66"/>
-          <w:sz w:val="17"/>
-        </w:rPr>
+      <w:r/>
+      <w:r>
+        <w:t>Source files for this part: notebooks/02b_phase2_validation.ipynb, notebooks/02c_phase2_extensions.ipynb (Sections E-F), scripts/analyses/14, 15, 19, 21 and 22, data/curated/, docs/literature_review.md §7 and §10.</w:t>
       </w:r>
     </w:p>
     <w:p>
@@ -26261,7 +25750,7 @@
               <w:rPr>
                 <w:sz w:val="18"/>
               </w:rPr>
-              <w:t>TCGA validation (with counts), agreement with known biology, method benchmark; load check and other side analyses in 02c</w:t>
+              <w:t>Precision and recall (simulation), textbook pairs, TCGA; load check and real-data comparison in 02c</w:t>
             </w:r>
           </w:p>
         </w:tc>
@@ -26387,7 +25876,7 @@
               <w:rPr>
                 <w:sz w:val="18"/>
               </w:rPr>
-              <w:t>Method benchmark (15), gene sets (16), dN/dS (17), shrinkage (18)</w:t>
+              <w:t>Method benchmark (15), planted-link simulation (22)</w:t>
             </w:r>
           </w:p>
         </w:tc>
@@ -26444,7 +25933,7 @@
               <w:rPr>
                 <w:sz w:val="18"/>
               </w:rPr>
-              <w:t>SELECT re-implemented from its methods (26 Oct); results in Part 10</w:t>
+              <w:t>SELECT re-implemented (26 Oct); simulation added 29 Oct; results in Part 10</w:t>
             </w:r>
             <w:r>
               <w:rPr>
@@ -28148,7 +27637,7 @@
               <w:rPr>
                 <w:sz w:val="18"/>
               </w:rPr>
-              <w:t>Phase 2c side analyses: hypermutated tumours, mutations only, alteration types, burden flag, fusion screen, shared gene list, recurrence across cancers, gene sets, dN/dS, shrinkage</w:t>
+              <w:t>Phase 2c side analyses: hypermutated tumours, mutations only, burden flag, fusion screen, mutation-load check, method comparison on real data</w:t>
             </w:r>
           </w:p>
         </w:tc>

</xml_diff>